<commit_message>
Update Jyvaskyla omavalvontasuunnitelma to 28.8.2026 version
Co-Authored-By: Claude Opus 5 <noreply@anthropic.com>
</commit_message>
<xml_diff>
--- a/docs/omavalvontasuunnitelma-jyvaskyla-2026.docx
+++ b/docs/omavalvontasuunnitelma-jyvaskyla-2026.docx
@@ -1,6 +1,6 @@
 
 <file path=word/document.xml><?xml version="1.0" encoding="utf-8"?>
-<w:document xmlns:wpc="http://schemas.microsoft.com/office/word/2010/wordprocessingCanvas" xmlns:cx="http://schemas.microsoft.com/office/drawing/2014/chartex" xmlns:cx1="http://schemas.microsoft.com/office/drawing/2015/9/8/chartex" xmlns:cx2="http://schemas.microsoft.com/office/drawing/2015/10/21/chartex" xmlns:cx3="http://schemas.microsoft.com/office/drawing/2016/5/9/chartex" xmlns:cx4="http://schemas.microsoft.com/office/drawing/2016/5/10/chartex" xmlns:cx5="http://schemas.microsoft.com/office/drawing/2016/5/11/chartex" xmlns:cx6="http://schemas.microsoft.com/office/drawing/2016/5/12/chartex" xmlns:cx7="http://schemas.microsoft.com/office/drawing/2016/5/13/chartex" xmlns:cx8="http://schemas.microsoft.com/office/drawing/2016/5/14/chartex" xmlns:mc="http://schemas.openxmlformats.org/markup-compatibility/2006" xmlns:aink="http://schemas.microsoft.com/office/drawing/2016/ink" xmlns:am3d="http://schemas.microsoft.com/office/drawing/2017/model3d" xmlns:o="urn:schemas-microsoft-com:office:office" xmlns:oel="http://schemas.microsoft.com/office/2019/extlst" xmlns:r="http://schemas.openxmlformats.org/officeDocument/2006/relationships" xmlns:m="http://schemas.openxmlformats.org/officeDocument/2006/math" xmlns:v="urn:schemas-microsoft-com:vml" xmlns:wp14="http://schemas.microsoft.com/office/word/2010/wordprocessingDrawing" xmlns:wp="http://schemas.openxmlformats.org/drawingml/2006/wordprocessingDrawing" xmlns:w10="urn:schemas-microsoft-com:office:word" xmlns:w="http://schemas.openxmlformats.org/wordprocessingml/2006/main" xmlns:w14="http://schemas.microsoft.com/office/word/2010/wordml" xmlns:w15="http://schemas.microsoft.com/office/word/2012/wordml" xmlns:w16cex="http://schemas.microsoft.com/office/word/2018/wordml/cex" xmlns:w16cid="http://schemas.microsoft.com/office/word/2016/wordml/cid" xmlns:w16="http://schemas.microsoft.com/office/word/2018/wordml" xmlns:w16du="http://schemas.microsoft.com/office/word/2023/wordml/word16du" xmlns:w16sdtdh="http://schemas.microsoft.com/office/word/2020/wordml/sdtdatahash" xmlns:w16sdtfl="http://schemas.microsoft.com/office/word/2024/wordml/sdtformatlock" xmlns:w16se="http://schemas.microsoft.com/office/word/2015/wordml/symex" xmlns:wpg="http://schemas.microsoft.com/office/word/2010/wordprocessingGroup" xmlns:wpi="http://schemas.microsoft.com/office/word/2010/wordprocessingInk" xmlns:wne="http://schemas.microsoft.com/office/word/2006/wordml" xmlns:wps="http://schemas.microsoft.com/office/word/2010/wordprocessingShape" mc:Ignorable="w14 w15 w16se w16cid w16 w16cex w16sdtdh w16sdtfl w16du wp14">
+<w:document xmlns:wpc="http://schemas.microsoft.com/office/word/2010/wordprocessingCanvas" xmlns:cx="http://schemas.microsoft.com/office/drawing/2014/chartex" xmlns:cx1="http://schemas.microsoft.com/office/drawing/2015/9/8/chartex" xmlns:cx2="http://schemas.microsoft.com/office/drawing/2015/10/21/chartex" xmlns:cx3="http://schemas.microsoft.com/office/drawing/2016/5/9/chartex" xmlns:cx4="http://schemas.microsoft.com/office/drawing/2016/5/10/chartex" xmlns:cx5="http://schemas.microsoft.com/office/drawing/2016/5/11/chartex" xmlns:cx6="http://schemas.microsoft.com/office/drawing/2016/5/12/chartex" xmlns:cx7="http://schemas.microsoft.com/office/drawing/2016/5/13/chartex" xmlns:cx8="http://schemas.microsoft.com/office/drawing/2016/5/14/chartex" xmlns:mc="http://schemas.openxmlformats.org/markup-compatibility/2006" xmlns:m="http://schemas.openxmlformats.org/officeDocument/2006/math" xmlns:aink="http://schemas.microsoft.com/office/drawing/2016/ink" xmlns:am3d="http://schemas.microsoft.com/office/drawing/2017/model3d" xmlns:oel="http://schemas.microsoft.com/office/2019/extlst" xmlns:r="http://schemas.openxmlformats.org/officeDocument/2006/relationships" xmlns:wp14="http://schemas.microsoft.com/office/word/2010/wordprocessingDrawing" xmlns:wp="http://schemas.openxmlformats.org/drawingml/2006/wordprocessingDrawing" xmlns:wpg="http://schemas.microsoft.com/office/word/2010/wordprocessingGroup" xmlns:wpi="http://schemas.microsoft.com/office/word/2010/wordprocessingInk" xmlns:wps="http://schemas.microsoft.com/office/word/2010/wordprocessingShape" xmlns:o="urn:schemas-microsoft-com:office:office" xmlns:v="urn:schemas-microsoft-com:vml" xmlns:w10="urn:schemas-microsoft-com:office:word" xmlns:w="http://schemas.openxmlformats.org/wordprocessingml/2006/main" xmlns:w14="http://schemas.microsoft.com/office/word/2010/wordml" xmlns:w15="http://schemas.microsoft.com/office/word/2012/wordml" xmlns:w16cex="http://schemas.microsoft.com/office/word/2018/wordml/cex" xmlns:w16cid="http://schemas.microsoft.com/office/word/2016/wordml/cid" xmlns:w16="http://schemas.microsoft.com/office/word/2018/wordml" xmlns:w16sdtdh="http://schemas.microsoft.com/office/word/2020/wordml/sdtdatahash" xmlns:w16sdtfl="http://schemas.microsoft.com/office/word/2024/wordml/sdtformatlock" xmlns:w16se="http://schemas.microsoft.com/office/word/2015/wordml/symex" xmlns:w16du="http://schemas.microsoft.com/office/word/2023/wordml/word16du" xmlns:wne="http://schemas.microsoft.com/office/word/2006/wordml" mc:Ignorable="w14 w15 w16se w16cid w16 w16cex w16sdtdh w16sdtfl w16du wp14">
   <w:body>
     <w:p>
       <w:pPr>
@@ -61,7 +61,7 @@
           <w:szCs w:val="24"/>
         </w:rPr>
       </w:pPr>
-      <w:bookmarkStart w:id="0" w:name="_Toc233886564"/>
+      <w:bookmarkStart w:id="0" w:name="_Toc238743006"/>
       <w:r>
         <w:rPr>
           <w:rFonts w:cs="Arial"/>
@@ -89,7 +89,7 @@
           <w:szCs w:val="24"/>
         </w:rPr>
       </w:pPr>
-      <w:bookmarkStart w:id="1" w:name="_Toc233886565"/>
+      <w:bookmarkStart w:id="1" w:name="_Toc238743007"/>
       <w:proofErr w:type="gramStart"/>
       <w:r>
         <w:rPr>
@@ -388,7 +388,7 @@
                               <wp:inline distT="0" distB="0" distL="0" distR="0" wp14:anchorId="46D86EDA" wp14:editId="782169DF">
                                 <wp:extent cx="3599815" cy="500380"/>
                                 <wp:effectExtent l="0" t="0" r="635" b="0"/>
-                                <wp:docPr id="2" name="Kuva 2"/>
+                                <wp:docPr id="2105017327" name="Kuva 2"/>
                                 <wp:cNvGraphicFramePr>
                                   <a:graphicFrameLocks xmlns:a="http://schemas.openxmlformats.org/drawingml/2006/main" noChangeAspect="1"/>
                                 </wp:cNvGraphicFramePr>
@@ -402,7 +402,7 @@
                                         </pic:cNvPicPr>
                                       </pic:nvPicPr>
                                       <pic:blipFill>
-                                        <a:blip r:embed="rId13" cstate="print">
+                                        <a:blip r:embed="rId12" cstate="print">
                                           <a:extLst>
                                             <a:ext uri="{28A0092B-C50C-407E-A947-70E740481C1C}">
                                               <a14:useLocalDpi xmlns:a14="http://schemas.microsoft.com/office/drawing/2010/main" val="0"/>
@@ -527,7 +527,7 @@
             <w:rPr>
               <w:noProof/>
             </w:rPr>
-            <w:instrText xml:space="preserve"> PAGEREF _Toc233886564 \h </w:instrText>
+            <w:instrText xml:space="preserve"> PAGEREF _Toc238743006 \h </w:instrText>
           </w:r>
           <w:r>
             <w:rPr>
@@ -592,7 +592,7 @@
             <w:rPr>
               <w:noProof/>
             </w:rPr>
-            <w:instrText xml:space="preserve"> PAGEREF _Toc233886565 \h </w:instrText>
+            <w:instrText xml:space="preserve"> PAGEREF _Toc238743007 \h </w:instrText>
           </w:r>
           <w:r>
             <w:rPr>
@@ -656,7 +656,7 @@
             <w:rPr>
               <w:noProof/>
             </w:rPr>
-            <w:instrText xml:space="preserve"> PAGEREF _Toc233886566 \h </w:instrText>
+            <w:instrText xml:space="preserve"> PAGEREF _Toc238743008 \h </w:instrText>
           </w:r>
           <w:r>
             <w:rPr>
@@ -721,7 +721,7 @@
             <w:rPr>
               <w:noProof/>
             </w:rPr>
-            <w:instrText xml:space="preserve"> PAGEREF _Toc233886567 \h </w:instrText>
+            <w:instrText xml:space="preserve"> PAGEREF _Toc238743009 \h </w:instrText>
           </w:r>
           <w:r>
             <w:rPr>
@@ -786,7 +786,7 @@
             <w:rPr>
               <w:noProof/>
             </w:rPr>
-            <w:instrText xml:space="preserve"> PAGEREF _Toc233886568 \h </w:instrText>
+            <w:instrText xml:space="preserve"> PAGEREF _Toc238743010 \h </w:instrText>
           </w:r>
           <w:r>
             <w:rPr>
@@ -851,7 +851,7 @@
             <w:rPr>
               <w:noProof/>
             </w:rPr>
-            <w:instrText xml:space="preserve"> PAGEREF _Toc233886569 \h </w:instrText>
+            <w:instrText xml:space="preserve"> PAGEREF _Toc238743011 \h </w:instrText>
           </w:r>
           <w:r>
             <w:rPr>
@@ -898,7 +898,7 @@
               <w:rFonts w:cs="Arial"/>
               <w:noProof/>
             </w:rPr>
-            <w:t>1.4 Päiväys</w:t>
+            <w:t>1.4 Päiväys ja allekirjoitus</w:t>
           </w:r>
           <w:r>
             <w:rPr>
@@ -916,7 +916,7 @@
             <w:rPr>
               <w:noProof/>
             </w:rPr>
-            <w:instrText xml:space="preserve"> PAGEREF _Toc233886570 \h </w:instrText>
+            <w:instrText xml:space="preserve"> PAGEREF _Toc238743012 \h </w:instrText>
           </w:r>
           <w:r>
             <w:rPr>
@@ -980,7 +980,7 @@
             <w:rPr>
               <w:noProof/>
             </w:rPr>
-            <w:instrText xml:space="preserve"> PAGEREF _Toc233886571 \h </w:instrText>
+            <w:instrText xml:space="preserve"> PAGEREF _Toc238743013 \h </w:instrText>
           </w:r>
           <w:r>
             <w:rPr>
@@ -997,7 +997,7 @@
             <w:rPr>
               <w:noProof/>
             </w:rPr>
-            <w:t>7</w:t>
+            <w:t>8</w:t>
           </w:r>
           <w:r>
             <w:rPr>
@@ -1044,7 +1044,7 @@
             <w:rPr>
               <w:noProof/>
             </w:rPr>
-            <w:instrText xml:space="preserve"> PAGEREF _Toc233886572 \h </w:instrText>
+            <w:instrText xml:space="preserve"> PAGEREF _Toc238743014 \h </w:instrText>
           </w:r>
           <w:r>
             <w:rPr>
@@ -1108,7 +1108,7 @@
             <w:rPr>
               <w:noProof/>
             </w:rPr>
-            <w:instrText xml:space="preserve"> PAGEREF _Toc233886573 \h </w:instrText>
+            <w:instrText xml:space="preserve"> PAGEREF _Toc238743015 \h </w:instrText>
           </w:r>
           <w:r>
             <w:rPr>
@@ -1173,7 +1173,7 @@
             <w:rPr>
               <w:noProof/>
             </w:rPr>
-            <w:instrText xml:space="preserve"> PAGEREF _Toc233886574 \h </w:instrText>
+            <w:instrText xml:space="preserve"> PAGEREF _Toc238743016 \h </w:instrText>
           </w:r>
           <w:r>
             <w:rPr>
@@ -1237,7 +1237,7 @@
             <w:rPr>
               <w:noProof/>
             </w:rPr>
-            <w:instrText xml:space="preserve"> PAGEREF _Toc233886575 \h </w:instrText>
+            <w:instrText xml:space="preserve"> PAGEREF _Toc238743017 \h </w:instrText>
           </w:r>
           <w:r>
             <w:rPr>
@@ -1301,7 +1301,7 @@
             <w:rPr>
               <w:noProof/>
             </w:rPr>
-            <w:instrText xml:space="preserve"> PAGEREF _Toc233886576 \h </w:instrText>
+            <w:instrText xml:space="preserve"> PAGEREF _Toc238743018 \h </w:instrText>
           </w:r>
           <w:r>
             <w:rPr>
@@ -1365,7 +1365,7 @@
             <w:rPr>
               <w:noProof/>
             </w:rPr>
-            <w:instrText xml:space="preserve"> PAGEREF _Toc233886577 \h </w:instrText>
+            <w:instrText xml:space="preserve"> PAGEREF _Toc238743019 \h </w:instrText>
           </w:r>
           <w:r>
             <w:rPr>
@@ -1429,7 +1429,7 @@
             <w:rPr>
               <w:noProof/>
             </w:rPr>
-            <w:instrText xml:space="preserve"> PAGEREF _Toc233886578 \h </w:instrText>
+            <w:instrText xml:space="preserve"> PAGEREF _Toc238743020 \h </w:instrText>
           </w:r>
           <w:r>
             <w:rPr>
@@ -1493,7 +1493,7 @@
             <w:rPr>
               <w:noProof/>
             </w:rPr>
-            <w:instrText xml:space="preserve"> PAGEREF _Toc233886579 \h </w:instrText>
+            <w:instrText xml:space="preserve"> PAGEREF _Toc238743021 \h </w:instrText>
           </w:r>
           <w:r>
             <w:rPr>
@@ -1557,7 +1557,7 @@
             <w:rPr>
               <w:noProof/>
             </w:rPr>
-            <w:instrText xml:space="preserve"> PAGEREF _Toc233886580 \h </w:instrText>
+            <w:instrText xml:space="preserve"> PAGEREF _Toc238743022 \h </w:instrText>
           </w:r>
           <w:r>
             <w:rPr>
@@ -1621,7 +1621,7 @@
             <w:rPr>
               <w:noProof/>
             </w:rPr>
-            <w:instrText xml:space="preserve"> PAGEREF _Toc233886581 \h </w:instrText>
+            <w:instrText xml:space="preserve"> PAGEREF _Toc238743023 \h </w:instrText>
           </w:r>
           <w:r>
             <w:rPr>
@@ -1685,7 +1685,7 @@
             <w:rPr>
               <w:noProof/>
             </w:rPr>
-            <w:instrText xml:space="preserve"> PAGEREF _Toc233886582 \h </w:instrText>
+            <w:instrText xml:space="preserve"> PAGEREF _Toc238743024 \h </w:instrText>
           </w:r>
           <w:r>
             <w:rPr>
@@ -1749,7 +1749,7 @@
             <w:rPr>
               <w:noProof/>
             </w:rPr>
-            <w:instrText xml:space="preserve"> PAGEREF _Toc233886583 \h </w:instrText>
+            <w:instrText xml:space="preserve"> PAGEREF _Toc238743025 \h </w:instrText>
           </w:r>
           <w:r>
             <w:rPr>
@@ -1813,7 +1813,7 @@
             <w:rPr>
               <w:noProof/>
             </w:rPr>
-            <w:instrText xml:space="preserve"> PAGEREF _Toc233886584 \h </w:instrText>
+            <w:instrText xml:space="preserve"> PAGEREF _Toc238743026 \h </w:instrText>
           </w:r>
           <w:r>
             <w:rPr>
@@ -1877,7 +1877,7 @@
             <w:rPr>
               <w:noProof/>
             </w:rPr>
-            <w:instrText xml:space="preserve"> PAGEREF _Toc233886585 \h </w:instrText>
+            <w:instrText xml:space="preserve"> PAGEREF _Toc238743027 \h </w:instrText>
           </w:r>
           <w:r>
             <w:rPr>
@@ -1942,7 +1942,7 @@
             <w:rPr>
               <w:noProof/>
             </w:rPr>
-            <w:instrText xml:space="preserve"> PAGEREF _Toc233886586 \h </w:instrText>
+            <w:instrText xml:space="preserve"> PAGEREF _Toc238743028 \h </w:instrText>
           </w:r>
           <w:r>
             <w:rPr>
@@ -2016,7 +2016,7 @@
       <w:bookmarkStart w:id="2" w:name="_Toc175741893"/>
       <w:bookmarkStart w:id="3" w:name="_Toc175741948"/>
       <w:bookmarkStart w:id="4" w:name="_Toc175740430"/>
-      <w:bookmarkStart w:id="5" w:name="_Toc233886566"/>
+      <w:bookmarkStart w:id="5" w:name="_Toc238743008"/>
       <w:r>
         <w:rPr>
           <w:sz w:val="28"/>
@@ -2055,7 +2055,7 @@
       <w:bookmarkStart w:id="7" w:name="_Toc175741949"/>
       <w:bookmarkStart w:id="8" w:name="_Toc175740431"/>
       <w:bookmarkStart w:id="9" w:name="_Toc175741894"/>
-      <w:bookmarkStart w:id="10" w:name="_Toc233886567"/>
+      <w:bookmarkStart w:id="10" w:name="_Toc238743009"/>
       <w:r>
         <w:rPr>
           <w:rFonts w:eastAsia="Arial" w:cs="Arial"/>
@@ -2137,7 +2137,23 @@
           <w:sz w:val="24"/>
           <w:szCs w:val="24"/>
         </w:rPr>
-        <w:t xml:space="preserve"> ja SOTERI-rekisteröintinumero (OID-tunnus 1.2.246.10.1773996.10.12)</w:t>
+        <w:t xml:space="preserve"> ja SOTERI-rekisteröintinumero (OID-tunnus </w:t>
+      </w:r>
+      <w:r>
+        <w:rPr>
+          <w:rFonts w:eastAsia="Arial" w:cs="Arial"/>
+          <w:sz w:val="24"/>
+          <w:szCs w:val="24"/>
+        </w:rPr>
+        <w:t>1.2.246.10.1773996.10.21</w:t>
+      </w:r>
+      <w:r>
+        <w:rPr>
+          <w:rFonts w:eastAsia="Arial" w:cs="Arial"/>
+          <w:sz w:val="24"/>
+          <w:szCs w:val="24"/>
+        </w:rPr>
+        <w:t>)</w:t>
       </w:r>
     </w:p>
     <w:p>
@@ -2207,7 +2223,7 @@
       <w:bookmarkStart w:id="12" w:name="_Toc175741950"/>
       <w:bookmarkStart w:id="13" w:name="_Toc175740432"/>
       <w:bookmarkStart w:id="14" w:name="_Toc175741895"/>
-      <w:bookmarkStart w:id="15" w:name="_Toc233886568"/>
+      <w:bookmarkStart w:id="15" w:name="_Toc238743010"/>
       <w:r>
         <w:rPr>
           <w:rFonts w:eastAsia="Arial" w:cs="Arial"/>
@@ -2346,26 +2362,39 @@
           <w:sz w:val="24"/>
           <w:szCs w:val="24"/>
         </w:rPr>
-        <w:t xml:space="preserve">Jouko Vuorenniemi </w:t>
-      </w:r>
-      <w:hyperlink r:id="rId14" w:history="1">
-        <w:r>
-          <w:rPr>
-            <w:rStyle w:val="Hyperlink"/>
-            <w:rFonts w:eastAsia="Arial" w:cs="Arial"/>
-            <w:sz w:val="24"/>
-            <w:szCs w:val="24"/>
-          </w:rPr>
-          <w:t>jouko.vuorenniemi@kan.fi</w:t>
-        </w:r>
-      </w:hyperlink>
-      <w:r>
-        <w:rPr>
-          <w:rFonts w:eastAsia="Arial" w:cs="Arial"/>
-          <w:sz w:val="24"/>
-          <w:szCs w:val="24"/>
-        </w:rPr>
-        <w:t xml:space="preserve"> p.044 5110361</w:t>
+        <w:t xml:space="preserve">Mervi Ahvenlampi </w:t>
+      </w:r>
+      <w:r>
+        <w:rPr>
+          <w:rFonts w:eastAsia="Arial" w:cs="Arial"/>
+          <w:sz w:val="24"/>
+          <w:szCs w:val="24"/>
+        </w:rPr>
+        <w:t>mervi.ahvenlampi@gmail.com</w:t>
+      </w:r>
+      <w:r>
+        <w:rPr>
+          <w:rFonts w:eastAsia="Arial" w:cs="Arial"/>
+          <w:sz w:val="24"/>
+          <w:szCs w:val="24"/>
+        </w:rPr>
+        <w:t xml:space="preserve"> p.</w:t>
+      </w:r>
+      <w:r>
+        <w:rPr>
+          <w:rFonts w:eastAsia="Arial" w:cs="Arial"/>
+          <w:sz w:val="24"/>
+          <w:szCs w:val="24"/>
+        </w:rPr>
+        <w:t xml:space="preserve"> </w:t>
+      </w:r>
+      <w:r>
+        <w:rPr>
+          <w:rFonts w:eastAsia="Arial" w:cs="Arial"/>
+          <w:sz w:val="24"/>
+          <w:szCs w:val="24"/>
+        </w:rPr>
+        <w:t>050 4099 179</w:t>
       </w:r>
     </w:p>
     <w:p>
@@ -2395,7 +2424,7 @@
       <w:bookmarkStart w:id="17" w:name="_Toc2062388625"/>
       <w:bookmarkStart w:id="18" w:name="_Toc175741896"/>
       <w:bookmarkStart w:id="19" w:name="_Toc175740433"/>
-      <w:bookmarkStart w:id="20" w:name="_Toc233886569"/>
+      <w:bookmarkStart w:id="20" w:name="_Toc238743011"/>
       <w:r>
         <w:rPr>
           <w:rFonts w:eastAsia="Arial" w:cs="Arial"/>
@@ -2724,96 +2753,37 @@
           <w:sz w:val="24"/>
           <w:szCs w:val="24"/>
         </w:rPr>
-        <w:t>-kodin tuetussa ja yhteisöllisessä asumisessa arkeen sisältyy toimintakykyä vahvistavia tehtäviä, kuten siivousta, ruoanlaittoa, vaatehuoltoa ja hygieniasta huolehtimista yhdessä asiakkaan kanssa. Asukkaiden osallisuutta ja sosiaalista vuorovaikutusta tuetaan yhteisillä aktiviteeteilla ja ryhmätoiminnoilla. Itsenäiseen asumiseen siirtymistä vahvistetaan sosiaaliohjauksella ja muilla tarvittavilla sosiaalipalveluilla. Integroitumista takaisin yhteiskuntaan voidaan tukea myös tarvittaessa ns. liikkuvalla tuel</w:t>
-      </w:r>
-      <w:r>
-        <w:rPr>
-          <w:rFonts w:eastAsia="Arial" w:cs="Arial"/>
-          <w:sz w:val="24"/>
-          <w:szCs w:val="24"/>
-        </w:rPr>
-        <w:t>la, avokuntoutuksella ja intervallijaksoilla.</w:t>
-      </w:r>
-    </w:p>
-    <w:p>
-      <w:pPr>
-        <w:spacing w:after="0" w:line="360" w:lineRule="auto"/>
-        <w:rPr>
-          <w:rFonts w:eastAsia="Arial" w:cs="Arial"/>
-          <w:sz w:val="24"/>
-          <w:szCs w:val="24"/>
-        </w:rPr>
-      </w:pPr>
-    </w:p>
-    <w:p>
-      <w:pPr>
-        <w:spacing w:after="0" w:line="360" w:lineRule="auto"/>
-        <w:rPr>
-          <w:rFonts w:eastAsia="Arial" w:cs="Arial"/>
-          <w:sz w:val="24"/>
-          <w:szCs w:val="24"/>
-        </w:rPr>
-      </w:pPr>
-      <w:r>
-        <w:rPr>
-          <w:rFonts w:eastAsia="Arial" w:cs="Arial"/>
-          <w:sz w:val="24"/>
-          <w:szCs w:val="24"/>
-        </w:rPr>
-        <w:t>Toiminnassa noudatetaan Päihdehuoltolain (41/1986 § 8) ja Mielenterveyslain (1116/1990 § 4) periaatteita, jotka korostavat vapaaehtoisuutta, asiakkaan itsenäisen suoriutumisen tukemista, luottamuksellisuutta ja asiakkaan edun ensisijaisuutta.</w:t>
-      </w:r>
-    </w:p>
-    <w:p>
-      <w:pPr>
-        <w:spacing w:after="0" w:line="360" w:lineRule="auto"/>
-        <w:rPr>
-          <w:rFonts w:eastAsia="Arial" w:cs="Arial"/>
-          <w:sz w:val="24"/>
-          <w:szCs w:val="24"/>
-        </w:rPr>
-      </w:pPr>
-    </w:p>
-    <w:p>
-      <w:pPr>
-        <w:spacing w:after="0" w:line="360" w:lineRule="auto"/>
-        <w:rPr>
-          <w:rFonts w:eastAsia="Arial" w:cs="Arial"/>
-          <w:sz w:val="24"/>
-          <w:szCs w:val="24"/>
-        </w:rPr>
-      </w:pPr>
-      <w:r>
-        <w:rPr>
-          <w:rFonts w:eastAsia="Arial" w:cs="Arial"/>
-          <w:sz w:val="24"/>
-          <w:szCs w:val="24"/>
-        </w:rPr>
-        <w:t>Palvelumme toteuttaa sosiaalihuollon lainsäädännön keskeisiä periaatteita: hyvinvoinnin ja sosiaalisen turvallisuuden edistämistä, eriarvoisuuden vähentämistä, osallisuuden vahvistamista sekä yhdenvertaisten, tarpeenmukaisten ja laadukkaiden sosiaalipalvelujen turvaamista. Toimintamme perustuu asiakaskeskeisyyteen ja asiakkaan oikeuteen saada hyvää palvelua ja kohtelua sosiaalihuollossa.</w:t>
-      </w:r>
-    </w:p>
-    <w:p>
-      <w:pPr>
-        <w:spacing w:after="0" w:line="360" w:lineRule="auto"/>
-        <w:rPr>
-          <w:rFonts w:eastAsia="Arial" w:cs="Arial"/>
-          <w:sz w:val="24"/>
-          <w:szCs w:val="24"/>
-        </w:rPr>
-      </w:pPr>
-    </w:p>
-    <w:p>
-      <w:pPr>
-        <w:spacing w:after="0" w:line="360" w:lineRule="auto"/>
-        <w:rPr>
-          <w:rFonts w:eastAsia="Arial" w:cs="Arial"/>
-          <w:sz w:val="24"/>
-          <w:szCs w:val="24"/>
-        </w:rPr>
-      </w:pPr>
-    </w:p>
-    <w:p>
-      <w:pPr>
-        <w:spacing w:after="0" w:line="360" w:lineRule="auto"/>
+        <w:t>-kodin tuetussa ja yhteisöllisessä asumisessa arkeen sisältyy toimintakykyä vahvistavia tehtäviä, kuten siivousta, ruoanlaittoa, vaatehuoltoa ja hygieniasta huolehtimista yhdessä asiakkaan kanssa. Asukkaiden osallisuutta ja sosiaalista vuorovaikutusta tuetaan yhteisillä aktiviteeteilla ja ryhmätoiminnoilla. Itsenäiseen asumiseen siirtymistä vahvistetaan sosiaaliohjauksella ja muilla tarvittavilla sosiaalipalveluilla. Integroitumista takaisin yhteiskuntaan voidaan tukea myös tarvittaessa ns. liikkuvalla tuella, avokuntoutuksella ja intervallijaksoilla.</w:t>
+      </w:r>
+    </w:p>
+    <w:p>
+      <w:pPr>
+        <w:spacing w:after="0" w:line="360" w:lineRule="auto"/>
+        <w:rPr>
+          <w:rFonts w:eastAsia="Arial" w:cs="Arial"/>
+          <w:sz w:val="24"/>
+          <w:szCs w:val="24"/>
+        </w:rPr>
+      </w:pPr>
+    </w:p>
+    <w:p>
+      <w:pPr>
+        <w:spacing w:after="0" w:line="360" w:lineRule="auto"/>
+        <w:rPr>
+          <w:rFonts w:eastAsia="Arial" w:cs="Arial"/>
+          <w:sz w:val="24"/>
+          <w:szCs w:val="24"/>
+        </w:rPr>
+      </w:pPr>
+      <w:r>
+        <w:rPr>
+          <w:rFonts w:eastAsia="Arial" w:cs="Arial"/>
+          <w:sz w:val="24"/>
+          <w:szCs w:val="24"/>
+        </w:rPr>
+        <w:t xml:space="preserve">Toiminnassa noudatetaan </w:t>
+      </w:r>
+      <w:r>
         <w:rPr>
           <w:rFonts w:eastAsia="Arial" w:cs="Arial"/>
           <w:b/>
@@ -2821,7 +2791,34 @@
           <w:sz w:val="24"/>
           <w:szCs w:val="24"/>
         </w:rPr>
-      </w:pPr>
+        <w:t>Sosiaalihuoltolain (1301/2014) 30 §:n keskeisiä periaatteita sekä 33 ja 34 §:n säännöksiä</w:t>
+      </w:r>
+      <w:r>
+        <w:rPr>
+          <w:rFonts w:eastAsia="Arial" w:cs="Arial"/>
+          <w:sz w:val="24"/>
+          <w:szCs w:val="24"/>
+        </w:rPr>
+        <w:t>. Nämä lainkohdat korostavat asiakkaan itsemääräämisoikeuden kunnioittamista, yhteisymmärrystä, vapaaehtoisuutta, itsenäisen suoriutumisen tukemista, palvelujen saavutettavuutta sekä asiakkaan edun ensisijaisuutta.</w:t>
+      </w:r>
+    </w:p>
+    <w:p>
+      <w:pPr>
+        <w:spacing w:after="0" w:line="360" w:lineRule="auto"/>
+        <w:rPr>
+          <w:rFonts w:eastAsia="Arial" w:cs="Arial"/>
+          <w:sz w:val="24"/>
+          <w:szCs w:val="24"/>
+        </w:rPr>
+      </w:pPr>
+      <w:r>
+        <w:rPr>
+          <w:rFonts w:eastAsia="Arial" w:cs="Arial"/>
+          <w:sz w:val="24"/>
+          <w:szCs w:val="24"/>
+        </w:rPr>
+        <w:t xml:space="preserve">Päihde- ja riippuvuusasiakkaiden asumispalvelut toteutetaan sosiaalihuoltolain </w:t>
+      </w:r>
       <w:r>
         <w:rPr>
           <w:rFonts w:eastAsia="Arial" w:cs="Arial"/>
@@ -2830,6 +2827,102 @@
           <w:sz w:val="24"/>
           <w:szCs w:val="24"/>
         </w:rPr>
+        <w:t>24 a §:n</w:t>
+      </w:r>
+      <w:r>
+        <w:rPr>
+          <w:rFonts w:eastAsia="Arial" w:cs="Arial"/>
+          <w:sz w:val="24"/>
+          <w:szCs w:val="24"/>
+        </w:rPr>
+        <w:t xml:space="preserve"> (sosiaalihuollon päihde- ja riippuvuustyön erityiset palvelut) ja mielenterveysasiakkaiden asumispalvelut sosiaalihuoltolain </w:t>
+      </w:r>
+      <w:r>
+        <w:rPr>
+          <w:rFonts w:eastAsia="Arial" w:cs="Arial"/>
+          <w:b/>
+          <w:bCs/>
+          <w:sz w:val="24"/>
+          <w:szCs w:val="24"/>
+        </w:rPr>
+        <w:t>25 a §:n</w:t>
+      </w:r>
+      <w:r>
+        <w:rPr>
+          <w:rFonts w:eastAsia="Arial" w:cs="Arial"/>
+          <w:sz w:val="24"/>
+          <w:szCs w:val="24"/>
+        </w:rPr>
+        <w:t xml:space="preserve"> (sosiaalihuollon mielenterveystyön palvelut) mukaisesti.</w:t>
+      </w:r>
+    </w:p>
+    <w:p>
+      <w:pPr>
+        <w:spacing w:after="0" w:line="360" w:lineRule="auto"/>
+        <w:rPr>
+          <w:rFonts w:eastAsia="Arial" w:cs="Arial"/>
+          <w:sz w:val="24"/>
+          <w:szCs w:val="24"/>
+        </w:rPr>
+      </w:pPr>
+    </w:p>
+    <w:p>
+      <w:pPr>
+        <w:spacing w:after="0" w:line="360" w:lineRule="auto"/>
+        <w:rPr>
+          <w:rFonts w:eastAsia="Arial" w:cs="Arial"/>
+          <w:sz w:val="24"/>
+          <w:szCs w:val="24"/>
+        </w:rPr>
+      </w:pPr>
+      <w:r>
+        <w:rPr>
+          <w:rFonts w:eastAsia="Arial" w:cs="Arial"/>
+          <w:sz w:val="24"/>
+          <w:szCs w:val="24"/>
+        </w:rPr>
+        <w:t>Palvelumme toteuttaa sosiaalihuollon lainsäädännön keskeisiä periaatteita: hyvinvoinnin ja sosiaalisen turvallisuuden edistämistä, eriarvoisuuden vähentämistä, osallisuuden vahvistamista sekä yhdenvertaisten, tarpeenmukaisten ja laadukkaiden sosiaalipalvelujen turvaamista. Toimintamme perustuu asiakaskeskeisyyteen ja asiakkaan oikeuteen saada hyvää palvelua ja kohtelua sosiaalihuollossa.</w:t>
+      </w:r>
+    </w:p>
+    <w:p>
+      <w:pPr>
+        <w:spacing w:after="0" w:line="360" w:lineRule="auto"/>
+        <w:rPr>
+          <w:rFonts w:eastAsia="Arial" w:cs="Arial"/>
+          <w:sz w:val="24"/>
+          <w:szCs w:val="24"/>
+        </w:rPr>
+      </w:pPr>
+    </w:p>
+    <w:p>
+      <w:pPr>
+        <w:spacing w:after="0" w:line="360" w:lineRule="auto"/>
+        <w:rPr>
+          <w:rFonts w:eastAsia="Arial" w:cs="Arial"/>
+          <w:sz w:val="24"/>
+          <w:szCs w:val="24"/>
+        </w:rPr>
+      </w:pPr>
+    </w:p>
+    <w:p>
+      <w:pPr>
+        <w:spacing w:after="0" w:line="360" w:lineRule="auto"/>
+        <w:rPr>
+          <w:rFonts w:eastAsia="Arial" w:cs="Arial"/>
+          <w:b/>
+          <w:bCs/>
+          <w:sz w:val="24"/>
+          <w:szCs w:val="24"/>
+        </w:rPr>
+      </w:pPr>
+      <w:r>
+        <w:rPr>
+          <w:rFonts w:eastAsia="Arial" w:cs="Arial"/>
+          <w:b/>
+          <w:bCs/>
+          <w:sz w:val="24"/>
+          <w:szCs w:val="24"/>
+        </w:rPr>
         <w:t>Toimintaa ohjaavat arvot</w:t>
       </w:r>
     </w:p>
@@ -2848,6 +2941,7 @@
           <w:sz w:val="24"/>
           <w:szCs w:val="24"/>
         </w:rPr>
+        <w:lastRenderedPageBreak/>
         <w:t xml:space="preserve">Jyväskylän </w:t>
       </w:r>
       <w:proofErr w:type="spellStart"/>
@@ -2912,7 +3006,6 @@
           <w:sz w:val="24"/>
           <w:szCs w:val="24"/>
         </w:rPr>
-        <w:lastRenderedPageBreak/>
         <w:t>Jokainen ihminen on arvokas, ainutlaatuinen ja auttamisen arvoinen – ja jokaisella on toivoa.</w:t>
       </w:r>
     </w:p>
@@ -3201,16 +3294,9 @@
         </w:rPr>
         <w:t>Periaatteet: kärsivällisyys, ratkaisukeskeisyys, kasvu, laupeus.</w:t>
       </w:r>
-    </w:p>
-    <w:p>
-      <w:pPr>
-        <w:spacing w:after="0" w:line="360" w:lineRule="auto"/>
-        <w:rPr>
-          <w:rFonts w:eastAsia="Arial" w:cs="Arial"/>
-          <w:sz w:val="24"/>
-          <w:szCs w:val="24"/>
-        </w:rPr>
-      </w:pPr>
+      <w:bookmarkStart w:id="21" w:name="_Toc175741897"/>
+      <w:bookmarkStart w:id="22" w:name="_Toc175741952"/>
+      <w:bookmarkStart w:id="23" w:name="_Toc175740434"/>
     </w:p>
     <w:p>
       <w:pPr>
@@ -3224,9 +3310,6 @@
           <w14:ligatures w14:val="standardContextual"/>
         </w:rPr>
       </w:pPr>
-      <w:bookmarkStart w:id="21" w:name="_Toc175741897"/>
-      <w:bookmarkStart w:id="22" w:name="_Toc175741952"/>
-      <w:bookmarkStart w:id="23" w:name="_Toc175740434"/>
     </w:p>
     <w:p>
       <w:pPr>
@@ -3240,9 +3323,7 @@
           <w14:ligatures w14:val="standardContextual"/>
         </w:rPr>
       </w:pPr>
-    </w:p>
-    <w:p>
-      <w:pPr>
+      <w:r>
         <w:rPr>
           <w:rFonts w:eastAsia="Aptos"/>
           <w:b/>
@@ -3252,18 +3333,6 @@
           <w:szCs w:val="24"/>
           <w14:ligatures w14:val="standardContextual"/>
         </w:rPr>
-      </w:pPr>
-      <w:r>
-        <w:rPr>
-          <w:rFonts w:eastAsia="Aptos"/>
-          <w:b/>
-          <w:bCs/>
-          <w:kern w:val="2"/>
-          <w:sz w:val="24"/>
-          <w:szCs w:val="24"/>
-          <w14:ligatures w14:val="standardContextual"/>
-        </w:rPr>
-        <w:lastRenderedPageBreak/>
         <w:t>T</w:t>
       </w:r>
       <w:r>
@@ -3972,6 +4041,7 @@
           <w:szCs w:val="24"/>
           <w14:ligatures w14:val="standardContextual"/>
         </w:rPr>
+        <w:lastRenderedPageBreak/>
         <w:t>Luontoavusteinen toiminta tarjoaa elämyksiä, kokemuksia ja käsillä tekemistä. Aistien virittämistä tuetaan esimerkiksi hyödyntämällä itse kasvatettuja kasveja ruoanlaitossa.</w:t>
       </w:r>
     </w:p>
@@ -4031,7 +4101,6 @@
           <w:szCs w:val="24"/>
           <w14:ligatures w14:val="standardContextual"/>
         </w:rPr>
-        <w:lastRenderedPageBreak/>
         <w:t>Kan</w:t>
       </w:r>
       <w:proofErr w:type="spellEnd"/>
@@ -5078,7 +5147,7 @@
           <w:szCs w:val="24"/>
         </w:rPr>
       </w:pPr>
-      <w:bookmarkStart w:id="24" w:name="_Toc233886570"/>
+      <w:bookmarkStart w:id="24" w:name="_Toc238743012"/>
       <w:r>
         <w:rPr>
           <w:rFonts w:cs="Arial"/>
@@ -5088,26 +5157,60 @@
         </w:rPr>
         <w:t>1.4 Päiväys</w:t>
       </w:r>
+      <w:r>
+        <w:rPr>
+          <w:rFonts w:cs="Arial"/>
+          <w:color w:val="auto"/>
+          <w:sz w:val="24"/>
+          <w:szCs w:val="24"/>
+        </w:rPr>
+        <w:t xml:space="preserve"> ja allekirjoitus</w:t>
+      </w:r>
       <w:bookmarkEnd w:id="24"/>
     </w:p>
     <w:p>
-      <w:pPr>
-        <w:pStyle w:val="ListParagraph"/>
-        <w:spacing w:after="0" w:line="360" w:lineRule="auto"/>
-        <w:ind w:left="1440"/>
-        <w:rPr>
-          <w:rFonts w:eastAsia="Arial" w:cs="Arial"/>
-          <w:sz w:val="24"/>
-          <w:szCs w:val="24"/>
-        </w:rPr>
-      </w:pPr>
-      <w:r>
-        <w:rPr>
-          <w:rFonts w:eastAsia="Arial" w:cs="Arial"/>
-          <w:sz w:val="24"/>
-          <w:szCs w:val="24"/>
-        </w:rPr>
-        <w:t>18.5.2026 uusi päivitetty versio 3</w:t>
+      <w:r>
+        <w:t>Päiväys 2</w:t>
+      </w:r>
+      <w:r>
+        <w:t>8</w:t>
+      </w:r>
+      <w:r>
+        <w:t>.8.2026</w:t>
+      </w:r>
+      <w:r>
+        <w:t>, Versio 4</w:t>
+      </w:r>
+    </w:p>
+    <w:p>
+      <w:pPr>
+        <w:rPr>
+          <w:i/>
+          <w:iCs/>
+        </w:rPr>
+      </w:pPr>
+      <w:r>
+        <w:rPr>
+          <w:i/>
+          <w:iCs/>
+        </w:rPr>
+        <w:t xml:space="preserve">Valtteri Tuokkola Toiminnanjohtaja, </w:t>
+      </w:r>
+      <w:proofErr w:type="spellStart"/>
+      <w:r>
+        <w:rPr>
+          <w:i/>
+          <w:iCs/>
+        </w:rPr>
+        <w:t>Kan</w:t>
+      </w:r>
+      <w:proofErr w:type="spellEnd"/>
+      <w:r>
+        <w:rPr>
+          <w:i/>
+          <w:iCs/>
+        </w:rPr>
+        <w:t xml:space="preserve"> ry</w:t>
       </w:r>
     </w:p>
     <w:p>
@@ -5130,12 +5233,13 @@
           <w:szCs w:val="28"/>
         </w:rPr>
       </w:pPr>
-      <w:bookmarkStart w:id="25" w:name="_Toc233886571"/>
+      <w:bookmarkStart w:id="25" w:name="_Toc238743013"/>
       <w:r>
         <w:rPr>
           <w:sz w:val="28"/>
           <w:szCs w:val="28"/>
         </w:rPr>
+        <w:lastRenderedPageBreak/>
         <w:t>2. Omavalvontasuunnitelman laatiminen, julkaiseminen ja vastuunjako</w:t>
       </w:r>
       <w:bookmarkEnd w:id="21"/>
@@ -5176,7 +5280,6 @@
           <w:sz w:val="24"/>
           <w:szCs w:val="24"/>
         </w:rPr>
-        <w:lastRenderedPageBreak/>
         <w:t>Sosiaalihuollon omavalvonta kattaa asiakasturvallisuuteen liittyvät velvoitteet sosiaalihuollon lainsäädännön mukaisesti. Palo- ja pelastusturvallisuudesta sekä asumisterveyden turvallisuudesta vastaavat omat viranomaisensa, mutta asiakasturvallisuuden varmistaminen edellyttää tiivistä yhteistyötä kaikkien turvallisuudesta vastaavien tahojen kanssa.</w:t>
       </w:r>
     </w:p>
@@ -5486,6 +5589,7 @@
           <w:sz w:val="24"/>
           <w:szCs w:val="24"/>
         </w:rPr>
+        <w:lastRenderedPageBreak/>
         <w:t>Omavalvontasuunnitelman laadinnan ja päivityksen yhteydessä tarkistetaan myös muiden toimintaa ohjaavien suunnitelmien ajantasaisuus, kuten:</w:t>
       </w:r>
     </w:p>
@@ -5537,7 +5641,6 @@
           <w:szCs w:val="24"/>
           <w:lang w:val="en-US"/>
         </w:rPr>
-        <w:lastRenderedPageBreak/>
         <w:t>valmius</w:t>
       </w:r>
       <w:proofErr w:type="spellEnd"/>
@@ -6122,6 +6225,7 @@
           <w:sz w:val="24"/>
           <w:szCs w:val="24"/>
         </w:rPr>
+        <w:lastRenderedPageBreak/>
         <w:t>Aiemmat versiot</w:t>
       </w:r>
     </w:p>
@@ -6140,7 +6244,23 @@
           <w:sz w:val="24"/>
           <w:szCs w:val="24"/>
         </w:rPr>
-        <w:t xml:space="preserve">Omavalvontasuunnitelman aiemmat versiot säilytetään Päijät-Hämeen </w:t>
+        <w:t xml:space="preserve">Omavalvontasuunnitelman aiemmat versiot säilytetään </w:t>
+      </w:r>
+      <w:r>
+        <w:rPr>
+          <w:rFonts w:eastAsia="Arial" w:cs="Arial"/>
+          <w:sz w:val="24"/>
+          <w:szCs w:val="24"/>
+        </w:rPr>
+        <w:t>Jyväskylän</w:t>
+      </w:r>
+      <w:r>
+        <w:rPr>
+          <w:rFonts w:eastAsia="Arial" w:cs="Arial"/>
+          <w:sz w:val="24"/>
+          <w:szCs w:val="24"/>
+        </w:rPr>
+        <w:t xml:space="preserve"> </w:t>
       </w:r>
       <w:proofErr w:type="spellStart"/>
       <w:r>
@@ -6172,21 +6292,13 @@
       <w:bookmarkStart w:id="26" w:name="_Toc175741953"/>
       <w:bookmarkStart w:id="27" w:name="_Toc175740435"/>
       <w:bookmarkStart w:id="28" w:name="_Toc175741898"/>
-      <w:bookmarkStart w:id="29" w:name="_Toc233886572"/>
+      <w:bookmarkStart w:id="29" w:name="_Toc238743014"/>
       <w:r>
         <w:rPr>
           <w:sz w:val="28"/>
           <w:szCs w:val="28"/>
         </w:rPr>
-        <w:lastRenderedPageBreak/>
-        <w:t>3</w:t>
-      </w:r>
-      <w:r>
-        <w:rPr>
-          <w:sz w:val="28"/>
-          <w:szCs w:val="28"/>
-        </w:rPr>
-        <w:t xml:space="preserve">. </w:t>
+        <w:t xml:space="preserve">3. </w:t>
       </w:r>
       <w:bookmarkEnd w:id="26"/>
       <w:bookmarkEnd w:id="27"/>
@@ -6214,7 +6326,7 @@
       <w:pPr>
         <w:pStyle w:val="Heading2"/>
       </w:pPr>
-      <w:bookmarkStart w:id="30" w:name="_Toc233886573"/>
+      <w:bookmarkStart w:id="30" w:name="_Toc238743015"/>
       <w:r>
         <w:t>3.1 Palvelujen saatavuuden varmistaminen</w:t>
       </w:r>
@@ -6866,8 +6978,8 @@
       <w:bookmarkStart w:id="31" w:name="_Toc175740437"/>
       <w:bookmarkStart w:id="32" w:name="_Toc175741955"/>
       <w:bookmarkStart w:id="33" w:name="_Toc175741900"/>
-      <w:bookmarkStart w:id="34" w:name="_Toc978757974"/>
-      <w:bookmarkStart w:id="35" w:name="_Toc233886574"/>
+      <w:bookmarkStart w:id="34" w:name="_Toc238743016"/>
+      <w:bookmarkStart w:id="35" w:name="_Toc978757974"/>
       <w:r>
         <w:rPr>
           <w:rFonts w:eastAsia="Arial" w:cs="Arial"/>
@@ -6880,7 +6992,7 @@
       <w:bookmarkEnd w:id="31"/>
       <w:bookmarkEnd w:id="32"/>
       <w:bookmarkEnd w:id="33"/>
-      <w:bookmarkEnd w:id="35"/>
+      <w:bookmarkEnd w:id="34"/>
     </w:p>
     <w:p>
       <w:pPr>
@@ -6910,7 +7022,7 @@
       </w:r>
       <w:bookmarkEnd w:id="36"/>
     </w:p>
-    <w:bookmarkEnd w:id="34"/>
+    <w:bookmarkEnd w:id="35"/>
     <w:p>
       <w:pPr>
         <w:spacing w:after="0" w:line="360" w:lineRule="auto"/>
@@ -7073,7 +7185,7 @@
           <w:sz w:val="24"/>
           <w:szCs w:val="24"/>
         </w:rPr>
-        <w:t>Jouko Vuorenniemi</w:t>
+        <w:t>Mervi Ahvenlampi</w:t>
       </w:r>
       <w:r>
         <w:rPr>
@@ -7712,7 +7824,7 @@
       <w:pPr>
         <w:pStyle w:val="Heading2"/>
       </w:pPr>
-      <w:bookmarkStart w:id="41" w:name="_Toc233886575"/>
+      <w:bookmarkStart w:id="41" w:name="_Toc238743017"/>
       <w:r>
         <w:t xml:space="preserve">3.3 </w:t>
       </w:r>
@@ -9319,15 +9431,7 @@
           <w:sz w:val="24"/>
           <w:szCs w:val="24"/>
         </w:rPr>
-        <w:t>Toiminnasta vastaavan henkilön ja johdon tehtävänä on huolehtia omavalvonnan ohjeistamisesta, järjestämisestä sekä siitä, että työntekijöillä on riittävästi tietoa turvallisuusasioista. Turvallisuuden varmistamiseen on myös osoitettava riittävästi voimavaroja. Yksikön vastaavan vastuulla on saada aikaan myönteinen asenneympäristö turvallisuuskysymysten käsittelylle. Onnistunut riskienhallinta vaatii sitoutumista sekä aktiivista toimintaa koko henkilökunnalta. Työntekijät osallistuvat omavalvontasuunnitelman</w:t>
-      </w:r>
-      <w:r>
-        <w:rPr>
-          <w:rFonts w:eastAsia="Arial" w:cs="Arial"/>
-          <w:sz w:val="24"/>
-          <w:szCs w:val="24"/>
-        </w:rPr>
-        <w:t xml:space="preserve"> laatimiseen, riskien arviointiin ja turvallisuutta parantavien toimenpiteiden toteuttamiseen. Riskienhallinta on jatkuva prosessi ja siinä on useita vaiheita.</w:t>
+        <w:t>Toiminnasta vastaavan henkilön ja johdon tehtävänä on huolehtia omavalvonnan ohjeistamisesta, järjestämisestä sekä siitä, että työntekijöillä on riittävästi tietoa turvallisuusasioista. Turvallisuuden varmistamiseen on myös osoitettava riittävästi voimavaroja. Yksikön vastaavan vastuulla on saada aikaan myönteinen asenneympäristö turvallisuuskysymysten käsittelylle. Onnistunut riskienhallinta vaatii sitoutumista sekä aktiivista toimintaa koko henkilökunnalta. Työntekijät osallistuvat omavalvontasuunnitelman laatimiseen, riskien arviointiin ja turvallisuutta parantavien toimenpiteiden toteuttamiseen. Riskienhallinta on jatkuva prosessi ja siinä on useita vaiheita.</w:t>
       </w:r>
     </w:p>
     <w:p>
@@ -9415,7 +9519,23 @@
           <w:sz w:val="24"/>
           <w:szCs w:val="24"/>
         </w:rPr>
-        <w:t>Asiakkaita ja heidän läheisiään ohjeistetaan ottamaan havaitut epäkohdat, laatupoikkeamat ja riskit välittömästi puheeksi henkilökunnan kanssa. Tämän jälkeen asia ilmoitetaan yksikön vastaavalle, joka keskustelee tilanteesta asiakkaan ja tarvittaessa läheisen kanssa sekä muiden asianosaisten kanssa. Tarvittaessa asiakasta tai läheistä ohjataan ottamaan yhteyttä sosiaaliasiamieheen. Kaikki esille tulleet epäkohdat käsitellään ja niistä tehdään tarvittavat toimenpiteet. Asia käydään läpi myös henkilöstön tiimissä, jotta varmistetaan yhteinen ymmärrys ja toimintatapojen yhdenmukaisuus.</w:t>
+        <w:t>Asiakkaita ja heidän läheisiään ohjeistetaan ottamaan havaitut epäkohdat, laatupoikkeamat ja riskit välittömästi puheeksi henkilökunnan kanssa. Tämän jälkeen asia ilmoitetaan yksikön vastaavalle, joka keskustelee tilanteesta asiakkaan ja tarvittaessa läheisen kanssa sekä muiden asianosaisten kanssa. Tarvittaessa asiakasta tai läheistä ohjataan ottamaan yhteyttä sosiaaliasia</w:t>
+      </w:r>
+      <w:r>
+        <w:rPr>
+          <w:rFonts w:eastAsia="Arial" w:cs="Arial"/>
+          <w:sz w:val="24"/>
+          <w:szCs w:val="24"/>
+        </w:rPr>
+        <w:t>vastaavaan</w:t>
+      </w:r>
+      <w:r>
+        <w:rPr>
+          <w:rFonts w:eastAsia="Arial" w:cs="Arial"/>
+          <w:sz w:val="24"/>
+          <w:szCs w:val="24"/>
+        </w:rPr>
+        <w:t>. Kaikki esille tulleet epäkohdat käsitellään ja niistä tehdään tarvittavat toimenpiteet. Asia käydään läpi myös henkilöstön tiimissä, jotta varmistetaan yhteinen ymmärrys ja toimintatapojen yhdenmukaisuus.</w:t>
       </w:r>
     </w:p>
     <w:p>
@@ -10271,7 +10391,7 @@
         </w:rPr>
         <w:t xml:space="preserve">, toiminnanjohtaja, </w:t>
       </w:r>
-      <w:hyperlink r:id="rId15" w:history="1">
+      <w:hyperlink r:id="rId13" w:history="1">
         <w:r>
           <w:rPr>
             <w:rStyle w:val="Hyperlink"/>
@@ -10356,7 +10476,7 @@
         </w:rPr>
         <w:t xml:space="preserve">Marjut Pirttinen talousvastaava, </w:t>
       </w:r>
-      <w:hyperlink r:id="rId16" w:tgtFrame="_blank" w:history="1">
+      <w:hyperlink r:id="rId14" w:tgtFrame="_blank" w:history="1">
         <w:r>
           <w:rPr>
             <w:rStyle w:val="Hyperlink"/>
@@ -10425,31 +10545,7 @@
           <w:i w:val="0"/>
           <w:iCs w:val="0"/>
         </w:rPr>
-        <w:t xml:space="preserve">3.3.4 Infektioiden </w:t>
-      </w:r>
-      <w:r>
-        <w:rPr>
-          <w:rStyle w:val="Heading4Char"/>
-          <w:i w:val="0"/>
-          <w:iCs w:val="0"/>
-        </w:rPr>
-        <w:t>torjunta</w:t>
-      </w:r>
-      <w:r>
-        <w:rPr>
-          <w:rStyle w:val="Heading4Char"/>
-          <w:i w:val="0"/>
-          <w:iCs w:val="0"/>
-        </w:rPr>
-        <w:t xml:space="preserve"> ja yleiset </w:t>
-      </w:r>
-      <w:r>
-        <w:rPr>
-          <w:rStyle w:val="Heading4Char"/>
-          <w:i w:val="0"/>
-          <w:iCs w:val="0"/>
-        </w:rPr>
-        <w:t>hygieniakäytännöt</w:t>
+        <w:t>3.3.4 Infektioiden torjunta ja yleiset hygieniakäytännöt</w:t>
       </w:r>
       <w:bookmarkEnd w:id="49"/>
     </w:p>
@@ -11298,15 +11394,7 @@
           <w:sz w:val="24"/>
           <w:szCs w:val="24"/>
         </w:rPr>
-        <w:t>Sosiaalihuollon yksiköissä käytetään paljon erilaisia lääkinnällisiksi laitteiksi luokiteltuja välineitä ja hoitotarvikkeita, joihin liittyvistä käytännöistä säädetään lääkinnällisistä laitteista annetussa laissa. Lääkinnällisellä laitteella tarkoitetaan instrumenttia, laitteistoa, välinettä, ohjelmistoa, materiaalia tai muuta yksinään tai yhdistelmänä käytettävää laitetta tai tarviketta, jonka valmistaja on tarkoittanut muun muassa sairauden tai vamman diagnosointiin, ehkäisyyn, tarkkailuun, hoitoon, lievi</w:t>
-      </w:r>
-      <w:r>
-        <w:rPr>
-          <w:rFonts w:eastAsia="Arial" w:cs="Arial"/>
-          <w:sz w:val="24"/>
-          <w:szCs w:val="24"/>
-        </w:rPr>
-        <w:t xml:space="preserve">tykseen tai anatomian tai fysiologisen toiminnon tutkimukseen tai korvaamiseen. Hoitoon käytettäviä laitteita ovat mm. pyörätuolit, rollaattorit, kuume- ja verenpainemittarit, kuulolaitteet, haavasidokset ym. vastaavat. </w:t>
+        <w:t xml:space="preserve">Sosiaalihuollon yksiköissä käytetään paljon erilaisia lääkinnällisiksi laitteiksi luokiteltuja välineitä ja hoitotarvikkeita, joihin liittyvistä käytännöistä säädetään lääkinnällisistä laitteista annetussa laissa. Lääkinnällisellä laitteella tarkoitetaan instrumenttia, laitteistoa, välinettä, ohjelmistoa, materiaalia tai muuta yksinään tai yhdistelmänä käytettävää laitetta tai tarviketta, jonka valmistaja on tarkoittanut muun muassa sairauden tai vamman diagnosointiin, ehkäisyyn, tarkkailuun, hoitoon, lievitykseen tai anatomian tai fysiologisen toiminnon tutkimukseen tai korvaamiseen. Hoitoon käytettäviä laitteita ovat mm. pyörätuolit, rollaattorit, kuume- ja verenpainemittarit, kuulolaitteet, haavasidokset ym. vastaavat. </w:t>
       </w:r>
     </w:p>
     <w:p>
@@ -11408,15 +11496,7 @@
           <w:sz w:val="24"/>
           <w:szCs w:val="24"/>
         </w:rPr>
-        <w:t>-kodeilla käytetään asiakkaiden hoidossa tarvittavia apuvälineitä, laitteita ja tarvikkeita, kuten verenpaine- ja kuumemittarit, jne. Asiakkaan omaohjaaja huolehtii ja kartoittaa asiakkaan apuvälinetarpeen ja on yhteydessä kunnan apuvälinekeskukseen saadaksemme asiakkaalle käyttöön tarpeelliset apuvälineet. Työntekijät perehdytetään käytettävissä oleviin terveydenhuollon välineisiin ja laitteisiin sekä vaaratilanneilmoitusten raportoimiseen. Välineitä ja laitteita käytetään ja säädetään, ylläpidetään ja huo</w:t>
-      </w:r>
-      <w:r>
-        <w:rPr>
-          <w:rFonts w:eastAsia="Arial" w:cs="Arial"/>
-          <w:sz w:val="24"/>
-          <w:szCs w:val="24"/>
-        </w:rPr>
-        <w:t xml:space="preserve">lletaan valmistajan ilmoittaman käyttötarkoituksen ja -ohjeistuksen mukaisesti.  </w:t>
+        <w:t xml:space="preserve">-kodeilla käytetään asiakkaiden hoidossa tarvittavia apuvälineitä, laitteita ja tarvikkeita, kuten verenpaine- ja kuumemittarit, jne. Asiakkaan omaohjaaja huolehtii ja kartoittaa asiakkaan apuvälinetarpeen ja on yhteydessä kunnan apuvälinekeskukseen saadaksemme asiakkaalle käyttöön tarpeelliset apuvälineet. Työntekijät perehdytetään käytettävissä oleviin terveydenhuollon välineisiin ja laitteisiin sekä vaaratilanneilmoitusten raportoimiseen. Välineitä ja laitteita käytetään ja säädetään, ylläpidetään ja huolletaan valmistajan ilmoittaman käyttötarkoituksen ja -ohjeistuksen mukaisesti.  </w:t>
       </w:r>
     </w:p>
     <w:p>
@@ -11521,7 +11601,23 @@
           <w:sz w:val="24"/>
           <w:szCs w:val="24"/>
         </w:rPr>
-        <w:t xml:space="preserve">Terveydenhuollon laitteen tai tarvikkeen aiheuttamasta vaaratilanteesta on aina tehtävä ilmoitus myös Valviralle niin pian kuin mahdollista: </w:t>
+        <w:t xml:space="preserve">Terveydenhuollon laitteen tai tarvikkeen aiheuttamasta vaaratilanteesta on aina tehtävä ilmoitus myös </w:t>
+      </w:r>
+      <w:r>
+        <w:rPr>
+          <w:rFonts w:eastAsia="Arial" w:cs="Arial"/>
+          <w:sz w:val="24"/>
+          <w:szCs w:val="24"/>
+        </w:rPr>
+        <w:t>Lupa- ja valvontavirastolle</w:t>
+      </w:r>
+      <w:r>
+        <w:rPr>
+          <w:rFonts w:eastAsia="Arial" w:cs="Arial"/>
+          <w:sz w:val="24"/>
+          <w:szCs w:val="24"/>
+        </w:rPr>
+        <w:t xml:space="preserve"> niin pian kuin mahdollista: </w:t>
       </w:r>
     </w:p>
     <w:p>
@@ -11534,7 +11630,7 @@
           <w:szCs w:val="24"/>
         </w:rPr>
       </w:pPr>
-      <w:hyperlink r:id="rId17" w:history="1">
+      <w:hyperlink r:id="rId15" w:history="1">
         <w:r>
           <w:rPr>
             <w:rStyle w:val="Hyperlink"/>
@@ -12182,7 +12278,7 @@
       <w:bookmarkStart w:id="53" w:name="_Toc283287532"/>
       <w:bookmarkStart w:id="54" w:name="_Toc175741902"/>
       <w:bookmarkStart w:id="55" w:name="_Toc175741966"/>
-      <w:bookmarkStart w:id="56" w:name="_Toc233886576"/>
+      <w:bookmarkStart w:id="56" w:name="_Toc238743018"/>
       <w:r>
         <w:t xml:space="preserve">3.4 Asiakas- ja potilastyöhön osallistuvan henkilöstön </w:t>
       </w:r>
@@ -12375,58 +12471,174 @@
       <w:r>
         <w:rPr>
           <w:rFonts w:eastAsia="Arial" w:cs="Arial"/>
-          <w:sz w:val="24"/>
-          <w:szCs w:val="24"/>
-        </w:rPr>
-        <w:t>sosiaalikasvattaja</w:t>
-      </w:r>
-      <w:r>
-        <w:rPr>
-          <w:rFonts w:eastAsia="Arial" w:cs="Arial"/>
-          <w:sz w:val="24"/>
-          <w:szCs w:val="24"/>
-        </w:rPr>
-        <w:t xml:space="preserve"> ja ohjaaj</w:t>
-      </w:r>
-      <w:r>
-        <w:rPr>
-          <w:rFonts w:eastAsia="Arial" w:cs="Arial"/>
-          <w:sz w:val="24"/>
-          <w:szCs w:val="24"/>
-        </w:rPr>
-        <w:t>i</w:t>
-      </w:r>
-      <w:r>
-        <w:rPr>
-          <w:rFonts w:eastAsia="Arial" w:cs="Arial"/>
-          <w:sz w:val="24"/>
-          <w:szCs w:val="24"/>
-        </w:rPr>
-        <w:t>na lähihoitaja</w:t>
-      </w:r>
-      <w:r>
-        <w:rPr>
-          <w:rFonts w:eastAsia="Arial" w:cs="Arial"/>
-          <w:sz w:val="24"/>
-          <w:szCs w:val="24"/>
-        </w:rPr>
-        <w:t xml:space="preserve"> sekä lähihoitajaopiskelija</w:t>
-      </w:r>
-      <w:r>
-        <w:rPr>
-          <w:rFonts w:eastAsia="Arial" w:cs="Arial"/>
-          <w:sz w:val="24"/>
-          <w:szCs w:val="24"/>
-        </w:rPr>
-        <w:t>. Vastuuhenkilön vastuulla on organisoida toiminta sekä asiakastyöhön osallistuminen. Lähihoitajan tehtävänä on asiakastyö, kodin siisteydestä huolehtiminen ja muut käytännön tehtävät. Työntekijöille on osoitettu myös erilaisia vastuu alueita. Työntekijöiden tukena on vapaaehtoisia, jotka lähinnä vastaavat viikonloppuisin valvonnasta ja erilaisista harrasteryhmistä.  Henkilöstön riittävyys suh</w:t>
-      </w:r>
-      <w:r>
-        <w:rPr>
-          <w:rFonts w:eastAsia="Arial" w:cs="Arial"/>
-          <w:sz w:val="24"/>
-          <w:szCs w:val="24"/>
-        </w:rPr>
-        <w:t xml:space="preserve">teessa asiakkaiden palvelujen tarpeisiin varmistetaan laaditulla työvuorolistalla. Vastuuhenkilö saa tukea muulta </w:t>
+          <w:b/>
+          <w:bCs/>
+          <w:sz w:val="24"/>
+          <w:szCs w:val="24"/>
+        </w:rPr>
+        <w:t>sosionomi (AMK)</w:t>
+      </w:r>
+      <w:r>
+        <w:rPr>
+          <w:rFonts w:eastAsia="Arial" w:cs="Arial"/>
+          <w:sz w:val="24"/>
+          <w:szCs w:val="24"/>
+        </w:rPr>
+        <w:t xml:space="preserve"> ja ohjaajana </w:t>
+      </w:r>
+      <w:r>
+        <w:rPr>
+          <w:rFonts w:eastAsia="Arial" w:cs="Arial"/>
+          <w:b/>
+          <w:bCs/>
+          <w:sz w:val="24"/>
+          <w:szCs w:val="24"/>
+        </w:rPr>
+        <w:t>lähihoitaja</w:t>
+      </w:r>
+      <w:r>
+        <w:rPr>
+          <w:rFonts w:eastAsia="Arial" w:cs="Arial"/>
+          <w:sz w:val="24"/>
+          <w:szCs w:val="24"/>
+        </w:rPr>
+        <w:t>. Vastuuhenkilön tehtävänä on organisoida yksikön toimintaa sekä osallistua asiakastyöhön. Lähihoitajan vastuualueisiin kuuluvat asiakastyö, kodin yleisestä siisteydestä huolehtiminen sekä muut käytännön tehtävät. Työntekijöille on lisäksi osoitettu erillisiä vastuualueita. Sijaisjärjestelyistä vastaa yksikön vastaava ohjaaja, joka saa tukea johtamiseen ja organisoimiseen muulta KAN ry:n organisaatiolta.</w:t>
+      </w:r>
+    </w:p>
+    <w:p>
+      <w:pPr>
+        <w:spacing w:after="0" w:line="360" w:lineRule="auto"/>
+        <w:rPr>
+          <w:rFonts w:eastAsia="Arial" w:cs="Arial"/>
+          <w:sz w:val="24"/>
+          <w:szCs w:val="24"/>
+        </w:rPr>
+      </w:pPr>
+    </w:p>
+    <w:p>
+      <w:pPr>
+        <w:spacing w:after="0" w:line="360" w:lineRule="auto"/>
+        <w:rPr>
+          <w:rFonts w:eastAsia="Arial" w:cs="Arial"/>
+          <w:sz w:val="24"/>
+          <w:szCs w:val="24"/>
+        </w:rPr>
+      </w:pPr>
+      <w:r>
+        <w:rPr>
+          <w:rFonts w:eastAsia="Arial" w:cs="Arial"/>
+          <w:sz w:val="24"/>
+          <w:szCs w:val="24"/>
+        </w:rPr>
+        <w:t>Työntekijöiden tukena ja yksikössä oppimassa voi olla oppisopimuksella tai harjoittelujaksolla suorittava lähihoitajaopiskelija.</w:t>
+      </w:r>
+      <w:r>
+        <w:rPr>
+          <w:rFonts w:eastAsia="Arial" w:cs="Arial"/>
+          <w:b/>
+          <w:bCs/>
+          <w:sz w:val="24"/>
+          <w:szCs w:val="24"/>
+        </w:rPr>
+        <w:t xml:space="preserve"> </w:t>
+      </w:r>
+      <w:r>
+        <w:rPr>
+          <w:rFonts w:eastAsia="Arial" w:cs="Arial"/>
+          <w:sz w:val="24"/>
+          <w:szCs w:val="24"/>
+        </w:rPr>
+        <w:t>Opiskelija voi osallistua asiakastyöhön ja lääkehoitoon ainoastaan nimetyn työpaikkaohjaajan välittömässä valvonnassa ja vastuulla, eikä hän toteuta lääkehoitoa koskaan itsenäisesti. Ohjaajien tukena toimii myös vapaaehtoisia, jotka vastaavat pääsääntöisesti viikonloppuisin valvonnasta sekä erilaisten harrasteryhmien ohjaamisesta. Henkilöstön riittävyys suhteessa asukkaiden yksilöllisiin palvelutarpeisiin varmistetaan ja seurataan säännöllisesti laadittavien työvuorolistojen avulla.</w:t>
+      </w:r>
+    </w:p>
+    <w:p>
+      <w:pPr>
+        <w:spacing w:after="0" w:line="360" w:lineRule="auto"/>
+        <w:rPr>
+          <w:rFonts w:eastAsia="Arial" w:cs="Arial"/>
+          <w:sz w:val="24"/>
+          <w:szCs w:val="24"/>
+        </w:rPr>
+      </w:pPr>
+    </w:p>
+    <w:p>
+      <w:pPr>
+        <w:spacing w:after="0" w:line="360" w:lineRule="auto"/>
+        <w:rPr>
+          <w:rFonts w:eastAsia="Arial" w:cs="Arial"/>
+          <w:sz w:val="24"/>
+          <w:szCs w:val="24"/>
+        </w:rPr>
+      </w:pPr>
+      <w:r>
+        <w:rPr>
+          <w:rFonts w:eastAsia="Arial" w:cs="Arial"/>
+          <w:sz w:val="24"/>
+          <w:szCs w:val="24"/>
+        </w:rPr>
+        <w:t>Palkattaessa työntekijöitä on otettava huomioon erityisesti henkilöiden ammatillinen osaaminen sekä soveltuvuus ja luotettavuus. Rekrytointitilanteessa työnantajan tulee tarkistaa sosiaali- ja terveydenhuollon ammattihenkilöiden ammattioikeuksia koskevat rekisteritiedot sosiaalihuollon ja terveydenhuollon ammattihenkilöiden keskusrekisteristä (Terhikki/Suosikki).</w:t>
+      </w:r>
+    </w:p>
+    <w:p>
+      <w:pPr>
+        <w:spacing w:after="0" w:line="360" w:lineRule="auto"/>
+        <w:rPr>
+          <w:rFonts w:eastAsia="Arial" w:cs="Arial"/>
+          <w:sz w:val="24"/>
+          <w:szCs w:val="24"/>
+        </w:rPr>
+      </w:pPr>
+      <w:r>
+        <w:rPr>
+          <w:rFonts w:eastAsia="Arial" w:cs="Arial"/>
+          <w:sz w:val="24"/>
+          <w:szCs w:val="24"/>
+        </w:rPr>
+        <w:t>Olemme kristillinen toimija ja varmistamme, että työntekijällä ei ole ristiriitaa tämän kanssa. Kristillistä vakaumusta emme vaadi.</w:t>
+      </w:r>
+    </w:p>
+    <w:p>
+      <w:pPr>
+        <w:spacing w:after="0" w:line="360" w:lineRule="auto"/>
+        <w:rPr>
+          <w:rFonts w:eastAsia="Arial" w:cs="Arial"/>
+          <w:sz w:val="24"/>
+          <w:szCs w:val="24"/>
+        </w:rPr>
+      </w:pPr>
+    </w:p>
+    <w:p>
+      <w:pPr>
+        <w:spacing w:after="0" w:line="360" w:lineRule="auto"/>
+        <w:rPr>
+          <w:rFonts w:eastAsia="Arial" w:cs="Arial"/>
+          <w:sz w:val="24"/>
+          <w:szCs w:val="24"/>
+        </w:rPr>
+      </w:pPr>
+      <w:r>
+        <w:rPr>
+          <w:rFonts w:eastAsia="Arial" w:cs="Arial"/>
+          <w:sz w:val="24"/>
+          <w:szCs w:val="24"/>
+        </w:rPr>
+        <w:t xml:space="preserve">Rekrytoinnit tapahtuvat tarvittaessa </w:t>
+      </w:r>
+      <w:r>
+        <w:rPr>
+          <w:rFonts w:eastAsia="Arial" w:cs="Arial"/>
+          <w:sz w:val="24"/>
+          <w:szCs w:val="24"/>
+        </w:rPr>
+        <w:t xml:space="preserve">duunitorilla, </w:t>
+      </w:r>
+      <w:r>
+        <w:rPr>
+          <w:rFonts w:eastAsia="Arial" w:cs="Arial"/>
+          <w:sz w:val="24"/>
+          <w:szCs w:val="24"/>
+        </w:rPr>
+        <w:t xml:space="preserve">mol.fi- ja </w:t>
       </w:r>
       <w:proofErr w:type="spellStart"/>
       <w:r>
@@ -12444,97 +12656,43 @@
           <w:sz w:val="24"/>
           <w:szCs w:val="24"/>
         </w:rPr>
-        <w:t xml:space="preserve"> ry:n organisaatiolta. Sijaisjärjestelyistä vastaa yksikön vastaava.</w:t>
-      </w:r>
-    </w:p>
-    <w:p>
-      <w:pPr>
-        <w:spacing w:after="0" w:line="360" w:lineRule="auto"/>
-        <w:rPr>
-          <w:rFonts w:eastAsia="Arial" w:cs="Arial"/>
-          <w:sz w:val="24"/>
-          <w:szCs w:val="24"/>
-        </w:rPr>
-      </w:pPr>
-    </w:p>
-    <w:p>
-      <w:pPr>
-        <w:spacing w:after="0" w:line="360" w:lineRule="auto"/>
-        <w:rPr>
-          <w:rFonts w:eastAsia="Arial" w:cs="Arial"/>
-          <w:sz w:val="24"/>
-          <w:szCs w:val="24"/>
-        </w:rPr>
-      </w:pPr>
-      <w:r>
-        <w:rPr>
-          <w:rFonts w:eastAsia="Arial" w:cs="Arial"/>
-          <w:sz w:val="24"/>
-          <w:szCs w:val="24"/>
-        </w:rPr>
-        <w:t>Palkattaessa työntekijöitä on otettava huomioon erityisesti henkilöiden ammatillinen osaaminen sekä soveltuvuus ja luotettavuus. Rekrytointitilanteessa työnantajan tulee tarkistaa sosiaali- ja terveydenhuollon ammattihenkilöiden ammattioikeuksia koskevat rekisteritiedot sosiaalihuollon ja terveydenhuollon ammattihenkilöiden keskusrekisteristä (Terhikki/Suosikki).</w:t>
-      </w:r>
-    </w:p>
-    <w:p>
-      <w:pPr>
-        <w:spacing w:after="0" w:line="360" w:lineRule="auto"/>
-        <w:rPr>
-          <w:rFonts w:eastAsia="Arial" w:cs="Arial"/>
-          <w:sz w:val="24"/>
-          <w:szCs w:val="24"/>
-        </w:rPr>
-      </w:pPr>
-      <w:r>
-        <w:rPr>
-          <w:rFonts w:eastAsia="Arial" w:cs="Arial"/>
-          <w:sz w:val="24"/>
-          <w:szCs w:val="24"/>
-        </w:rPr>
-        <w:t>Olemme kristillinen toimija ja varmistamme, että työntekijällä ei ole ristiriitaa tämän kanssa. Kristillistä vakaumusta emme vaadi.</w:t>
-      </w:r>
-    </w:p>
-    <w:p>
-      <w:pPr>
-        <w:spacing w:after="0" w:line="360" w:lineRule="auto"/>
-        <w:rPr>
-          <w:rFonts w:eastAsia="Arial" w:cs="Arial"/>
-          <w:sz w:val="24"/>
-          <w:szCs w:val="24"/>
-        </w:rPr>
-      </w:pPr>
-    </w:p>
-    <w:p>
-      <w:pPr>
-        <w:spacing w:after="0" w:line="360" w:lineRule="auto"/>
-        <w:rPr>
-          <w:rFonts w:eastAsia="Arial" w:cs="Arial"/>
-          <w:sz w:val="24"/>
-          <w:szCs w:val="24"/>
-        </w:rPr>
-      </w:pPr>
-      <w:r>
-        <w:rPr>
-          <w:rFonts w:eastAsia="Arial" w:cs="Arial"/>
-          <w:sz w:val="24"/>
-          <w:szCs w:val="24"/>
-        </w:rPr>
-        <w:t xml:space="preserve">Rekrytoinnit tapahtuvat tarvittaessa </w:t>
-      </w:r>
-      <w:r>
-        <w:rPr>
-          <w:rFonts w:eastAsia="Arial" w:cs="Arial"/>
-          <w:sz w:val="24"/>
-          <w:szCs w:val="24"/>
-        </w:rPr>
-        <w:t xml:space="preserve">duunitorilla, </w:t>
-      </w:r>
-      <w:r>
-        <w:rPr>
-          <w:rFonts w:eastAsia="Arial" w:cs="Arial"/>
-          <w:sz w:val="24"/>
-          <w:szCs w:val="24"/>
-        </w:rPr>
-        <w:t xml:space="preserve">mol.fi- ja </w:t>
+        <w:t xml:space="preserve"> ry:n omilla www-sivuilla. Työntekijöiden kelpoisuuden varmistamme Valviran Terhikistä/Suosikista.</w:t>
+      </w:r>
+    </w:p>
+    <w:p>
+      <w:pPr>
+        <w:spacing w:after="0" w:line="360" w:lineRule="auto"/>
+        <w:rPr>
+          <w:rFonts w:eastAsia="Arial" w:cs="Arial"/>
+          <w:sz w:val="24"/>
+          <w:szCs w:val="24"/>
+        </w:rPr>
+      </w:pPr>
+      <w:r>
+        <w:rPr>
+          <w:rFonts w:eastAsia="Arial" w:cs="Arial"/>
+          <w:sz w:val="24"/>
+          <w:szCs w:val="24"/>
+        </w:rPr>
+        <w:t>Työntekijät toimittavat alkuperäiset tutkinto- ja opintotodistukset nähtäviksi toiminnanjohtajalle</w:t>
+      </w:r>
+    </w:p>
+    <w:p>
+      <w:pPr>
+        <w:spacing w:after="0" w:line="360" w:lineRule="auto"/>
+        <w:rPr>
+          <w:rFonts w:eastAsia="Arial" w:cs="Arial"/>
+          <w:sz w:val="24"/>
+          <w:szCs w:val="24"/>
+        </w:rPr>
+      </w:pPr>
+      <w:r>
+        <w:rPr>
+          <w:rFonts w:eastAsia="Arial" w:cs="Arial"/>
+          <w:sz w:val="24"/>
+          <w:szCs w:val="24"/>
+        </w:rPr>
+        <w:t xml:space="preserve">ennen työsuhteen alkamista. </w:t>
       </w:r>
       <w:proofErr w:type="spellStart"/>
       <w:r>
@@ -12552,60 +12710,6 @@
           <w:sz w:val="24"/>
           <w:szCs w:val="24"/>
         </w:rPr>
-        <w:t xml:space="preserve"> ry:n omilla www-sivuilla. Työntekijöiden kelpoisuuden varmistamme Valviran Terhikistä/Suosikista.</w:t>
-      </w:r>
-    </w:p>
-    <w:p>
-      <w:pPr>
-        <w:spacing w:after="0" w:line="360" w:lineRule="auto"/>
-        <w:rPr>
-          <w:rFonts w:eastAsia="Arial" w:cs="Arial"/>
-          <w:sz w:val="24"/>
-          <w:szCs w:val="24"/>
-        </w:rPr>
-      </w:pPr>
-      <w:r>
-        <w:rPr>
-          <w:rFonts w:eastAsia="Arial" w:cs="Arial"/>
-          <w:sz w:val="24"/>
-          <w:szCs w:val="24"/>
-        </w:rPr>
-        <w:t>Työntekijät toimittavat alkuperäiset tutkinto- ja opintotodistukset nähtäviksi toiminnanjohtajalle</w:t>
-      </w:r>
-    </w:p>
-    <w:p>
-      <w:pPr>
-        <w:spacing w:after="0" w:line="360" w:lineRule="auto"/>
-        <w:rPr>
-          <w:rFonts w:eastAsia="Arial" w:cs="Arial"/>
-          <w:sz w:val="24"/>
-          <w:szCs w:val="24"/>
-        </w:rPr>
-      </w:pPr>
-      <w:r>
-        <w:rPr>
-          <w:rFonts w:eastAsia="Arial" w:cs="Arial"/>
-          <w:sz w:val="24"/>
-          <w:szCs w:val="24"/>
-        </w:rPr>
-        <w:t xml:space="preserve">ennen työsuhteen alkamista. </w:t>
-      </w:r>
-      <w:proofErr w:type="spellStart"/>
-      <w:r>
-        <w:rPr>
-          <w:rFonts w:eastAsia="Arial" w:cs="Arial"/>
-          <w:sz w:val="24"/>
-          <w:szCs w:val="24"/>
-        </w:rPr>
-        <w:t>Kan</w:t>
-      </w:r>
-      <w:proofErr w:type="spellEnd"/>
-      <w:r>
-        <w:rPr>
-          <w:rFonts w:eastAsia="Arial" w:cs="Arial"/>
-          <w:sz w:val="24"/>
-          <w:szCs w:val="24"/>
-        </w:rPr>
         <w:t xml:space="preserve"> ry:llä pyritään käyttämään samoja sijaisia, jolla jatkuvuus ja palvelun laatu varmistetaan.</w:t>
       </w:r>
     </w:p>
@@ -12634,6 +12738,7 @@
           <w:sz w:val="24"/>
           <w:szCs w:val="24"/>
         </w:rPr>
+        <w:lastRenderedPageBreak/>
         <w:t>Rekrytoinnissa painotetaan työntekijän aiempaa työkokemusta mielenterveys- ja päihdepuolelta. Lisäksi hakijalle ovat eduksi mahdolliset lisäkoulutukset, kuten menetelmä-</w:t>
       </w:r>
     </w:p>
@@ -12698,15 +12803,7 @@
           <w:sz w:val="24"/>
           <w:szCs w:val="24"/>
         </w:rPr>
-        <w:t>Työntekijät perehdytetään asiakastyöhön, asiakastietojen käsittelyyn ja tietosuojaan sekä omavalvonnan toteuttamiseen. Sama koskee myös meillä työskenteleviä opiskelijoita ja paluun jälkeen pitkään tehtävistä poissaolleita. Sosiaali- ja terveydenhuollon ammattihenkilölaissa säädetään työntekijöiden velvollisuudesta ylläpitää ammatillista osaamistaan ja työnantajien velvollisuudesta mahdollistaa työntekijöiden täydennyskouluttautuminen. Erityisen tärkeä täydennyskoulutuksen osa-alue on henkilökunnan lääkehoi</w:t>
-      </w:r>
-      <w:r>
-        <w:rPr>
-          <w:rFonts w:eastAsia="Arial" w:cs="Arial"/>
-          <w:sz w:val="24"/>
-          <w:szCs w:val="24"/>
-        </w:rPr>
-        <w:t>to-osaamisen varmistaminen.</w:t>
+        <w:t>Työntekijät perehdytetään asiakastyöhön, asiakastietojen käsittelyyn ja tietosuojaan sekä omavalvonnan toteuttamiseen. Sama koskee myös meillä työskenteleviä opiskelijoita ja paluun jälkeen pitkään tehtävistä poissaolleita. Sosiaali- ja terveydenhuollon ammattihenkilölaissa säädetään työntekijöiden velvollisuudesta ylläpitää ammatillista osaamistaan ja työnantajien velvollisuudesta mahdollistaa työntekijöiden täydennyskouluttautuminen. Erityisen tärkeä täydennyskoulutuksen osa-alue on henkilökunnan lääkehoito-osaamisen varmistaminen.</w:t>
       </w:r>
     </w:p>
     <w:p>
@@ -12759,11 +12856,31 @@
       <w:r>
         <w:rPr>
           <w:rFonts w:eastAsia="Arial" w:cs="Arial"/>
-          <w:sz w:val="24"/>
-          <w:szCs w:val="24"/>
-        </w:rPr>
-        <w:t>Sosiaalihuoltolaissa (1301/2014) säädetään työntekijän velvollisuudesta (48–49 §) tehdä ilmoitus havaitsemastaan epäkohdasta tai epäkohdan uhasta, joka liittyy asiakkaan sosiaalihuollon toteuttamiseen. Ilmoitusvelvollisuuden toteuttamisesta on laadittava toimintayksikölle ohjeet, jotka ovat osa omavalvontasuunnitelmaa. Laissa korostetaan, ettei ilmoituksen tehneeseen henkilöön saa kohdistaa kielteisiä vastatoimia ilmoituksen seurauksena.</w:t>
-      </w:r>
+          <w:b/>
+          <w:bCs/>
+          <w:sz w:val="24"/>
+          <w:szCs w:val="24"/>
+        </w:rPr>
+        <w:t>Laissa sosiaali- ja terveydenhuollon valvonnasta (741/2023) säädetään palveluntuottajan ja henkilöstön ilmoitusvelvollisuudesta (29 §)</w:t>
+      </w:r>
+      <w:r>
+        <w:rPr>
+          <w:rFonts w:eastAsia="Arial" w:cs="Arial"/>
+          <w:sz w:val="24"/>
+          <w:szCs w:val="24"/>
+        </w:rPr>
+        <w:t xml:space="preserve"> tehdä ilmoitus havaitsemastaan epäkohdasta tai ilmeisen epäkohdan uhasta asiakkaan sosiaalihuollon toteuttamisessa. Ilmoitusvelvollisuuden toteuttamista koskevat käytännön menettelyohjeet on sisällytetty osaksi tätä omavalvontasuunnitelmaa ja ne on käyty läpi henkilöstön kanssa. Valvontalain mukaisesti ilmoituksen tehneeseen henkilöön ei saa kohdistaa mitään kielteisiä vastatoimia ilmoituksen seurauksena.</w:t>
+      </w:r>
+    </w:p>
+    <w:p>
+      <w:pPr>
+        <w:spacing w:after="0" w:line="360" w:lineRule="auto"/>
+        <w:rPr>
+          <w:rFonts w:eastAsia="Arial" w:cs="Arial"/>
+          <w:sz w:val="24"/>
+          <w:szCs w:val="24"/>
+        </w:rPr>
+      </w:pPr>
     </w:p>
     <w:p>
       <w:pPr>
@@ -12816,6 +12933,7 @@
           <w:sz w:val="24"/>
           <w:szCs w:val="24"/>
         </w:rPr>
+        <w:lastRenderedPageBreak/>
         <w:t>valvonnassa on määritelty, miten riskinhallinnan prosessissa epäkohtiin liittyvät korjaavat toimenpiteet toteutetaan. Jos epäkohta on sellainen, että se on korjattavissa yksikön omavalvonnan menettelyssä, se otetaan välittömästi siellä työn alle. Jos epäkohta on sellainen, että se vaatii järjestämisvastuussa olevan tahon toimenpiteitä, siirretään vastuu korjaavista toimenpiteistä toimivaltaiselle taholle.</w:t>
       </w:r>
     </w:p>
@@ -12890,7 +13008,6 @@
           <w:sz w:val="24"/>
           <w:szCs w:val="24"/>
         </w:rPr>
-        <w:lastRenderedPageBreak/>
         <w:t>Palveluyksikön toiminnan keskeisimpien henkilöstön riittävyyttä ja osaamista koskevien riskien tunnistaminen, arviointi ja hallinta on kuvattu Taulukossa 4.</w:t>
       </w:r>
     </w:p>
@@ -13389,8 +13506,9 @@
       <w:bookmarkStart w:id="58" w:name="_Toc175740440"/>
       <w:bookmarkStart w:id="59" w:name="_Toc1135272961"/>
       <w:bookmarkStart w:id="60" w:name="_Toc175741903"/>
-      <w:bookmarkStart w:id="61" w:name="_Toc233886577"/>
-      <w:r>
+      <w:bookmarkStart w:id="61" w:name="_Toc238743019"/>
+      <w:r>
+        <w:lastRenderedPageBreak/>
         <w:t>3.5 Yhdenvertaisuuden, osallisuuden ja asiakkaan/potilaan aseman ja oikeuksien varmistaminen</w:t>
       </w:r>
       <w:bookmarkEnd w:id="57"/>
@@ -13479,285 +13597,11 @@
         <w:spacing w:line="360" w:lineRule="auto"/>
         <w:rPr>
           <w:rFonts w:eastAsia="Arial" w:cs="Arial"/>
-          <w:sz w:val="24"/>
-          <w:szCs w:val="24"/>
-        </w:rPr>
-      </w:pPr>
-      <w:r>
-        <w:rPr>
-          <w:rFonts w:eastAsia="Arial" w:cs="Arial"/>
           <w:b/>
           <w:bCs/>
           <w:sz w:val="24"/>
           <w:szCs w:val="24"/>
         </w:rPr>
-        <w:t xml:space="preserve">Sosiaaliasiamiehen </w:t>
-      </w:r>
-      <w:r>
-        <w:rPr>
-          <w:rFonts w:eastAsia="Arial" w:cs="Arial"/>
-          <w:sz w:val="24"/>
-          <w:szCs w:val="24"/>
-        </w:rPr>
-        <w:t>yhteystiedot sekä tiedot hänen tarjoamistaan palveluista</w:t>
-      </w:r>
-    </w:p>
-    <w:p>
-      <w:pPr>
-        <w:spacing w:line="360" w:lineRule="auto"/>
-        <w:rPr>
-          <w:rFonts w:eastAsia="Arial" w:cs="Arial"/>
-          <w:sz w:val="24"/>
-          <w:szCs w:val="24"/>
-        </w:rPr>
-      </w:pPr>
-      <w:r>
-        <w:rPr>
-          <w:rFonts w:eastAsia="Arial" w:cs="Arial"/>
-          <w:sz w:val="24"/>
-          <w:szCs w:val="24"/>
-        </w:rPr>
-        <w:t xml:space="preserve">Sosiaaliasiamies </w:t>
-      </w:r>
-    </w:p>
-    <w:p>
-      <w:pPr>
-        <w:spacing w:line="360" w:lineRule="auto"/>
-        <w:rPr>
-          <w:rFonts w:ascii="sans-serif" w:eastAsia="sans-serif" w:hAnsi="sans-serif" w:cs="sans-serif"/>
-          <w:color w:val="000000"/>
-          <w:sz w:val="16"/>
-          <w:szCs w:val="16"/>
-          <w:shd w:val="clear" w:color="auto" w:fill="FFFFFF"/>
-        </w:rPr>
-      </w:pPr>
-      <w:r>
-        <w:rPr>
-          <w:rFonts w:ascii="sans-serif" w:eastAsia="Arial" w:cs="Arial"/>
-          <w:sz w:val="24"/>
-          <w:szCs w:val="24"/>
-        </w:rPr>
-        <w:t>P.014-2692600</w:t>
-      </w:r>
-      <w:r>
-        <w:rPr>
-          <w:rFonts w:ascii="sans-serif" w:eastAsia="sans-serif" w:hAnsi="sans-serif" w:cs="sans-serif"/>
-          <w:color w:val="000000"/>
-          <w:sz w:val="16"/>
-          <w:szCs w:val="16"/>
-          <w:shd w:val="clear" w:color="auto" w:fill="FFFFFF"/>
-        </w:rPr>
-        <w:t> </w:t>
-      </w:r>
-    </w:p>
-    <w:p>
-      <w:pPr>
-        <w:spacing w:line="360" w:lineRule="auto"/>
-        <w:rPr>
-          <w:rFonts w:eastAsia="Arial" w:cs="Arial"/>
-          <w:sz w:val="24"/>
-          <w:szCs w:val="24"/>
-        </w:rPr>
-      </w:pPr>
-      <w:r>
-        <w:rPr>
-          <w:rFonts w:eastAsia="Arial" w:cs="Arial"/>
-          <w:sz w:val="24"/>
-          <w:szCs w:val="24"/>
-        </w:rPr>
-        <w:t xml:space="preserve">(puhelinpalveluajat arkisin </w:t>
-      </w:r>
-      <w:proofErr w:type="gramStart"/>
-      <w:r>
-        <w:rPr>
-          <w:rFonts w:eastAsia="Arial" w:cs="Arial"/>
-          <w:sz w:val="24"/>
-          <w:szCs w:val="24"/>
-        </w:rPr>
-        <w:t>klo 8-16</w:t>
-      </w:r>
-      <w:proofErr w:type="gramEnd"/>
-      <w:r>
-        <w:rPr>
-          <w:rFonts w:eastAsia="Arial" w:cs="Arial"/>
-          <w:sz w:val="24"/>
-          <w:szCs w:val="24"/>
-        </w:rPr>
-        <w:t>)</w:t>
-      </w:r>
-    </w:p>
-    <w:p>
-      <w:pPr>
-        <w:spacing w:line="360" w:lineRule="auto"/>
-        <w:rPr>
-          <w:rFonts w:eastAsia="Arial" w:cs="Arial"/>
-          <w:sz w:val="24"/>
-          <w:szCs w:val="24"/>
-        </w:rPr>
-      </w:pPr>
-      <w:r>
-        <w:rPr>
-          <w:rFonts w:eastAsia="Arial" w:cs="Arial"/>
-          <w:sz w:val="24"/>
-          <w:szCs w:val="24"/>
-        </w:rPr>
-        <w:t>sosiaalivastaava@hyvaks.fi</w:t>
-      </w:r>
-    </w:p>
-    <w:p>
-      <w:pPr>
-        <w:spacing w:line="360" w:lineRule="auto"/>
-        <w:rPr>
-          <w:rFonts w:eastAsia="Arial" w:cs="Arial"/>
-          <w:sz w:val="24"/>
-          <w:szCs w:val="24"/>
-        </w:rPr>
-      </w:pPr>
-      <w:r>
-        <w:rPr>
-          <w:rFonts w:eastAsia="Arial" w:cs="Arial"/>
-          <w:sz w:val="24"/>
-          <w:szCs w:val="24"/>
-        </w:rPr>
-        <w:lastRenderedPageBreak/>
-        <w:t>Sosiaaliasiamies on puolueeton taho, joka tarjoaa neuvontaa sosiaalihuollon asiakkaan asemaan ja oikeuksiin liittyvissä asioissa. Sosiaaliasiamiespalvelu on maksutonta. Sosiaaliasiamiehen toiminta-alue on yksityiset ja julkiset sosiaalipalvelut sekä varhaiskasvatus.</w:t>
-      </w:r>
-    </w:p>
-    <w:p>
-      <w:pPr>
-        <w:spacing w:line="360" w:lineRule="auto"/>
-        <w:rPr>
-          <w:rFonts w:eastAsia="Arial" w:cs="Arial"/>
-          <w:sz w:val="24"/>
-          <w:szCs w:val="24"/>
-        </w:rPr>
-      </w:pPr>
-      <w:r>
-        <w:rPr>
-          <w:rFonts w:eastAsia="Arial" w:cs="Arial"/>
-          <w:sz w:val="24"/>
-          <w:szCs w:val="24"/>
-        </w:rPr>
-        <w:t>- neuvoo ja ohjaa julkisen ja yksityisen sosiaalihuollon asiakkaita sosiaalihuollon asiakaslain soveltamiseen liittyvissä kysymyksissä</w:t>
-      </w:r>
-    </w:p>
-    <w:p>
-      <w:pPr>
-        <w:spacing w:line="360" w:lineRule="auto"/>
-        <w:rPr>
-          <w:rFonts w:eastAsia="Arial" w:cs="Arial"/>
-          <w:sz w:val="24"/>
-          <w:szCs w:val="24"/>
-        </w:rPr>
-      </w:pPr>
-      <w:r>
-        <w:rPr>
-          <w:rFonts w:eastAsia="Arial" w:cs="Arial"/>
-          <w:sz w:val="24"/>
-          <w:szCs w:val="24"/>
-        </w:rPr>
-        <w:t>- neuvoo ja tarvittaessa avustaa sosiaalihuollon asiakaslain mukaisen muistutuksen tekemisessä</w:t>
-      </w:r>
-    </w:p>
-    <w:p>
-      <w:pPr>
-        <w:spacing w:line="360" w:lineRule="auto"/>
-        <w:rPr>
-          <w:rFonts w:eastAsia="Arial" w:cs="Arial"/>
-          <w:sz w:val="24"/>
-          <w:szCs w:val="24"/>
-        </w:rPr>
-      </w:pPr>
-      <w:r>
-        <w:rPr>
-          <w:rFonts w:eastAsia="Arial" w:cs="Arial"/>
-          <w:sz w:val="24"/>
-          <w:szCs w:val="24"/>
-        </w:rPr>
-        <w:t>- tiedottaa asiakkaiden oikeuksista sekä toimii oikeuksien edistämiseksi ja toteuttamiseksi</w:t>
-      </w:r>
-    </w:p>
-    <w:p>
-      <w:pPr>
-        <w:spacing w:line="360" w:lineRule="auto"/>
-        <w:rPr>
-          <w:rFonts w:eastAsia="Arial" w:cs="Arial"/>
-          <w:sz w:val="24"/>
-          <w:szCs w:val="24"/>
-        </w:rPr>
-      </w:pPr>
-      <w:r>
-        <w:rPr>
-          <w:rFonts w:eastAsia="Arial" w:cs="Arial"/>
-          <w:sz w:val="24"/>
-          <w:szCs w:val="24"/>
-        </w:rPr>
-        <w:t>- seuraa asiakkaan aseman ja oikeuksien kehitystä antaen siitä vuosittain selvityksen kunnanhallitukselle</w:t>
-      </w:r>
-    </w:p>
-    <w:p>
-      <w:pPr>
-        <w:spacing w:line="360" w:lineRule="auto"/>
-        <w:rPr>
-          <w:rFonts w:eastAsia="Arial" w:cs="Arial"/>
-          <w:sz w:val="24"/>
-          <w:szCs w:val="24"/>
-        </w:rPr>
-      </w:pPr>
-      <w:r>
-        <w:rPr>
-          <w:rFonts w:eastAsia="Arial" w:cs="Arial"/>
-          <w:sz w:val="24"/>
-          <w:szCs w:val="24"/>
-        </w:rPr>
-        <w:t>Sosiaaliasiamies ei myönnä sosiaalipalveluja eikä valvo palvelutoimintaa tai anna toimintamääräyksiä työntekijöille.</w:t>
-      </w:r>
-    </w:p>
-    <w:p>
-      <w:pPr>
-        <w:spacing w:line="360" w:lineRule="auto"/>
-        <w:rPr>
-          <w:rFonts w:eastAsia="Arial" w:cs="Arial"/>
-          <w:sz w:val="24"/>
-          <w:szCs w:val="24"/>
-        </w:rPr>
-      </w:pPr>
-      <w:r>
-        <w:rPr>
-          <w:rFonts w:eastAsia="Arial" w:cs="Arial"/>
-          <w:sz w:val="24"/>
-          <w:szCs w:val="24"/>
-        </w:rPr>
-        <w:t xml:space="preserve">Muistutus lähetetään myös Keski-Suomen Hyvinvointialueen kirjaamoon. Sähköpostiosoite </w:t>
-      </w:r>
-      <w:hyperlink r:id="rId18" w:history="1">
-        <w:r>
-          <w:rPr>
-            <w:rStyle w:val="Hyperlink"/>
-            <w:rFonts w:eastAsia="Arial" w:cs="Arial"/>
-            <w:sz w:val="24"/>
-            <w:szCs w:val="24"/>
-          </w:rPr>
-          <w:t>kirjaamo@hyvaks.fi</w:t>
-        </w:r>
-      </w:hyperlink>
-      <w:r>
-        <w:rPr>
-          <w:rFonts w:eastAsia="Arial" w:cs="Arial"/>
-          <w:sz w:val="24"/>
-          <w:szCs w:val="24"/>
-        </w:rPr>
-        <w:t xml:space="preserve"> </w:t>
-      </w:r>
-    </w:p>
-    <w:p>
-      <w:pPr>
-        <w:spacing w:line="360" w:lineRule="auto"/>
-        <w:rPr>
-          <w:rFonts w:eastAsia="Arial" w:cs="Arial"/>
-          <w:sz w:val="24"/>
-          <w:szCs w:val="24"/>
-        </w:rPr>
       </w:pPr>
       <w:r>
         <w:rPr>
@@ -13767,15 +13611,7 @@
           <w:sz w:val="24"/>
           <w:szCs w:val="24"/>
         </w:rPr>
-        <w:t>Kuluttajaneuvonnan yhteystiedot</w:t>
-      </w:r>
-      <w:r>
-        <w:rPr>
-          <w:rFonts w:eastAsia="Arial" w:cs="Arial"/>
-          <w:sz w:val="24"/>
-          <w:szCs w:val="24"/>
-        </w:rPr>
-        <w:t xml:space="preserve"> sekä tiedot sitä kautta saatavista palveluista</w:t>
+        <w:t>Sosiaaliasiavastaavien yhteystiedot sekä tiedot heidän tarjoamistaan palveluista</w:t>
       </w:r>
     </w:p>
     <w:p>
@@ -13793,7 +13629,7 @@
           <w:sz w:val="24"/>
           <w:szCs w:val="24"/>
         </w:rPr>
-        <w:t>Ota aina ensin yhteyttä yritykseen, jonka kanssa olet asioinut. Tee reklamaatio mahdollisimman pian virheen havaitsemisesta ja pyri neuvottelemaan sopivasta hyvityksestä. Vaatimus kannattaa tehdä kirjallisesti.</w:t>
+        <w:t>Sosiaaliasiavastaava on puolueeton ja riippumaton taho, joka tarjoaa maksutonta neuvontaa sosiaalihuollon asiakkaan asemaan ja oikeuksiin liittyvissä asioissa niin julkisissa kuin yksityisissä sosiaalipalveluissa. Sosiaaliasiavastaavan tehtävänä on muun muassa neuvoa ja ohjata asiakaslain soveltamisessa, avustaa tarvittaessa muistutuksen tekemisessä sekä tiedottaa asiakkaan oikeuksista. Sosiaaliasiavastaava ei tee päätöksiä, myönnä etuuksia eikä muuta viranhaltijoiden tekemiä päätöksiä.</w:t>
       </w:r>
     </w:p>
     <w:p>
@@ -13811,11 +13647,15 @@
           <w:sz w:val="24"/>
           <w:szCs w:val="24"/>
         </w:rPr>
-        <w:t>Jos valituksesi yritykselle ei tuota toivomaasi tulosta, ota yhteyttä kuluttajaneuvontaan. Kuluttajaneuvonnasta saat maksutta opastusta ja sovitteluapua riitatilanteessa. Lisätietoa kuluttajaneuvonnan palveluista</w:t>
-      </w:r>
-    </w:p>
-    <w:p>
-      <w:pPr>
+        <w:t>Sote-valvonnan ohjeiden mukaisesti asukkaiden oikeusturvan ja neuvonnan varmistamiseksi toimintayksikössämme (toimiston ilmoitustaululla) on nähtävillä ja tähän suunnitelmaan kirjattuna kaikkien asukkaita sijoittavien hyvinvointialueen sosiaaliasiavastaavien ajantasaiset yhteystiedot:</w:t>
+      </w:r>
+    </w:p>
+    <w:p>
+      <w:pPr>
+        <w:numPr>
+          <w:ilvl w:val="0"/>
+          <w:numId w:val="15"/>
+        </w:numPr>
         <w:spacing w:line="360" w:lineRule="auto"/>
         <w:rPr>
           <w:rFonts w:eastAsia="Arial" w:cs="Arial"/>
@@ -13823,9 +13663,21 @@
           <w:szCs w:val="24"/>
         </w:rPr>
       </w:pPr>
-    </w:p>
-    <w:p>
-      <w:pPr>
+      <w:r>
+        <w:rPr>
+          <w:rFonts w:eastAsia="Arial" w:cs="Arial"/>
+          <w:sz w:val="24"/>
+          <w:szCs w:val="24"/>
+        </w:rPr>
+        <w:t>Keski-Suomen hyvinvointialue (yksikön sijaintialue):</w:t>
+      </w:r>
+    </w:p>
+    <w:p>
+      <w:pPr>
+        <w:numPr>
+          <w:ilvl w:val="1"/>
+          <w:numId w:val="15"/>
+        </w:numPr>
         <w:spacing w:line="360" w:lineRule="auto"/>
         <w:rPr>
           <w:rFonts w:eastAsia="Arial" w:cs="Arial"/>
@@ -13839,11 +13691,15 @@
           <w:sz w:val="24"/>
           <w:szCs w:val="24"/>
         </w:rPr>
-        <w:t>Kuluttajaneuvonnassa voit asioida puhelimitse soittamalla numeroon 029 505 3050 (ma, ti,</w:t>
-      </w:r>
-    </w:p>
-    <w:p>
-      <w:pPr>
+        <w:t>Sosiaaliasiavastaava: p. 014 269 2600 (puhelinpalveluajat arkisin klo 8.00–16.00), sähköposti: sosiaalivastaava@hyvaks.fi.</w:t>
+      </w:r>
+    </w:p>
+    <w:p>
+      <w:pPr>
+        <w:numPr>
+          <w:ilvl w:val="0"/>
+          <w:numId w:val="15"/>
+        </w:numPr>
         <w:spacing w:line="360" w:lineRule="auto"/>
         <w:rPr>
           <w:rFonts w:eastAsia="Arial" w:cs="Arial"/>
@@ -13857,22 +13713,291 @@
           <w:sz w:val="24"/>
           <w:szCs w:val="24"/>
         </w:rPr>
-        <w:t>ke, pe klo 9–12, to 12–15</w:t>
-      </w:r>
-    </w:p>
-    <w:p>
-      <w:pPr>
-        <w:spacing w:after="0" w:line="360" w:lineRule="auto"/>
-        <w:rPr>
-          <w:rFonts w:eastAsia="Arial" w:cs="Arial"/>
-          <w:sz w:val="24"/>
-          <w:szCs w:val="24"/>
-        </w:rPr>
-      </w:pPr>
-    </w:p>
-    <w:p>
-      <w:pPr>
-        <w:spacing w:after="0" w:line="360" w:lineRule="auto"/>
+        <w:t>Etelä-Savon hyvinvointialue (Eloisa, sijoittava alue):</w:t>
+      </w:r>
+    </w:p>
+    <w:p>
+      <w:pPr>
+        <w:numPr>
+          <w:ilvl w:val="1"/>
+          <w:numId w:val="15"/>
+        </w:numPr>
+        <w:spacing w:line="360" w:lineRule="auto"/>
+        <w:rPr>
+          <w:rFonts w:eastAsia="Arial" w:cs="Arial"/>
+          <w:sz w:val="24"/>
+          <w:szCs w:val="24"/>
+          <w:lang w:val="en-US"/>
+        </w:rPr>
+      </w:pPr>
+      <w:proofErr w:type="spellStart"/>
+      <w:r>
+        <w:rPr>
+          <w:rFonts w:eastAsia="Arial" w:cs="Arial"/>
+          <w:sz w:val="24"/>
+          <w:szCs w:val="24"/>
+          <w:lang w:val="en-US"/>
+        </w:rPr>
+        <w:t>Sosiaali</w:t>
+      </w:r>
+      <w:proofErr w:type="spellEnd"/>
+      <w:r>
+        <w:rPr>
+          <w:rFonts w:eastAsia="Arial" w:cs="Arial"/>
+          <w:sz w:val="24"/>
+          <w:szCs w:val="24"/>
+          <w:lang w:val="en-US"/>
+        </w:rPr>
+        <w:t xml:space="preserve">- ja </w:t>
+      </w:r>
+      <w:proofErr w:type="spellStart"/>
+      <w:r>
+        <w:rPr>
+          <w:rFonts w:eastAsia="Arial" w:cs="Arial"/>
+          <w:sz w:val="24"/>
+          <w:szCs w:val="24"/>
+          <w:lang w:val="en-US"/>
+        </w:rPr>
+        <w:t>potilasasiavastaava</w:t>
+      </w:r>
+      <w:proofErr w:type="spellEnd"/>
+      <w:r>
+        <w:rPr>
+          <w:rFonts w:eastAsia="Arial" w:cs="Arial"/>
+          <w:sz w:val="24"/>
+          <w:szCs w:val="24"/>
+          <w:lang w:val="en-US"/>
+        </w:rPr>
+        <w:t>: Heli Korhonen</w:t>
+      </w:r>
+    </w:p>
+    <w:p>
+      <w:pPr>
+        <w:numPr>
+          <w:ilvl w:val="1"/>
+          <w:numId w:val="15"/>
+        </w:numPr>
+        <w:spacing w:line="360" w:lineRule="auto"/>
+        <w:rPr>
+          <w:rFonts w:eastAsia="Arial" w:cs="Arial"/>
+          <w:sz w:val="24"/>
+          <w:szCs w:val="24"/>
+        </w:rPr>
+      </w:pPr>
+      <w:r>
+        <w:rPr>
+          <w:rFonts w:eastAsia="Arial" w:cs="Arial"/>
+          <w:sz w:val="24"/>
+          <w:szCs w:val="24"/>
+        </w:rPr>
+        <w:t>Puhelinnumero: 044 351 2818 (puhelinaika ma–pe klo 9.00–14.00)</w:t>
+      </w:r>
+    </w:p>
+    <w:p>
+      <w:pPr>
+        <w:numPr>
+          <w:ilvl w:val="1"/>
+          <w:numId w:val="15"/>
+        </w:numPr>
+        <w:spacing w:line="360" w:lineRule="auto"/>
+        <w:rPr>
+          <w:rFonts w:eastAsia="Arial" w:cs="Arial"/>
+          <w:sz w:val="24"/>
+          <w:szCs w:val="24"/>
+          <w:lang w:val="en-US"/>
+        </w:rPr>
+      </w:pPr>
+      <w:proofErr w:type="spellStart"/>
+      <w:r>
+        <w:rPr>
+          <w:rFonts w:eastAsia="Arial" w:cs="Arial"/>
+          <w:sz w:val="24"/>
+          <w:szCs w:val="24"/>
+          <w:lang w:val="en-US"/>
+        </w:rPr>
+        <w:t>Sähköposti</w:t>
+      </w:r>
+      <w:proofErr w:type="spellEnd"/>
+      <w:r>
+        <w:rPr>
+          <w:rFonts w:eastAsia="Arial" w:cs="Arial"/>
+          <w:sz w:val="24"/>
+          <w:szCs w:val="24"/>
+          <w:lang w:val="en-US"/>
+        </w:rPr>
+        <w:t>: sosiaali.potilasasiavastaava@etelasavonha.fi</w:t>
+      </w:r>
+    </w:p>
+    <w:p>
+      <w:pPr>
+        <w:numPr>
+          <w:ilvl w:val="1"/>
+          <w:numId w:val="15"/>
+        </w:numPr>
+        <w:spacing w:line="360" w:lineRule="auto"/>
+        <w:rPr>
+          <w:rFonts w:eastAsia="Arial" w:cs="Arial"/>
+          <w:sz w:val="24"/>
+          <w:szCs w:val="24"/>
+          <w:lang w:val="en-US"/>
+        </w:rPr>
+      </w:pPr>
+      <w:proofErr w:type="spellStart"/>
+      <w:r>
+        <w:rPr>
+          <w:rFonts w:eastAsia="Arial" w:cs="Arial"/>
+          <w:sz w:val="24"/>
+          <w:szCs w:val="24"/>
+          <w:lang w:val="en-US"/>
+        </w:rPr>
+        <w:t>Toimipaikka</w:t>
+      </w:r>
+      <w:proofErr w:type="spellEnd"/>
+      <w:r>
+        <w:rPr>
+          <w:rFonts w:eastAsia="Arial" w:cs="Arial"/>
+          <w:sz w:val="24"/>
+          <w:szCs w:val="24"/>
+          <w:lang w:val="en-US"/>
+        </w:rPr>
+        <w:t xml:space="preserve">: </w:t>
+      </w:r>
+      <w:proofErr w:type="spellStart"/>
+      <w:r>
+        <w:rPr>
+          <w:rFonts w:eastAsia="Arial" w:cs="Arial"/>
+          <w:sz w:val="24"/>
+          <w:szCs w:val="24"/>
+          <w:lang w:val="en-US"/>
+        </w:rPr>
+        <w:t>Mikkelin</w:t>
+      </w:r>
+      <w:proofErr w:type="spellEnd"/>
+      <w:r>
+        <w:rPr>
+          <w:rFonts w:eastAsia="Arial" w:cs="Arial"/>
+          <w:sz w:val="24"/>
+          <w:szCs w:val="24"/>
+          <w:lang w:val="en-US"/>
+        </w:rPr>
+        <w:t xml:space="preserve"> </w:t>
+      </w:r>
+      <w:proofErr w:type="spellStart"/>
+      <w:r>
+        <w:rPr>
+          <w:rFonts w:eastAsia="Arial" w:cs="Arial"/>
+          <w:sz w:val="24"/>
+          <w:szCs w:val="24"/>
+          <w:lang w:val="en-US"/>
+        </w:rPr>
+        <w:t>keskussairaala</w:t>
+      </w:r>
+      <w:proofErr w:type="spellEnd"/>
+      <w:r>
+        <w:rPr>
+          <w:rFonts w:eastAsia="Arial" w:cs="Arial"/>
+          <w:sz w:val="24"/>
+          <w:szCs w:val="24"/>
+          <w:lang w:val="en-US"/>
+        </w:rPr>
+        <w:t xml:space="preserve"> / </w:t>
+      </w:r>
+      <w:proofErr w:type="spellStart"/>
+      <w:r>
+        <w:rPr>
+          <w:rFonts w:eastAsia="Arial" w:cs="Arial"/>
+          <w:sz w:val="24"/>
+          <w:szCs w:val="24"/>
+          <w:lang w:val="en-US"/>
+        </w:rPr>
+        <w:t>Savonlinnan</w:t>
+      </w:r>
+      <w:proofErr w:type="spellEnd"/>
+      <w:r>
+        <w:rPr>
+          <w:rFonts w:eastAsia="Arial" w:cs="Arial"/>
+          <w:sz w:val="24"/>
+          <w:szCs w:val="24"/>
+          <w:lang w:val="en-US"/>
+        </w:rPr>
+        <w:t xml:space="preserve"> </w:t>
+      </w:r>
+      <w:proofErr w:type="spellStart"/>
+      <w:r>
+        <w:rPr>
+          <w:rFonts w:eastAsia="Arial" w:cs="Arial"/>
+          <w:sz w:val="24"/>
+          <w:szCs w:val="24"/>
+          <w:lang w:val="en-US"/>
+        </w:rPr>
+        <w:t>sairaala</w:t>
+      </w:r>
+      <w:proofErr w:type="spellEnd"/>
+    </w:p>
+    <w:p>
+      <w:pPr>
+        <w:numPr>
+          <w:ilvl w:val="0"/>
+          <w:numId w:val="15"/>
+        </w:numPr>
+        <w:spacing w:line="360" w:lineRule="auto"/>
+        <w:rPr>
+          <w:rFonts w:eastAsia="Arial" w:cs="Arial"/>
+          <w:sz w:val="24"/>
+          <w:szCs w:val="24"/>
+        </w:rPr>
+      </w:pPr>
+      <w:r>
+        <w:rPr>
+          <w:rFonts w:eastAsia="Arial" w:cs="Arial"/>
+          <w:sz w:val="24"/>
+          <w:szCs w:val="24"/>
+        </w:rPr>
+        <w:t>Etelä-Pohjanmaan hyvinvointialue (sijoittava alue):</w:t>
+      </w:r>
+    </w:p>
+    <w:p>
+      <w:pPr>
+        <w:numPr>
+          <w:ilvl w:val="1"/>
+          <w:numId w:val="15"/>
+        </w:numPr>
+        <w:spacing w:line="360" w:lineRule="auto"/>
+        <w:rPr>
+          <w:rFonts w:eastAsia="Arial" w:cs="Arial"/>
+          <w:sz w:val="24"/>
+          <w:szCs w:val="24"/>
+          <w:lang w:val="en-US"/>
+        </w:rPr>
+      </w:pPr>
+      <w:proofErr w:type="spellStart"/>
+      <w:r>
+        <w:rPr>
+          <w:rFonts w:eastAsia="Arial" w:cs="Arial"/>
+          <w:sz w:val="24"/>
+          <w:szCs w:val="24"/>
+          <w:lang w:val="en-US"/>
+        </w:rPr>
+        <w:t>Sosiaaliasiavastaava</w:t>
+      </w:r>
+      <w:proofErr w:type="spellEnd"/>
+      <w:r>
+        <w:rPr>
+          <w:rFonts w:eastAsia="Arial" w:cs="Arial"/>
+          <w:sz w:val="24"/>
+          <w:szCs w:val="24"/>
+          <w:lang w:val="en-US"/>
+        </w:rPr>
+        <w:t>: Taina Holappa (YTM)</w:t>
+      </w:r>
+    </w:p>
+    <w:p>
+      <w:pPr>
+        <w:numPr>
+          <w:ilvl w:val="1"/>
+          <w:numId w:val="15"/>
+        </w:numPr>
+        <w:spacing w:line="360" w:lineRule="auto"/>
         <w:rPr>
           <w:rFonts w:eastAsia="Arial" w:cs="Arial"/>
           <w:sz w:val="24"/>
@@ -13886,7 +14011,29 @@
           <w:szCs w:val="24"/>
         </w:rPr>
         <w:lastRenderedPageBreak/>
-        <w:t>Palvelu- ja hoitosuunnitelmasta säädetään sosiaalihuollon asiakkaan asemasta ja oikeuksista annetun lain 7 §:</w:t>
+        <w:t>Puhelinnumero: 06 415 4111 (vaihde, puhelinaika maanantaisin klo 12.30–14.00 sekä tiistai–torstai klo 8.30–10.00)</w:t>
+      </w:r>
+    </w:p>
+    <w:p>
+      <w:pPr>
+        <w:numPr>
+          <w:ilvl w:val="1"/>
+          <w:numId w:val="15"/>
+        </w:numPr>
+        <w:spacing w:line="360" w:lineRule="auto"/>
+        <w:rPr>
+          <w:rFonts w:eastAsia="Arial" w:cs="Arial"/>
+          <w:sz w:val="24"/>
+          <w:szCs w:val="24"/>
+        </w:rPr>
+      </w:pPr>
+      <w:r>
+        <w:rPr>
+          <w:rFonts w:eastAsia="Arial" w:cs="Arial"/>
+          <w:sz w:val="24"/>
+          <w:szCs w:val="24"/>
+        </w:rPr>
+        <w:t xml:space="preserve">Verkkoasiointi: </w:t>
       </w:r>
       <w:proofErr w:type="spellStart"/>
       <w:r>
@@ -13895,7 +14042,7 @@
           <w:sz w:val="24"/>
           <w:szCs w:val="24"/>
         </w:rPr>
-        <w:t>ssä</w:t>
+        <w:t>OmaEP</w:t>
       </w:r>
       <w:proofErr w:type="spellEnd"/>
       <w:r>
@@ -13904,150 +14051,131 @@
           <w:sz w:val="24"/>
           <w:szCs w:val="24"/>
         </w:rPr>
-        <w:t>. Hoidon ja palvelun tarve kirjataan asiakkaan henkilökohtaiseen, kuntoutussuunnitelmaan, jota päivitetään säännöllisesti. Suunnitelman tavoitteena on auttaa asiakasta saavuttamaan kuntoutumiselle asetetut tavoitteet.  Kuntoutussuunnitelmaa arvioidaan yhdessä asukkaan ja tarvittaessa hänen omaisensa, läheisensä/laillisen edustajansa kanssa yhteistyössä tilaajan kanssa. Suunnitelman lähtökohtana on asiakkaan oma näkemys voimavaroistaan ja niiden vahvistamisesta. Kuntoutussuunnitelma toimii asukkaan ja työ</w:t>
-      </w:r>
-      <w:r>
-        <w:rPr>
-          <w:rFonts w:eastAsia="Arial" w:cs="Arial"/>
-          <w:sz w:val="24"/>
-          <w:szCs w:val="24"/>
-        </w:rPr>
-        <w:t>ntekijän työkaluna arjessa.</w:t>
-      </w:r>
-    </w:p>
-    <w:p>
-      <w:pPr>
-        <w:spacing w:after="0" w:line="360" w:lineRule="auto"/>
-        <w:rPr>
-          <w:rFonts w:eastAsia="Arial" w:cs="Arial"/>
-          <w:sz w:val="24"/>
-          <w:szCs w:val="24"/>
-        </w:rPr>
-      </w:pPr>
-    </w:p>
-    <w:p>
-      <w:pPr>
-        <w:spacing w:after="0" w:line="360" w:lineRule="auto"/>
-        <w:rPr>
-          <w:rFonts w:eastAsia="Arial" w:cs="Arial"/>
-          <w:sz w:val="24"/>
-          <w:szCs w:val="24"/>
-        </w:rPr>
-      </w:pPr>
-      <w:r>
-        <w:rPr>
-          <w:rFonts w:eastAsia="Arial" w:cs="Arial"/>
-          <w:sz w:val="24"/>
-          <w:szCs w:val="24"/>
-        </w:rPr>
-        <w:t>Asiakas osallistuu päätöksentekoon itseään koskevissa. Asiakas arvioi itse omaa toimintakykyään ja asettaa omia tavoitteita kuntoutumiselleen, etsii keinoja tavoitteiden</w:t>
-      </w:r>
-    </w:p>
-    <w:p>
-      <w:pPr>
-        <w:spacing w:after="0" w:line="360" w:lineRule="auto"/>
-        <w:rPr>
-          <w:rFonts w:eastAsia="Arial" w:cs="Arial"/>
-          <w:sz w:val="24"/>
-          <w:szCs w:val="24"/>
-        </w:rPr>
-      </w:pPr>
-      <w:r>
-        <w:rPr>
-          <w:rFonts w:eastAsia="Arial" w:cs="Arial"/>
-          <w:sz w:val="24"/>
-          <w:szCs w:val="24"/>
-        </w:rPr>
-        <w:t>saavuttamiseksi ja arvioi etenemistään tavoitteiden mukaan. Näitä keskusteluja käydään omaohjaajan kanssa viikoittain, asukaspalavereissa tilaajan kanssa sekä tarvittaessa muulloinkin. Suunnitelman pohjalta jokaiselle asiakkaalle laaditaan henkilökohtainen viikkosuunnitelma. Suunnitelma sisältää omaohjaaja keskustelut, vähintään kaksi päihde/vertaistukiryhmää sekä harrasteryhmiä ja omia henkilökohtaisia tekemisiä esim. kauppa- ja asiointikäyntejä, siivousta, pyykinpesua ja saunomisen.</w:t>
-      </w:r>
-    </w:p>
-    <w:p>
-      <w:pPr>
-        <w:spacing w:after="0" w:line="360" w:lineRule="auto"/>
-        <w:rPr>
-          <w:rFonts w:eastAsia="Arial" w:cs="Arial"/>
-          <w:sz w:val="24"/>
-          <w:szCs w:val="24"/>
-        </w:rPr>
-      </w:pPr>
-    </w:p>
-    <w:p>
-      <w:pPr>
-        <w:spacing w:after="0" w:line="360" w:lineRule="auto"/>
-        <w:rPr>
-          <w:rFonts w:eastAsia="Arial" w:cs="Arial"/>
-          <w:sz w:val="24"/>
-          <w:szCs w:val="24"/>
-        </w:rPr>
-      </w:pPr>
-      <w:r>
-        <w:rPr>
-          <w:rFonts w:eastAsia="Arial" w:cs="Arial"/>
-          <w:sz w:val="24"/>
-          <w:szCs w:val="24"/>
-        </w:rPr>
-        <w:t>Asiakkaan saapumisesta kuukauden kuluessa asiakkaan kanssa tehdään kuntoutussuunnitelma. Mahdollisuuksien mukaan järjestetään myös verkostotapaaminen, johon osallistuvat asiakas, omaohjaaja, yksikönvastaava ja hyvinvointialueen edustaja. Omaohjaaja tekee kuntoutussuunnitelman kokouksen muistiinpanojen pohjalta sähköiseen asiakastietojärjestelmään Hilkkaan.</w:t>
-      </w:r>
-    </w:p>
-    <w:p>
-      <w:pPr>
-        <w:spacing w:after="0" w:line="360" w:lineRule="auto"/>
-        <w:rPr>
-          <w:rFonts w:eastAsia="Arial" w:cs="Arial"/>
-          <w:sz w:val="24"/>
-          <w:szCs w:val="24"/>
-        </w:rPr>
-      </w:pPr>
-    </w:p>
-    <w:p>
-      <w:pPr>
-        <w:spacing w:after="0" w:line="360" w:lineRule="auto"/>
-        <w:rPr>
-          <w:rFonts w:eastAsia="Arial" w:cs="Arial"/>
-          <w:sz w:val="24"/>
-          <w:szCs w:val="24"/>
-        </w:rPr>
-      </w:pPr>
-      <w:r>
-        <w:rPr>
-          <w:rFonts w:eastAsia="Arial" w:cs="Arial"/>
-          <w:sz w:val="24"/>
-          <w:szCs w:val="24"/>
-        </w:rPr>
-        <w:t>Suunnitelma sisältää lähtötilanteen kartoituksen, kuntoutuksen tavoitteet, keinot, mittarit ja arvioinnin. Kuntoutussuunnitelman päivitys tapahtuu sopimuksen mukaisesti, kuitenkin</w:t>
-      </w:r>
-    </w:p>
-    <w:p>
-      <w:pPr>
-        <w:spacing w:after="0" w:line="360" w:lineRule="auto"/>
-        <w:rPr>
-          <w:rFonts w:eastAsia="Arial" w:cs="Arial"/>
-          <w:sz w:val="24"/>
-          <w:szCs w:val="24"/>
-        </w:rPr>
-      </w:pPr>
-      <w:r>
-        <w:rPr>
-          <w:rFonts w:eastAsia="Arial" w:cs="Arial"/>
-          <w:sz w:val="24"/>
-          <w:szCs w:val="24"/>
-        </w:rPr>
-        <w:t>vähintään kaksi kertaa vuodessa ja/tai tarvittaessa. Kuntoutussuunnitelmaa arvioidaan kuukausittain. Asiakkaan vointia arvioidaan jatkuvasti ja keskustellaan havainnoista työyhteisön kesken. Hilkka asiakastietojärjestelmään kirjataan kaikki päivittäiset havainnot.</w:t>
-      </w:r>
-    </w:p>
-    <w:p>
-      <w:pPr>
-        <w:spacing w:after="0" w:line="360" w:lineRule="auto"/>
-        <w:rPr>
-          <w:rFonts w:eastAsia="Arial" w:cs="Arial"/>
-          <w:sz w:val="24"/>
-          <w:szCs w:val="24"/>
-        </w:rPr>
-      </w:pPr>
-    </w:p>
-    <w:p>
-      <w:pPr>
-        <w:spacing w:after="0" w:line="360" w:lineRule="auto"/>
+        <w:t xml:space="preserve"> digipalvelussa (omaep.fi)</w:t>
+      </w:r>
+    </w:p>
+    <w:p>
+      <w:pPr>
+        <w:numPr>
+          <w:ilvl w:val="0"/>
+          <w:numId w:val="15"/>
+        </w:numPr>
+        <w:spacing w:line="360" w:lineRule="auto"/>
+        <w:rPr>
+          <w:rFonts w:eastAsia="Arial" w:cs="Arial"/>
+          <w:sz w:val="24"/>
+          <w:szCs w:val="24"/>
+        </w:rPr>
+      </w:pPr>
+      <w:r>
+        <w:rPr>
+          <w:rFonts w:eastAsia="Arial" w:cs="Arial"/>
+          <w:sz w:val="24"/>
+          <w:szCs w:val="24"/>
+        </w:rPr>
+        <w:t>Pohjois-Savon hyvinvointialue (sijoittava alue):</w:t>
+      </w:r>
+    </w:p>
+    <w:p>
+      <w:pPr>
+        <w:numPr>
+          <w:ilvl w:val="1"/>
+          <w:numId w:val="15"/>
+        </w:numPr>
+        <w:spacing w:line="360" w:lineRule="auto"/>
+        <w:rPr>
+          <w:rFonts w:eastAsia="Arial" w:cs="Arial"/>
+          <w:sz w:val="24"/>
+          <w:szCs w:val="24"/>
+        </w:rPr>
+      </w:pPr>
+      <w:r>
+        <w:rPr>
+          <w:rFonts w:eastAsia="Arial" w:cs="Arial"/>
+          <w:sz w:val="24"/>
+          <w:szCs w:val="24"/>
+        </w:rPr>
+        <w:t>Sosiaaliasiavastaavat: Kristiina Anttonen ja Teuvo Räsänen</w:t>
+      </w:r>
+    </w:p>
+    <w:p>
+      <w:pPr>
+        <w:numPr>
+          <w:ilvl w:val="1"/>
+          <w:numId w:val="15"/>
+        </w:numPr>
+        <w:spacing w:line="360" w:lineRule="auto"/>
+        <w:rPr>
+          <w:rFonts w:eastAsia="Arial" w:cs="Arial"/>
+          <w:sz w:val="24"/>
+          <w:szCs w:val="24"/>
+        </w:rPr>
+      </w:pPr>
+      <w:r>
+        <w:rPr>
+          <w:rFonts w:eastAsia="Arial" w:cs="Arial"/>
+          <w:sz w:val="24"/>
+          <w:szCs w:val="24"/>
+        </w:rPr>
+        <w:t>Puhelinnumero: 044 461 0999 (puhelinaika arkisin klo 9.00–11.30, vaihde: 017 173 311)</w:t>
+      </w:r>
+    </w:p>
+    <w:p>
+      <w:pPr>
+        <w:numPr>
+          <w:ilvl w:val="1"/>
+          <w:numId w:val="15"/>
+        </w:numPr>
+        <w:spacing w:line="360" w:lineRule="auto"/>
+        <w:rPr>
+          <w:rFonts w:eastAsia="Arial" w:cs="Arial"/>
+          <w:sz w:val="24"/>
+          <w:szCs w:val="24"/>
+        </w:rPr>
+      </w:pPr>
+      <w:r>
+        <w:rPr>
+          <w:rFonts w:eastAsia="Arial" w:cs="Arial"/>
+          <w:sz w:val="24"/>
+          <w:szCs w:val="24"/>
+        </w:rPr>
+        <w:t>Sähköposti: sosiaaliasiavastaava@pshyvinvointialue.fi (Suositellaan turvapostin käyttöä: pshyvinvointialue.fi/sosiaaliasiavastaava)</w:t>
+      </w:r>
+    </w:p>
+    <w:p>
+      <w:pPr>
+        <w:numPr>
+          <w:ilvl w:val="1"/>
+          <w:numId w:val="15"/>
+        </w:numPr>
+        <w:spacing w:line="360" w:lineRule="auto"/>
+        <w:rPr>
+          <w:rFonts w:eastAsia="Arial" w:cs="Arial"/>
+          <w:sz w:val="24"/>
+          <w:szCs w:val="24"/>
+        </w:rPr>
+      </w:pPr>
+      <w:r>
+        <w:rPr>
+          <w:rFonts w:eastAsia="Arial" w:cs="Arial"/>
+          <w:i/>
+          <w:iCs/>
+          <w:sz w:val="24"/>
+          <w:szCs w:val="24"/>
+        </w:rPr>
+        <w:t>Yksikön asioista vastaava sijoittavan alueen yhdyshenkilö: Erityisasumispalveluiden johtava sosiaalityöntekijä Päivi Pakarinen (Pohjois-Savon hyvinvointialue), p. 044 718 3659, sähköposti: paivi.pakarinen@pshyvinvointialue.fi.</w:t>
+      </w:r>
+    </w:p>
+    <w:p>
+      <w:pPr>
+        <w:spacing w:line="360" w:lineRule="auto"/>
+        <w:rPr>
+          <w:rFonts w:eastAsia="Arial" w:cs="Arial"/>
+          <w:sz w:val="24"/>
+          <w:szCs w:val="24"/>
+        </w:rPr>
+      </w:pPr>
+      <w:r>
         <w:rPr>
           <w:rFonts w:eastAsia="Arial" w:cs="Arial"/>
           <w:b/>
@@ -14055,8 +14183,287 @@
           <w:sz w:val="24"/>
           <w:szCs w:val="24"/>
         </w:rPr>
-      </w:pPr>
-      <w:r>
+        <w:t>Kuluttajaneuvonnan yhteystiedot</w:t>
+      </w:r>
+      <w:r>
+        <w:rPr>
+          <w:rFonts w:eastAsia="Arial" w:cs="Arial"/>
+          <w:sz w:val="24"/>
+          <w:szCs w:val="24"/>
+        </w:rPr>
+        <w:t xml:space="preserve"> sekä tiedot sitä kautta saatavista palveluista</w:t>
+      </w:r>
+    </w:p>
+    <w:p>
+      <w:pPr>
+        <w:spacing w:line="360" w:lineRule="auto"/>
+        <w:rPr>
+          <w:rFonts w:eastAsia="Arial" w:cs="Arial"/>
+          <w:sz w:val="24"/>
+          <w:szCs w:val="24"/>
+        </w:rPr>
+      </w:pPr>
+      <w:r>
+        <w:rPr>
+          <w:rFonts w:eastAsia="Arial" w:cs="Arial"/>
+          <w:sz w:val="24"/>
+          <w:szCs w:val="24"/>
+        </w:rPr>
+        <w:t>Ota aina ensin yhteyttä yritykseen, jonka kanssa olet asioinut. Tee reklamaatio mahdollisimman pian virheen havaitsemisesta ja pyri neuvottelemaan sopivasta hyvityksestä. Vaatimus kannattaa tehdä kirjallisesti.</w:t>
+      </w:r>
+    </w:p>
+    <w:p>
+      <w:pPr>
+        <w:spacing w:line="360" w:lineRule="auto"/>
+        <w:rPr>
+          <w:rFonts w:eastAsia="Arial" w:cs="Arial"/>
+          <w:sz w:val="24"/>
+          <w:szCs w:val="24"/>
+        </w:rPr>
+      </w:pPr>
+      <w:r>
+        <w:rPr>
+          <w:rFonts w:eastAsia="Arial" w:cs="Arial"/>
+          <w:sz w:val="24"/>
+          <w:szCs w:val="24"/>
+        </w:rPr>
+        <w:t>Jos valituksesi yritykselle ei tuota toivomaasi tulosta, ota yhteyttä kuluttajaneuvontaan. Kuluttajaneuvonnasta saat maksutta opastusta ja sovitteluapua riitatilanteessa. Lisätietoa kuluttajaneuvonnan palveluista</w:t>
+      </w:r>
+    </w:p>
+    <w:p>
+      <w:pPr>
+        <w:spacing w:line="360" w:lineRule="auto"/>
+        <w:rPr>
+          <w:rFonts w:eastAsia="Arial" w:cs="Arial"/>
+          <w:sz w:val="24"/>
+          <w:szCs w:val="24"/>
+        </w:rPr>
+      </w:pPr>
+    </w:p>
+    <w:p>
+      <w:pPr>
+        <w:spacing w:line="360" w:lineRule="auto"/>
+        <w:rPr>
+          <w:rFonts w:eastAsia="Arial" w:cs="Arial"/>
+          <w:sz w:val="24"/>
+          <w:szCs w:val="24"/>
+        </w:rPr>
+      </w:pPr>
+      <w:r>
+        <w:rPr>
+          <w:rFonts w:eastAsia="Arial" w:cs="Arial"/>
+          <w:sz w:val="24"/>
+          <w:szCs w:val="24"/>
+        </w:rPr>
+        <w:t>Kuluttajaneuvonnassa voit asioida puhelimitse soittamalla numeroon 029 505 3050 (ma, ti,</w:t>
+      </w:r>
+    </w:p>
+    <w:p>
+      <w:pPr>
+        <w:spacing w:line="360" w:lineRule="auto"/>
+        <w:rPr>
+          <w:rFonts w:eastAsia="Arial" w:cs="Arial"/>
+          <w:sz w:val="24"/>
+          <w:szCs w:val="24"/>
+        </w:rPr>
+      </w:pPr>
+      <w:r>
+        <w:rPr>
+          <w:rFonts w:eastAsia="Arial" w:cs="Arial"/>
+          <w:sz w:val="24"/>
+          <w:szCs w:val="24"/>
+        </w:rPr>
+        <w:t>ke, pe klo 9–12, to 12–15</w:t>
+      </w:r>
+    </w:p>
+    <w:p>
+      <w:pPr>
+        <w:spacing w:after="0" w:line="360" w:lineRule="auto"/>
+        <w:rPr>
+          <w:rFonts w:eastAsia="Arial" w:cs="Arial"/>
+          <w:sz w:val="24"/>
+          <w:szCs w:val="24"/>
+        </w:rPr>
+      </w:pPr>
+    </w:p>
+    <w:p>
+      <w:pPr>
+        <w:spacing w:after="0" w:line="360" w:lineRule="auto"/>
+        <w:rPr>
+          <w:rFonts w:eastAsia="Arial" w:cs="Arial"/>
+          <w:sz w:val="24"/>
+          <w:szCs w:val="24"/>
+        </w:rPr>
+      </w:pPr>
+      <w:r>
+        <w:rPr>
+          <w:rFonts w:eastAsia="Arial" w:cs="Arial"/>
+          <w:sz w:val="24"/>
+          <w:szCs w:val="24"/>
+        </w:rPr>
+        <w:t>Palvelu- ja hoitosuunnitelmasta säädetään sosiaalihuollon asiakkaan asemasta ja oikeuksista annetun lain 7 §:</w:t>
+      </w:r>
+      <w:proofErr w:type="spellStart"/>
+      <w:r>
+        <w:rPr>
+          <w:rFonts w:eastAsia="Arial" w:cs="Arial"/>
+          <w:sz w:val="24"/>
+          <w:szCs w:val="24"/>
+        </w:rPr>
+        <w:t>ssä</w:t>
+      </w:r>
+      <w:proofErr w:type="spellEnd"/>
+      <w:r>
+        <w:rPr>
+          <w:rFonts w:eastAsia="Arial" w:cs="Arial"/>
+          <w:sz w:val="24"/>
+          <w:szCs w:val="24"/>
+        </w:rPr>
+        <w:t xml:space="preserve">. Hoidon ja palvelun tarve kirjataan asiakkaan henkilökohtaiseen, kuntoutussuunnitelmaan, jota päivitetään säännöllisesti. Suunnitelman tavoitteena on auttaa asiakasta saavuttamaan kuntoutumiselle asetetut tavoitteet.  Kuntoutussuunnitelmaa arvioidaan </w:t>
+      </w:r>
+      <w:r>
+        <w:rPr>
+          <w:rFonts w:eastAsia="Arial" w:cs="Arial"/>
+          <w:sz w:val="24"/>
+          <w:szCs w:val="24"/>
+        </w:rPr>
+        <w:lastRenderedPageBreak/>
+        <w:t>yhdessä asukkaan ja tarvittaessa hänen omaisensa, läheisensä/laillisen edustajansa kanssa yhteistyössä tilaajan kanssa. Suunnitelman lähtökohtana on asiakkaan oma näkemys voimavaroistaan ja niiden vahvistamisesta. Kuntoutussuunnitelma toimii asukkaan ja työntekijän työkaluna arjessa.</w:t>
+      </w:r>
+    </w:p>
+    <w:p>
+      <w:pPr>
+        <w:spacing w:after="0" w:line="360" w:lineRule="auto"/>
+        <w:rPr>
+          <w:rFonts w:eastAsia="Arial" w:cs="Arial"/>
+          <w:sz w:val="24"/>
+          <w:szCs w:val="24"/>
+        </w:rPr>
+      </w:pPr>
+    </w:p>
+    <w:p>
+      <w:pPr>
+        <w:spacing w:after="0" w:line="360" w:lineRule="auto"/>
+        <w:rPr>
+          <w:rFonts w:eastAsia="Arial" w:cs="Arial"/>
+          <w:sz w:val="24"/>
+          <w:szCs w:val="24"/>
+        </w:rPr>
+      </w:pPr>
+      <w:r>
+        <w:rPr>
+          <w:rFonts w:eastAsia="Arial" w:cs="Arial"/>
+          <w:sz w:val="24"/>
+          <w:szCs w:val="24"/>
+        </w:rPr>
+        <w:t>Asiakas osallistuu päätöksentekoon itseään koskevissa. Asiakas arvioi itse omaa toimintakykyään ja asettaa omia tavoitteita kuntoutumiselleen, etsii keinoja tavoitteiden</w:t>
+      </w:r>
+    </w:p>
+    <w:p>
+      <w:pPr>
+        <w:spacing w:after="0" w:line="360" w:lineRule="auto"/>
+        <w:rPr>
+          <w:rFonts w:eastAsia="Arial" w:cs="Arial"/>
+          <w:sz w:val="24"/>
+          <w:szCs w:val="24"/>
+        </w:rPr>
+      </w:pPr>
+      <w:r>
+        <w:rPr>
+          <w:rFonts w:eastAsia="Arial" w:cs="Arial"/>
+          <w:sz w:val="24"/>
+          <w:szCs w:val="24"/>
+        </w:rPr>
+        <w:t>saavuttamiseksi ja arvioi etenemistään tavoitteiden mukaan. Näitä keskusteluja käydään omaohjaajan kanssa viikoittain, asukaspalavereissa tilaajan kanssa sekä tarvittaessa muulloinkin. Suunnitelman pohjalta jokaiselle asiakkaalle laaditaan henkilökohtainen viikkosuunnitelma. Suunnitelma sisältää omaohjaaja keskustelut, vähintään kaksi päihde/vertaistukiryhmää sekä harrasteryhmiä ja omia henkilökohtaisia tekemisiä esim. kauppa- ja asiointikäyntejä, siivousta, pyykinpesua ja saunomisen.</w:t>
+      </w:r>
+    </w:p>
+    <w:p>
+      <w:pPr>
+        <w:spacing w:after="0" w:line="360" w:lineRule="auto"/>
+        <w:rPr>
+          <w:rFonts w:eastAsia="Arial" w:cs="Arial"/>
+          <w:sz w:val="24"/>
+          <w:szCs w:val="24"/>
+        </w:rPr>
+      </w:pPr>
+    </w:p>
+    <w:p>
+      <w:pPr>
+        <w:spacing w:after="0" w:line="360" w:lineRule="auto"/>
+        <w:rPr>
+          <w:rFonts w:eastAsia="Arial" w:cs="Arial"/>
+          <w:sz w:val="24"/>
+          <w:szCs w:val="24"/>
+        </w:rPr>
+      </w:pPr>
+      <w:r>
+        <w:rPr>
+          <w:rFonts w:eastAsia="Arial" w:cs="Arial"/>
+          <w:sz w:val="24"/>
+          <w:szCs w:val="24"/>
+        </w:rPr>
+        <w:t>Asiakkaan saapumisesta kuukauden kuluessa asiakkaan kanssa tehdään kuntoutussuunnitelma. Mahdollisuuksien mukaan järjestetään myös verkostotapaaminen, johon osallistuvat asiakas, omaohjaaja, yksikönvastaava ja hyvinvointialueen edustaja. Omaohjaaja tekee kuntoutussuunnitelman kokouksen muistiinpanojen pohjalta sähköiseen asiakastietojärjestelmään Hilkkaan.</w:t>
+      </w:r>
+    </w:p>
+    <w:p>
+      <w:pPr>
+        <w:spacing w:after="0" w:line="360" w:lineRule="auto"/>
+        <w:rPr>
+          <w:rFonts w:eastAsia="Arial" w:cs="Arial"/>
+          <w:sz w:val="24"/>
+          <w:szCs w:val="24"/>
+        </w:rPr>
+      </w:pPr>
+    </w:p>
+    <w:p>
+      <w:pPr>
+        <w:spacing w:after="0" w:line="360" w:lineRule="auto"/>
+        <w:rPr>
+          <w:rFonts w:eastAsia="Arial" w:cs="Arial"/>
+          <w:sz w:val="24"/>
+          <w:szCs w:val="24"/>
+        </w:rPr>
+      </w:pPr>
+      <w:r>
+        <w:rPr>
+          <w:rFonts w:eastAsia="Arial" w:cs="Arial"/>
+          <w:sz w:val="24"/>
+          <w:szCs w:val="24"/>
+        </w:rPr>
+        <w:t>Suunnitelma sisältää lähtötilanteen kartoituksen, kuntoutuksen tavoitteet, keinot, mittarit ja arvioinnin. Kuntoutussuunnitelman päivitys tapahtuu sopimuksen mukaisesti, kuitenkin</w:t>
+      </w:r>
+    </w:p>
+    <w:p>
+      <w:pPr>
+        <w:spacing w:after="0" w:line="360" w:lineRule="auto"/>
+        <w:rPr>
+          <w:rFonts w:eastAsia="Arial" w:cs="Arial"/>
+          <w:sz w:val="24"/>
+          <w:szCs w:val="24"/>
+        </w:rPr>
+      </w:pPr>
+      <w:r>
+        <w:rPr>
+          <w:rFonts w:eastAsia="Arial" w:cs="Arial"/>
+          <w:sz w:val="24"/>
+          <w:szCs w:val="24"/>
+        </w:rPr>
+        <w:t>vähintään kaksi kertaa vuodessa ja/tai tarvittaessa. Kuntoutussuunnitelmaa arvioidaan kuukausittain. Asiakkaan vointia arvioidaan jatkuvasti ja keskustellaan havainnoista työyhteisön kesken. Hilkka asiakastietojärjestelmään kirjataan kaikki päivittäiset havainnot.</w:t>
+      </w:r>
+    </w:p>
+    <w:p>
+      <w:pPr>
+        <w:spacing w:after="0" w:line="360" w:lineRule="auto"/>
+        <w:rPr>
+          <w:rFonts w:eastAsia="Arial" w:cs="Arial"/>
+          <w:sz w:val="24"/>
+          <w:szCs w:val="24"/>
+        </w:rPr>
+      </w:pPr>
+    </w:p>
+    <w:p>
+      <w:pPr>
+        <w:spacing w:after="0" w:line="360" w:lineRule="auto"/>
         <w:rPr>
           <w:rFonts w:eastAsia="Arial" w:cs="Arial"/>
           <w:b/>
@@ -14064,12 +14471,8 @@
           <w:sz w:val="24"/>
           <w:szCs w:val="24"/>
         </w:rPr>
-        <w:t>Asiakkaan kohtelu</w:t>
-      </w:r>
-    </w:p>
-    <w:p>
-      <w:pPr>
-        <w:spacing w:after="0" w:line="360" w:lineRule="auto"/>
+      </w:pPr>
+      <w:r>
         <w:rPr>
           <w:rFonts w:eastAsia="Arial" w:cs="Arial"/>
           <w:b/>
@@ -14077,36 +14480,8 @@
           <w:sz w:val="24"/>
           <w:szCs w:val="24"/>
         </w:rPr>
-      </w:pPr>
-    </w:p>
-    <w:p>
-      <w:pPr>
-        <w:spacing w:after="0" w:line="360" w:lineRule="auto"/>
-        <w:rPr>
-          <w:rFonts w:cs="Arial"/>
-          <w:sz w:val="24"/>
-          <w:szCs w:val="24"/>
-        </w:rPr>
-      </w:pPr>
-      <w:r>
-        <w:rPr>
-          <w:rFonts w:eastAsia="Arial" w:cs="Arial"/>
-          <w:sz w:val="24"/>
-          <w:szCs w:val="24"/>
-        </w:rPr>
-        <w:lastRenderedPageBreak/>
-        <w:t>Sosiaalihuollon asiakkaalla on oikeus laadultaan hyvään sosiaalihuoltoon ja hyvään kohteluun ilman syrjintää. Asiakasta on kohdeltava kunnioittaen hänen ihmisarvoaan, vakaumustaan ja yksityisyyttään.</w:t>
-      </w:r>
-    </w:p>
-    <w:p>
-      <w:pPr>
-        <w:spacing w:after="0" w:line="360" w:lineRule="auto"/>
-        <w:rPr>
-          <w:rFonts w:eastAsia="Arial" w:cs="Arial"/>
-          <w:sz w:val="24"/>
-          <w:szCs w:val="24"/>
-        </w:rPr>
-      </w:pPr>
+        <w:t>Asiakkaan kohtelu</w:t>
+      </w:r>
     </w:p>
     <w:p>
       <w:pPr>
@@ -14119,7 +14494,38 @@
           <w:szCs w:val="24"/>
         </w:rPr>
       </w:pPr>
-      <w:r>
+    </w:p>
+    <w:p>
+      <w:pPr>
+        <w:spacing w:after="0" w:line="360" w:lineRule="auto"/>
+        <w:rPr>
+          <w:rFonts w:cs="Arial"/>
+          <w:sz w:val="24"/>
+          <w:szCs w:val="24"/>
+        </w:rPr>
+      </w:pPr>
+      <w:r>
+        <w:rPr>
+          <w:rFonts w:eastAsia="Arial" w:cs="Arial"/>
+          <w:sz w:val="24"/>
+          <w:szCs w:val="24"/>
+        </w:rPr>
+        <w:t>Sosiaalihuollon asiakkaalla on oikeus laadultaan hyvään sosiaalihuoltoon ja hyvään kohteluun ilman syrjintää. Asiakasta on kohdeltava kunnioittaen hänen ihmisarvoaan, vakaumustaan ja yksityisyyttään.</w:t>
+      </w:r>
+    </w:p>
+    <w:p>
+      <w:pPr>
+        <w:spacing w:after="0" w:line="360" w:lineRule="auto"/>
+        <w:rPr>
+          <w:rFonts w:eastAsia="Arial" w:cs="Arial"/>
+          <w:sz w:val="24"/>
+          <w:szCs w:val="24"/>
+        </w:rPr>
+      </w:pPr>
+    </w:p>
+    <w:p>
+      <w:pPr>
+        <w:spacing w:after="0" w:line="360" w:lineRule="auto"/>
         <w:rPr>
           <w:rFonts w:eastAsia="Arial" w:cs="Arial"/>
           <w:b/>
@@ -14127,6 +14533,16 @@
           <w:sz w:val="24"/>
           <w:szCs w:val="24"/>
         </w:rPr>
+      </w:pPr>
+      <w:r>
+        <w:rPr>
+          <w:rFonts w:eastAsia="Arial" w:cs="Arial"/>
+          <w:b/>
+          <w:bCs/>
+          <w:sz w:val="24"/>
+          <w:szCs w:val="24"/>
+        </w:rPr>
+        <w:lastRenderedPageBreak/>
         <w:t>Itsemääräämisoikeuden varmistaminen</w:t>
       </w:r>
     </w:p>
@@ -14403,7 +14819,6 @@
           <w:sz w:val="24"/>
           <w:szCs w:val="24"/>
         </w:rPr>
-        <w:lastRenderedPageBreak/>
         <w:t xml:space="preserve">Rajoittamistoimenpiteissä noudatamme </w:t>
       </w:r>
       <w:proofErr w:type="spellStart"/>
@@ -14468,250 +14883,9 @@
           <w:sz w:val="24"/>
           <w:szCs w:val="24"/>
         </w:rPr>
-        <w:t>Valviran ohjeen mukaisesti yksikössä noudatetaan seuraavia toimintatapoja:</w:t>
-      </w:r>
-    </w:p>
-    <w:p>
-      <w:pPr>
-        <w:spacing w:after="0" w:line="360" w:lineRule="auto"/>
-        <w:rPr>
-          <w:rFonts w:eastAsia="Arial" w:cs="Arial"/>
-          <w:sz w:val="24"/>
-          <w:szCs w:val="24"/>
-        </w:rPr>
-      </w:pPr>
-      <w:r>
-        <w:rPr>
-          <w:rFonts w:eastAsia="Arial" w:cs="Arial"/>
-          <w:sz w:val="24"/>
-          <w:szCs w:val="24"/>
-        </w:rPr>
-        <w:t>Minkäänlaisia pakkokeinoja ei käytetä. Asukkaiden fyysistä koskemattomuutta kunnioitetaan</w:t>
-      </w:r>
-    </w:p>
-    <w:p>
-      <w:pPr>
-        <w:spacing w:after="0" w:line="360" w:lineRule="auto"/>
-        <w:rPr>
-          <w:rFonts w:eastAsia="Arial" w:cs="Arial"/>
-          <w:sz w:val="24"/>
-          <w:szCs w:val="24"/>
-        </w:rPr>
-      </w:pPr>
-      <w:r>
-        <w:rPr>
-          <w:rFonts w:eastAsia="Arial" w:cs="Arial"/>
-          <w:sz w:val="24"/>
-          <w:szCs w:val="24"/>
-        </w:rPr>
-        <w:t>aina henkilökunnan taholta. Asuminen perustuu vapaaehtoisuuteen.</w:t>
-      </w:r>
-    </w:p>
-    <w:p>
-      <w:pPr>
-        <w:spacing w:after="0" w:line="360" w:lineRule="auto"/>
-        <w:rPr>
-          <w:rFonts w:eastAsia="Arial" w:cs="Arial"/>
-          <w:sz w:val="24"/>
-          <w:szCs w:val="24"/>
-        </w:rPr>
-      </w:pPr>
-      <w:proofErr w:type="spellStart"/>
-      <w:r>
-        <w:rPr>
-          <w:rFonts w:eastAsia="Arial" w:cs="Arial"/>
-          <w:sz w:val="24"/>
-          <w:szCs w:val="24"/>
-        </w:rPr>
-        <w:t>Kan</w:t>
-      </w:r>
-      <w:proofErr w:type="spellEnd"/>
-      <w:r>
-        <w:rPr>
-          <w:rFonts w:eastAsia="Arial" w:cs="Arial"/>
-          <w:sz w:val="24"/>
-          <w:szCs w:val="24"/>
-        </w:rPr>
-        <w:t>-kodin ovet ovat suljettuna asukkaiden turvallisuuden takaamiseksi. Asukkailla on avaimet omaan asuntoonsa. Yhteiset tilat ovat auki ohjaajien työaikana sekä vapaaehtoisen tai asukaspäivystäjän läsnäolleessa. Alue on päihteetön.</w:t>
-      </w:r>
-    </w:p>
-    <w:p>
-      <w:pPr>
-        <w:spacing w:after="0" w:line="360" w:lineRule="auto"/>
-        <w:rPr>
-          <w:rFonts w:eastAsia="Arial" w:cs="Arial"/>
-          <w:sz w:val="24"/>
-          <w:szCs w:val="24"/>
-        </w:rPr>
-      </w:pPr>
-    </w:p>
-    <w:p>
-      <w:pPr>
-        <w:spacing w:after="0" w:line="360" w:lineRule="auto"/>
-        <w:rPr>
-          <w:rFonts w:eastAsia="Arial" w:cs="Arial"/>
-          <w:sz w:val="24"/>
-          <w:szCs w:val="24"/>
-        </w:rPr>
-      </w:pPr>
-      <w:r>
-        <w:rPr>
-          <w:rFonts w:eastAsia="Arial" w:cs="Arial"/>
-          <w:sz w:val="24"/>
-          <w:szCs w:val="24"/>
-        </w:rPr>
-        <w:t>Asiakas osallistuu kaikkeen häntä koskevaan päätöksentekoon. Asiakas on mukana kuntoutussuunnitelman laadinnassa ja päivityksessä ja ensisijaisesti hänen omat tavoitteensa ohjaavat suunnitelmaa. Asiakkaalla on omaohjaaja, joka tuntee asiakkaan parhaiten ja auttaa asiakasta hänen asioissaan.</w:t>
-      </w:r>
-    </w:p>
-    <w:p>
-      <w:pPr>
-        <w:spacing w:after="0" w:line="360" w:lineRule="auto"/>
-        <w:rPr>
-          <w:rFonts w:eastAsia="Arial" w:cs="Arial"/>
-          <w:sz w:val="24"/>
-          <w:szCs w:val="24"/>
-        </w:rPr>
-      </w:pPr>
-      <w:r>
-        <w:rPr>
-          <w:rFonts w:eastAsia="Arial" w:cs="Arial"/>
-          <w:sz w:val="24"/>
-          <w:szCs w:val="24"/>
-        </w:rPr>
-        <w:t xml:space="preserve">Asiakas saa osallistua kaikkiin </w:t>
-      </w:r>
-      <w:proofErr w:type="spellStart"/>
-      <w:r>
-        <w:rPr>
-          <w:rFonts w:eastAsia="Arial" w:cs="Arial"/>
-          <w:sz w:val="24"/>
-          <w:szCs w:val="24"/>
-        </w:rPr>
-        <w:t>Kan</w:t>
-      </w:r>
-      <w:proofErr w:type="spellEnd"/>
-      <w:r>
-        <w:rPr>
-          <w:rFonts w:eastAsia="Arial" w:cs="Arial"/>
-          <w:sz w:val="24"/>
-          <w:szCs w:val="24"/>
-        </w:rPr>
-        <w:t xml:space="preserve">-kodin tilaisuuksiin. Uuden asiakkaan kanssa käydään läpi kodin järjestyssäännöt ja viikko-ohjelma sekä kerrotaan, miten </w:t>
-      </w:r>
-      <w:proofErr w:type="spellStart"/>
-      <w:r>
-        <w:rPr>
-          <w:rFonts w:eastAsia="Arial" w:cs="Arial"/>
-          <w:sz w:val="24"/>
-          <w:szCs w:val="24"/>
-        </w:rPr>
-        <w:t>Kan</w:t>
-      </w:r>
-      <w:proofErr w:type="spellEnd"/>
-      <w:r>
-        <w:rPr>
-          <w:rFonts w:eastAsia="Arial" w:cs="Arial"/>
-          <w:sz w:val="24"/>
-          <w:szCs w:val="24"/>
-        </w:rPr>
-        <w:t>-kodissa on tapana toimia.</w:t>
-      </w:r>
-    </w:p>
-    <w:p>
-      <w:pPr>
-        <w:spacing w:after="0" w:line="360" w:lineRule="auto"/>
-        <w:rPr>
-          <w:rFonts w:eastAsia="Arial" w:cs="Arial"/>
-          <w:sz w:val="24"/>
-          <w:szCs w:val="24"/>
-        </w:rPr>
-      </w:pPr>
-    </w:p>
-    <w:p>
-      <w:pPr>
-        <w:spacing w:after="0" w:line="360" w:lineRule="auto"/>
-        <w:rPr>
-          <w:rFonts w:eastAsia="Arial" w:cs="Arial"/>
-          <w:sz w:val="24"/>
-          <w:szCs w:val="24"/>
-        </w:rPr>
-      </w:pPr>
-      <w:proofErr w:type="spellStart"/>
-      <w:r>
-        <w:rPr>
-          <w:rFonts w:eastAsia="Arial" w:cs="Arial"/>
-          <w:sz w:val="24"/>
-          <w:szCs w:val="24"/>
-        </w:rPr>
-        <w:t>Kan</w:t>
-      </w:r>
-      <w:proofErr w:type="spellEnd"/>
-      <w:r>
-        <w:rPr>
-          <w:rFonts w:eastAsia="Arial" w:cs="Arial"/>
-          <w:sz w:val="24"/>
-          <w:szCs w:val="24"/>
-        </w:rPr>
-        <w:t xml:space="preserve">-kodeilla on käytössä lomake yksikön säännöistä ja asiakkaan sitoutumisesta kuntoutukseen ja asumiseen. Lomakkeella kerrotaan </w:t>
-      </w:r>
-      <w:proofErr w:type="spellStart"/>
-      <w:r>
-        <w:rPr>
-          <w:rFonts w:eastAsia="Arial" w:cs="Arial"/>
-          <w:sz w:val="24"/>
-          <w:szCs w:val="24"/>
-        </w:rPr>
-        <w:t>Kan</w:t>
-      </w:r>
-      <w:proofErr w:type="spellEnd"/>
-      <w:r>
-        <w:rPr>
-          <w:rFonts w:eastAsia="Arial" w:cs="Arial"/>
-          <w:sz w:val="24"/>
-          <w:szCs w:val="24"/>
-        </w:rPr>
-        <w:t xml:space="preserve">-kodin säännöt sekä toimintatavat. Asiakas sitoutuu lomakkeella noudattamaan yksikön yleisiä sääntöjä. Asiakkaat voivat käyttää yksikön puhelinta tarvittaessa yhteydenpitoon läheisiä tai verkostoja varten. Vierailuja ei ole rajoitettu. </w:t>
-      </w:r>
-      <w:proofErr w:type="spellStart"/>
-      <w:r>
-        <w:rPr>
-          <w:rFonts w:eastAsia="Arial" w:cs="Arial"/>
-          <w:sz w:val="24"/>
-          <w:szCs w:val="24"/>
-        </w:rPr>
-        <w:t>Kan</w:t>
-      </w:r>
-      <w:proofErr w:type="spellEnd"/>
-      <w:r>
-        <w:rPr>
-          <w:rFonts w:eastAsia="Arial" w:cs="Arial"/>
-          <w:sz w:val="24"/>
-          <w:szCs w:val="24"/>
-        </w:rPr>
-        <w:t>-kodin viikko-ohjelma on selkeästi asiakkaiden tiedossa ja sitä noudatetaan yhteisestä sopimuksesta. Viikko-ohjelma laaditaan yhdessä asiakkaide</w:t>
-      </w:r>
-      <w:r>
-        <w:rPr>
-          <w:rFonts w:eastAsia="Arial" w:cs="Arial"/>
-          <w:sz w:val="24"/>
-          <w:szCs w:val="24"/>
-        </w:rPr>
-        <w:t>n kanssa.</w:t>
-      </w:r>
-    </w:p>
-    <w:p>
-      <w:pPr>
-        <w:spacing w:after="0" w:line="360" w:lineRule="auto"/>
-        <w:rPr>
-          <w:rFonts w:eastAsia="Arial" w:cs="Arial"/>
-          <w:sz w:val="24"/>
-          <w:szCs w:val="24"/>
-        </w:rPr>
-      </w:pPr>
-    </w:p>
-    <w:p>
-      <w:pPr>
-        <w:spacing w:after="0" w:line="360" w:lineRule="auto"/>
+        <w:t>Lupa- ja valvontaviraston</w:t>
+      </w:r>
+      <w:r>
         <w:rPr>
           <w:rFonts w:eastAsia="Arial" w:cs="Arial"/>
           <w:b/>
@@ -14719,8 +14893,251 @@
           <w:sz w:val="24"/>
           <w:szCs w:val="24"/>
         </w:rPr>
-      </w:pPr>
-      <w:r>
+        <w:t xml:space="preserve"> </w:t>
+      </w:r>
+      <w:r>
+        <w:rPr>
+          <w:rFonts w:eastAsia="Arial" w:cs="Arial"/>
+          <w:sz w:val="24"/>
+          <w:szCs w:val="24"/>
+        </w:rPr>
+        <w:t>ohjeen mukaisesti yksikössä noudatetaan seuraavia toimintatapoja:</w:t>
+      </w:r>
+    </w:p>
+    <w:p>
+      <w:pPr>
+        <w:spacing w:after="0" w:line="360" w:lineRule="auto"/>
+        <w:rPr>
+          <w:rFonts w:eastAsia="Arial" w:cs="Arial"/>
+          <w:sz w:val="24"/>
+          <w:szCs w:val="24"/>
+        </w:rPr>
+      </w:pPr>
+      <w:r>
+        <w:rPr>
+          <w:rFonts w:eastAsia="Arial" w:cs="Arial"/>
+          <w:sz w:val="24"/>
+          <w:szCs w:val="24"/>
+        </w:rPr>
+        <w:lastRenderedPageBreak/>
+        <w:t>Minkäänlaisia pakkokeinoja ei käytetä. Asukkaiden fyysistä koskemattomuutta kunnioitetaan</w:t>
+      </w:r>
+    </w:p>
+    <w:p>
+      <w:pPr>
+        <w:spacing w:after="0" w:line="360" w:lineRule="auto"/>
+        <w:rPr>
+          <w:rFonts w:eastAsia="Arial" w:cs="Arial"/>
+          <w:sz w:val="24"/>
+          <w:szCs w:val="24"/>
+        </w:rPr>
+      </w:pPr>
+      <w:r>
+        <w:rPr>
+          <w:rFonts w:eastAsia="Arial" w:cs="Arial"/>
+          <w:sz w:val="24"/>
+          <w:szCs w:val="24"/>
+        </w:rPr>
+        <w:t>aina henkilökunnan taholta. Asuminen perustuu vapaaehtoisuuteen.</w:t>
+      </w:r>
+    </w:p>
+    <w:p>
+      <w:pPr>
+        <w:spacing w:after="0" w:line="360" w:lineRule="auto"/>
+        <w:rPr>
+          <w:rFonts w:eastAsia="Arial" w:cs="Arial"/>
+          <w:sz w:val="24"/>
+          <w:szCs w:val="24"/>
+        </w:rPr>
+      </w:pPr>
+      <w:proofErr w:type="spellStart"/>
+      <w:r>
+        <w:rPr>
+          <w:rFonts w:eastAsia="Arial" w:cs="Arial"/>
+          <w:sz w:val="24"/>
+          <w:szCs w:val="24"/>
+        </w:rPr>
+        <w:t>Kan</w:t>
+      </w:r>
+      <w:proofErr w:type="spellEnd"/>
+      <w:r>
+        <w:rPr>
+          <w:rFonts w:eastAsia="Arial" w:cs="Arial"/>
+          <w:sz w:val="24"/>
+          <w:szCs w:val="24"/>
+        </w:rPr>
+        <w:t>-kodin ovet ovat suljettuna asukkaiden turvallisuuden takaamiseksi. Asukkailla on avaimet omaan asuntoonsa. Yhteiset tilat ovat auki ohjaajien työaikana sekä vapaaehtoisen tai asukaspäivystäjän läsnäolleessa. Alue on päihteetön.</w:t>
+      </w:r>
+    </w:p>
+    <w:p>
+      <w:pPr>
+        <w:spacing w:after="0" w:line="360" w:lineRule="auto"/>
+        <w:rPr>
+          <w:rFonts w:eastAsia="Arial" w:cs="Arial"/>
+          <w:sz w:val="24"/>
+          <w:szCs w:val="24"/>
+        </w:rPr>
+      </w:pPr>
+    </w:p>
+    <w:p>
+      <w:pPr>
+        <w:spacing w:after="0" w:line="360" w:lineRule="auto"/>
+        <w:rPr>
+          <w:rFonts w:eastAsia="Arial" w:cs="Arial"/>
+          <w:sz w:val="24"/>
+          <w:szCs w:val="24"/>
+        </w:rPr>
+      </w:pPr>
+      <w:r>
+        <w:rPr>
+          <w:rFonts w:eastAsia="Arial" w:cs="Arial"/>
+          <w:sz w:val="24"/>
+          <w:szCs w:val="24"/>
+        </w:rPr>
+        <w:t>Asiakas osallistuu kaikkeen häntä koskevaan päätöksentekoon. Asiakas on mukana kuntoutussuunnitelman laadinnassa ja päivityksessä ja ensisijaisesti hänen omat tavoitteensa ohjaavat suunnitelmaa. Asiakkaalla on omaohjaaja, joka tuntee asiakkaan parhaiten ja auttaa asiakasta hänen asioissaan.</w:t>
+      </w:r>
+    </w:p>
+    <w:p>
+      <w:pPr>
+        <w:spacing w:after="0" w:line="360" w:lineRule="auto"/>
+        <w:rPr>
+          <w:rFonts w:eastAsia="Arial" w:cs="Arial"/>
+          <w:sz w:val="24"/>
+          <w:szCs w:val="24"/>
+        </w:rPr>
+      </w:pPr>
+      <w:r>
+        <w:rPr>
+          <w:rFonts w:eastAsia="Arial" w:cs="Arial"/>
+          <w:sz w:val="24"/>
+          <w:szCs w:val="24"/>
+        </w:rPr>
+        <w:t xml:space="preserve">Asiakas saa osallistua kaikkiin </w:t>
+      </w:r>
+      <w:proofErr w:type="spellStart"/>
+      <w:r>
+        <w:rPr>
+          <w:rFonts w:eastAsia="Arial" w:cs="Arial"/>
+          <w:sz w:val="24"/>
+          <w:szCs w:val="24"/>
+        </w:rPr>
+        <w:t>Kan</w:t>
+      </w:r>
+      <w:proofErr w:type="spellEnd"/>
+      <w:r>
+        <w:rPr>
+          <w:rFonts w:eastAsia="Arial" w:cs="Arial"/>
+          <w:sz w:val="24"/>
+          <w:szCs w:val="24"/>
+        </w:rPr>
+        <w:t xml:space="preserve">-kodin tilaisuuksiin. Uuden asiakkaan kanssa käydään läpi kodin järjestyssäännöt ja viikko-ohjelma sekä kerrotaan, miten </w:t>
+      </w:r>
+      <w:proofErr w:type="spellStart"/>
+      <w:r>
+        <w:rPr>
+          <w:rFonts w:eastAsia="Arial" w:cs="Arial"/>
+          <w:sz w:val="24"/>
+          <w:szCs w:val="24"/>
+        </w:rPr>
+        <w:t>Kan</w:t>
+      </w:r>
+      <w:proofErr w:type="spellEnd"/>
+      <w:r>
+        <w:rPr>
+          <w:rFonts w:eastAsia="Arial" w:cs="Arial"/>
+          <w:sz w:val="24"/>
+          <w:szCs w:val="24"/>
+        </w:rPr>
+        <w:t>-kodissa on tapana toimia.</w:t>
+      </w:r>
+    </w:p>
+    <w:p>
+      <w:pPr>
+        <w:spacing w:after="0" w:line="360" w:lineRule="auto"/>
+        <w:rPr>
+          <w:rFonts w:eastAsia="Arial" w:cs="Arial"/>
+          <w:sz w:val="24"/>
+          <w:szCs w:val="24"/>
+        </w:rPr>
+      </w:pPr>
+    </w:p>
+    <w:p>
+      <w:pPr>
+        <w:spacing w:after="0" w:line="360" w:lineRule="auto"/>
+        <w:rPr>
+          <w:rFonts w:eastAsia="Arial" w:cs="Arial"/>
+          <w:sz w:val="24"/>
+          <w:szCs w:val="24"/>
+        </w:rPr>
+      </w:pPr>
+      <w:proofErr w:type="spellStart"/>
+      <w:r>
+        <w:rPr>
+          <w:rFonts w:eastAsia="Arial" w:cs="Arial"/>
+          <w:sz w:val="24"/>
+          <w:szCs w:val="24"/>
+        </w:rPr>
+        <w:t>Kan</w:t>
+      </w:r>
+      <w:proofErr w:type="spellEnd"/>
+      <w:r>
+        <w:rPr>
+          <w:rFonts w:eastAsia="Arial" w:cs="Arial"/>
+          <w:sz w:val="24"/>
+          <w:szCs w:val="24"/>
+        </w:rPr>
+        <w:t xml:space="preserve">-kodeilla on käytössä lomake yksikön säännöistä ja asiakkaan sitoutumisesta kuntoutukseen ja asumiseen. Lomakkeella kerrotaan </w:t>
+      </w:r>
+      <w:proofErr w:type="spellStart"/>
+      <w:r>
+        <w:rPr>
+          <w:rFonts w:eastAsia="Arial" w:cs="Arial"/>
+          <w:sz w:val="24"/>
+          <w:szCs w:val="24"/>
+        </w:rPr>
+        <w:t>Kan</w:t>
+      </w:r>
+      <w:proofErr w:type="spellEnd"/>
+      <w:r>
+        <w:rPr>
+          <w:rFonts w:eastAsia="Arial" w:cs="Arial"/>
+          <w:sz w:val="24"/>
+          <w:szCs w:val="24"/>
+        </w:rPr>
+        <w:t xml:space="preserve">-kodin säännöt sekä toimintatavat. Asiakas sitoutuu lomakkeella noudattamaan yksikön yleisiä sääntöjä. Asiakkaat voivat käyttää yksikön puhelinta tarvittaessa yhteydenpitoon läheisiä tai verkostoja varten. Vierailuja ei ole rajoitettu. </w:t>
+      </w:r>
+      <w:proofErr w:type="spellStart"/>
+      <w:r>
+        <w:rPr>
+          <w:rFonts w:eastAsia="Arial" w:cs="Arial"/>
+          <w:sz w:val="24"/>
+          <w:szCs w:val="24"/>
+        </w:rPr>
+        <w:t>Kan</w:t>
+      </w:r>
+      <w:proofErr w:type="spellEnd"/>
+      <w:r>
+        <w:rPr>
+          <w:rFonts w:eastAsia="Arial" w:cs="Arial"/>
+          <w:sz w:val="24"/>
+          <w:szCs w:val="24"/>
+        </w:rPr>
+        <w:t>-kodin viikko-ohjelma on selkeästi asiakkaiden tiedossa ja sitä noudatetaan yhteisestä sopimuksesta. Viikko-ohjelma laaditaan yhdessä asiakkaiden kanssa.</w:t>
+      </w:r>
+    </w:p>
+    <w:p>
+      <w:pPr>
+        <w:spacing w:after="0" w:line="360" w:lineRule="auto"/>
+        <w:rPr>
+          <w:rFonts w:eastAsia="Arial" w:cs="Arial"/>
+          <w:sz w:val="24"/>
+          <w:szCs w:val="24"/>
+        </w:rPr>
+      </w:pPr>
+    </w:p>
+    <w:p>
+      <w:pPr>
+        <w:spacing w:after="0" w:line="360" w:lineRule="auto"/>
         <w:rPr>
           <w:rFonts w:eastAsia="Arial" w:cs="Arial"/>
           <w:b/>
@@ -14728,6 +15145,15 @@
           <w:sz w:val="24"/>
           <w:szCs w:val="24"/>
         </w:rPr>
+      </w:pPr>
+      <w:r>
+        <w:rPr>
+          <w:rFonts w:eastAsia="Arial" w:cs="Arial"/>
+          <w:b/>
+          <w:bCs/>
+          <w:sz w:val="24"/>
+          <w:szCs w:val="24"/>
+        </w:rPr>
         <w:t>Asiakkaan asiallinen kohtelu</w:t>
       </w:r>
     </w:p>
@@ -14838,7 +15264,6 @@
           <w:sz w:val="24"/>
           <w:szCs w:val="24"/>
         </w:rPr>
-        <w:lastRenderedPageBreak/>
         <w:t>Miten varmistetaan asiakkaiden asiallinen kohtelu ja miten menetellään, jos epäasiallista kohtelua havaitaan?</w:t>
       </w:r>
     </w:p>
@@ -14889,6 +15314,7 @@
           <w:sz w:val="24"/>
           <w:szCs w:val="24"/>
         </w:rPr>
+        <w:lastRenderedPageBreak/>
         <w:t>Jos potilas tai sosiaalihuollon asiakas ei ole tyytyväinen saamaansa palveluun, hoitoon tai kohteluun, hän voi</w:t>
       </w:r>
     </w:p>
@@ -14964,7 +15390,23 @@
           <w:sz w:val="24"/>
           <w:szCs w:val="24"/>
         </w:rPr>
-        <w:t>tehdä kantelun valvovalle viranomaiselle: ensisijaisesti oman alueen aluehallintovirastoon tai Sosiaali- ja terveydenhuollon lupa- ja valvontavirastoon (Valvira).</w:t>
+        <w:t>tehdä kantelun valvovalle viranomaiselle: ensisijaisesti oman alueen aluehallintovirastoon tai Sosiaali- ja terveydenhuollon lupa- ja valvontavirastoon (</w:t>
+      </w:r>
+      <w:r>
+        <w:rPr>
+          <w:rFonts w:eastAsia="Arial" w:cs="Arial"/>
+          <w:sz w:val="24"/>
+          <w:szCs w:val="24"/>
+        </w:rPr>
+        <w:t>Lupa- ja valvontavirasto</w:t>
+      </w:r>
+      <w:r>
+        <w:rPr>
+          <w:rFonts w:eastAsia="Arial" w:cs="Arial"/>
+          <w:sz w:val="24"/>
+          <w:szCs w:val="24"/>
+        </w:rPr>
+        <w:t>).</w:t>
       </w:r>
     </w:p>
     <w:p>
@@ -15029,7 +15471,39 @@
           <w:sz w:val="24"/>
           <w:szCs w:val="24"/>
         </w:rPr>
-        <w:t xml:space="preserve"> ry:n toiminnanjohtajalle tai johtavalle viranhaltijalle, mikäli hän on tyytymätön kohteluunsa. Velvollisuutemme on myös ohjata ja neuvoa ilmoituksen tekemisessä sosiaaliasiamiehelle. Sosiaaliasiamiehen yhteystiedot löytyvät yksikön ilmoitustaululta. Palvelun perustuessa ostosopimukseen muistutus tehdään järjestämisvastuussa olevalle viranomaiselle.</w:t>
+        <w:t xml:space="preserve"> ry:n toiminnanjohtajalle tai johtavalle viranhaltijalle, mikäli hän on tyytymätön kohteluunsa. Velvollisuutemme on myös ohjata ja neuvoa ilmoituksen tekemisessä sosiaaliasia</w:t>
+      </w:r>
+      <w:r>
+        <w:rPr>
+          <w:rFonts w:eastAsia="Arial" w:cs="Arial"/>
+          <w:sz w:val="24"/>
+          <w:szCs w:val="24"/>
+        </w:rPr>
+        <w:t>vastaavalle</w:t>
+      </w:r>
+      <w:r>
+        <w:rPr>
+          <w:rFonts w:eastAsia="Arial" w:cs="Arial"/>
+          <w:sz w:val="24"/>
+          <w:szCs w:val="24"/>
+        </w:rPr>
+        <w:t>. Sosiaaliasia</w:t>
+      </w:r>
+      <w:r>
+        <w:rPr>
+          <w:rFonts w:eastAsia="Arial" w:cs="Arial"/>
+          <w:sz w:val="24"/>
+          <w:szCs w:val="24"/>
+        </w:rPr>
+        <w:t>vastaavan</w:t>
+      </w:r>
+      <w:r>
+        <w:rPr>
+          <w:rFonts w:eastAsia="Arial" w:cs="Arial"/>
+          <w:sz w:val="24"/>
+          <w:szCs w:val="24"/>
+        </w:rPr>
+        <w:t xml:space="preserve"> yhteystiedot löytyvät yksikön ilmoitustaululta. Palvelun perustuessa ostosopimukseen muistutus tehdään järjestämisvastuussa olevalle viranomaiselle.</w:t>
       </w:r>
     </w:p>
     <w:p>
@@ -15131,16 +15605,7 @@
           <w:sz w:val="24"/>
           <w:szCs w:val="24"/>
         </w:rPr>
-        <w:t xml:space="preserve">Asiakkaan epäasialliseen kohteluun puututaan matalalla kynnyksellä. Ohjaajien kanssa käydään säännöllisesti kehityskeskustelut sekä mahdolliset varhaisen välittämisen keskustelut, </w:t>
-      </w:r>
-      <w:r>
-        <w:rPr>
-          <w:rFonts w:eastAsia="Arial" w:cs="Arial"/>
-          <w:sz w:val="24"/>
-          <w:szCs w:val="24"/>
-        </w:rPr>
-        <w:lastRenderedPageBreak/>
-        <w:t xml:space="preserve">joissa käsitellään asiakkaiden kohtelua aktiivisesti. Lisäksi toiminnanjohtaja keskustelee ohjaajien kanssa muutoinkin säännöllisesti ohjaajien ja </w:t>
+        <w:t xml:space="preserve">Asiakkaan epäasialliseen kohteluun puututaan matalalla kynnyksellä. Ohjaajien kanssa käydään säännöllisesti kehityskeskustelut sekä mahdolliset varhaisen välittämisen keskustelut, joissa käsitellään asiakkaiden kohtelua aktiivisesti. Lisäksi toiminnanjohtaja keskustelee ohjaajien kanssa muutoinkin säännöllisesti ohjaajien ja </w:t>
       </w:r>
       <w:proofErr w:type="spellStart"/>
       <w:r>
@@ -15278,7 +15743,6 @@
           <w:sz w:val="24"/>
           <w:szCs w:val="24"/>
         </w:rPr>
-        <w:lastRenderedPageBreak/>
         <w:t xml:space="preserve">Taulukko 5: </w:t>
       </w:r>
       <w:r>
@@ -15750,7 +16214,7 @@
       <w:bookmarkStart w:id="63" w:name="_Toc175741968"/>
       <w:bookmarkStart w:id="64" w:name="_Toc175741904"/>
       <w:bookmarkStart w:id="65" w:name="_Toc1562178527"/>
-      <w:bookmarkStart w:id="66" w:name="_Toc233886578"/>
+      <w:bookmarkStart w:id="66" w:name="_Toc238743020"/>
       <w:r>
         <w:rPr>
           <w:sz w:val="28"/>
@@ -15773,8 +16237,9 @@
       <w:bookmarkStart w:id="68" w:name="_Toc175740442"/>
       <w:bookmarkStart w:id="69" w:name="_Toc175741905"/>
       <w:bookmarkStart w:id="70" w:name="_Toc1810894369"/>
-      <w:bookmarkStart w:id="71" w:name="_Toc233886579"/>
-      <w:r>
+      <w:bookmarkStart w:id="71" w:name="_Toc238743021"/>
+      <w:r>
+        <w:lastRenderedPageBreak/>
         <w:t xml:space="preserve">4.1 Toiminnassa ilmenevien </w:t>
       </w:r>
       <w:r>
@@ -15811,46 +16276,46 @@
       <w:r>
         <w:rPr>
           <w:rFonts w:eastAsia="Arial" w:cs="Arial"/>
-          <w:sz w:val="24"/>
-          <w:szCs w:val="24"/>
-        </w:rPr>
-        <w:t>Raportoidaan keskeisimmät riskit, epäkohdat ja puutteet palvelun Keski-Suomen hyvinvointialueelle. Vähintään kerran vuodessa ja tarkastusten yhteydessä ja ilmoitamme aina kun vakava riski, epäkohta ja puute ilmenee.</w:t>
-      </w:r>
-    </w:p>
-    <w:p>
-      <w:pPr>
-        <w:spacing w:line="360" w:lineRule="auto"/>
-        <w:rPr>
-          <w:rFonts w:eastAsia="Arial" w:cs="Arial"/>
-          <w:sz w:val="24"/>
-          <w:szCs w:val="24"/>
-        </w:rPr>
-      </w:pPr>
-    </w:p>
-    <w:p>
-      <w:pPr>
-        <w:spacing w:line="360" w:lineRule="auto"/>
-        <w:rPr>
-          <w:rFonts w:eastAsia="Arial" w:cs="Arial"/>
-          <w:sz w:val="24"/>
-          <w:szCs w:val="24"/>
-        </w:rPr>
-      </w:pPr>
-      <w:r>
-        <w:rPr>
-          <w:rFonts w:eastAsia="Arial" w:cs="Arial"/>
-          <w:sz w:val="24"/>
-          <w:szCs w:val="24"/>
-        </w:rPr>
-        <w:t>L</w:t>
-      </w:r>
-      <w:r>
-        <w:rPr>
-          <w:rFonts w:eastAsia="Arial" w:cs="Arial"/>
-          <w:sz w:val="24"/>
-          <w:szCs w:val="24"/>
-        </w:rPr>
-        <w:t>asten, nuorten ja perheiden sosiaali- ja terveyspalvelut ja aikuisten sosiaalipalvelut, vastuualuejohtaja</w:t>
+          <w:b/>
+          <w:bCs/>
+          <w:sz w:val="24"/>
+          <w:szCs w:val="24"/>
+        </w:rPr>
+        <w:t>4.1 Toiminnassa ilmenevien epäkohtien ja puutteiden käsittely</w:t>
+      </w:r>
+    </w:p>
+    <w:p>
+      <w:pPr>
+        <w:spacing w:after="0" w:line="360" w:lineRule="auto"/>
+        <w:rPr>
+          <w:rFonts w:eastAsia="Arial" w:cs="Arial"/>
+          <w:sz w:val="24"/>
+          <w:szCs w:val="24"/>
+        </w:rPr>
+      </w:pPr>
+      <w:r>
+        <w:rPr>
+          <w:rFonts w:eastAsia="Arial" w:cs="Arial"/>
+          <w:sz w:val="24"/>
+          <w:szCs w:val="24"/>
+        </w:rPr>
+        <w:t xml:space="preserve">Raportoimme toiminnassamme ilmenevät keskeisimmät riskit, epäkohdat, puutteet sekä laatu- ja palvelupoikkeamat Keski-Suomen hyvinvointialueelle (Lasten, nuorten ja perheiden sosiaali- ja terveyspalvelut ja aikuisten sosiaalipalvelut, vastuualuejohtaja Päivi Kalilainen, paivi.kalilainen@hyvaks.fi, puh. </w:t>
+      </w:r>
+      <w:r>
+        <w:rPr>
+          <w:rFonts w:eastAsia="Arial" w:cs="Arial"/>
+          <w:sz w:val="24"/>
+          <w:szCs w:val="24"/>
+        </w:rPr>
+        <w:t>044 718 3659</w:t>
+      </w:r>
+      <w:r>
+        <w:rPr>
+          <w:rFonts w:eastAsia="Arial" w:cs="Arial"/>
+          <w:sz w:val="24"/>
+          <w:szCs w:val="24"/>
+        </w:rPr>
+        <w:t>) säännöllisesti vähintään kerran vuodessa, viranomaistarkastusten yhteydessä sekä aina välittömästi, kun vakava riski, epäkohta tai vaaratapahtuma ilmenee.</w:t>
       </w:r>
       <w:r>
         <w:rPr>
@@ -15863,133 +16328,104 @@
     </w:p>
     <w:p>
       <w:pPr>
-        <w:spacing w:line="360" w:lineRule="auto"/>
-        <w:rPr>
-          <w:rFonts w:eastAsia="Arial" w:cs="Arial"/>
-          <w:sz w:val="24"/>
-          <w:szCs w:val="24"/>
-        </w:rPr>
-      </w:pPr>
-      <w:r>
-        <w:rPr>
-          <w:rFonts w:eastAsia="Arial" w:cs="Arial"/>
-          <w:sz w:val="24"/>
-          <w:szCs w:val="24"/>
-        </w:rPr>
-        <w:t>Päivi Kalilainen</w:t>
-      </w:r>
-    </w:p>
-    <w:p>
-      <w:pPr>
-        <w:spacing w:after="0" w:line="360" w:lineRule="auto"/>
-        <w:rPr>
-          <w:rFonts w:eastAsia="Arial" w:cs="Arial"/>
-          <w:sz w:val="24"/>
-          <w:szCs w:val="24"/>
-        </w:rPr>
-      </w:pPr>
-      <w:r>
-        <w:rPr>
-          <w:rFonts w:eastAsia="Arial" w:cs="Arial"/>
-          <w:sz w:val="24"/>
-          <w:szCs w:val="24"/>
-        </w:rPr>
-        <w:lastRenderedPageBreak/>
-        <w:t>paivi.kalilainen@hyvaks.fi</w:t>
-      </w:r>
-    </w:p>
-    <w:p>
-      <w:pPr>
-        <w:spacing w:after="0" w:line="360" w:lineRule="auto"/>
-        <w:rPr>
-          <w:rFonts w:eastAsia="Arial" w:cs="Arial"/>
-          <w:sz w:val="24"/>
-          <w:szCs w:val="24"/>
-        </w:rPr>
-      </w:pPr>
-      <w:r>
-        <w:rPr>
-          <w:rFonts w:eastAsia="Arial" w:cs="Arial"/>
-          <w:sz w:val="24"/>
-          <w:szCs w:val="24"/>
-        </w:rPr>
-        <w:t>050 370 0245</w:t>
-      </w:r>
-    </w:p>
-    <w:p>
-      <w:pPr>
-        <w:spacing w:after="0" w:line="360" w:lineRule="auto"/>
-        <w:rPr>
-          <w:rFonts w:eastAsia="Arial" w:cs="Arial"/>
-          <w:sz w:val="24"/>
-          <w:szCs w:val="24"/>
-        </w:rPr>
-      </w:pPr>
-    </w:p>
-    <w:p>
-      <w:pPr>
-        <w:spacing w:after="0" w:line="360" w:lineRule="auto"/>
-        <w:rPr>
-          <w:rFonts w:eastAsia="Arial" w:cs="Arial"/>
-          <w:sz w:val="24"/>
-          <w:szCs w:val="24"/>
-        </w:rPr>
-      </w:pPr>
-      <w:r>
-        <w:rPr>
-          <w:rFonts w:eastAsia="Arial" w:cs="Arial"/>
-          <w:sz w:val="24"/>
-          <w:szCs w:val="24"/>
-        </w:rPr>
-        <w:t xml:space="preserve">Esimerkkejä muista ilmoitusvelvollisuuksista: </w:t>
-      </w:r>
-      <w:hyperlink r:id="rId19">
-        <w:r>
-          <w:rPr>
-            <w:rFonts w:eastAsia="Arial" w:cs="Arial"/>
-            <w:sz w:val="24"/>
-            <w:szCs w:val="24"/>
-          </w:rPr>
-          <w:t>https://valvira.fi/sosiaali-ja-terveydenhuolto/ammattihenkilon-ilmoitusvelvollisuudet-ja-oikeudet</w:t>
-        </w:r>
-      </w:hyperlink>
-    </w:p>
-    <w:p>
-      <w:pPr>
-        <w:pStyle w:val="ListParagraph"/>
-        <w:spacing w:after="0" w:line="360" w:lineRule="auto"/>
-        <w:ind w:left="1440"/>
-        <w:rPr>
-          <w:rFonts w:eastAsia="Arial" w:cs="Arial"/>
-          <w:sz w:val="24"/>
-          <w:szCs w:val="24"/>
-        </w:rPr>
-      </w:pPr>
-    </w:p>
-    <w:p>
-      <w:pPr>
-        <w:spacing w:after="0" w:line="360" w:lineRule="auto"/>
-        <w:rPr>
-          <w:rFonts w:eastAsia="Arial" w:cs="Arial"/>
-          <w:sz w:val="24"/>
-          <w:szCs w:val="24"/>
-        </w:rPr>
-      </w:pPr>
-      <w:r>
-        <w:rPr>
-          <w:rFonts w:eastAsia="Arial" w:cs="Arial"/>
-          <w:sz w:val="24"/>
-          <w:szCs w:val="24"/>
-        </w:rPr>
-        <w:t xml:space="preserve">Sosiaalihuollon omavalvonta koskee asiakasturvallisuuden osalta sosiaalihuollon lainsäädännöstä tulevia velvoitteita. Palo- ja pelastusturvallisuudesta sekä asumisterveyden turvallisuudesta vastaavat eri viranomaiset kunkin alan oman lainsäädännön perusteella. Asiakasturvallisuuden edistäminen edellyttää kuitenkin yhteistyötä muiden turvallisuudesta vastaavien viranomaisten ja toimijoiden kanssa. Palo- ja pelastusviranomaiset asettavat omat velvoitteensa edellyttämällä mm. poistumisturvallisuussuunnitelman </w:t>
-      </w:r>
-      <w:r>
-        <w:rPr>
-          <w:rFonts w:eastAsia="Arial" w:cs="Arial"/>
-          <w:sz w:val="24"/>
-          <w:szCs w:val="24"/>
-        </w:rPr>
-        <w:t>ja ilmoitusvelvollisuus palo- ja muista onnettomuusriskeistä pelastusviranomaisille. Asiakasturvallisuutta varmistaa omalta osaltaan myös holhoustoimilain mukainen ilmoitusvelvollisuus maistraatille edunvalvonnan tarpeessa olevasta henkilöstä</w:t>
+        <w:spacing w:after="0" w:line="360" w:lineRule="auto"/>
+        <w:rPr>
+          <w:rFonts w:eastAsia="Arial" w:cs="Arial"/>
+          <w:sz w:val="24"/>
+          <w:szCs w:val="24"/>
+        </w:rPr>
+      </w:pPr>
+    </w:p>
+    <w:p>
+      <w:pPr>
+        <w:spacing w:after="0" w:line="360" w:lineRule="auto"/>
+        <w:rPr>
+          <w:rFonts w:eastAsia="Arial" w:cs="Arial"/>
+          <w:sz w:val="24"/>
+          <w:szCs w:val="24"/>
+        </w:rPr>
+      </w:pPr>
+      <w:r>
+        <w:rPr>
+          <w:rFonts w:eastAsia="Arial" w:cs="Arial"/>
+          <w:sz w:val="24"/>
+          <w:szCs w:val="24"/>
+        </w:rPr>
+        <w:t>Koska yksikköömme sijoitetaan asiakkaita myös muilta hyvinvointialueilta, ilmoitamme asukkaita koskevista vakavista poikkeamista, vaaratilanteista ja epäkohdista viipymättä ja voimassa olevien sopimusehtojen mukaisesti myös kyseisen asukkaan sijoittaneen hyvinvointialueen (</w:t>
+      </w:r>
+      <w:r>
+        <w:rPr>
+          <w:rFonts w:eastAsia="Arial" w:cs="Arial"/>
+          <w:b/>
+          <w:bCs/>
+          <w:sz w:val="24"/>
+          <w:szCs w:val="24"/>
+        </w:rPr>
+        <w:t>Etelä-Savon hyvinvointialue, Etelä-Pohjanmaan hyvinvointialue tai Pohjois-Savon hyvinvointialue</w:t>
+      </w:r>
+      <w:r>
+        <w:rPr>
+          <w:rFonts w:eastAsia="Arial" w:cs="Arial"/>
+          <w:sz w:val="24"/>
+          <w:szCs w:val="24"/>
+        </w:rPr>
+        <w:t>) sijoittavalle vastuutyöntekijälle sekä kyseisen hyvinvointialueen viralliseen kirjaamoon.</w:t>
+      </w:r>
+    </w:p>
+    <w:p>
+      <w:pPr>
+        <w:spacing w:after="0" w:line="360" w:lineRule="auto"/>
+        <w:rPr>
+          <w:rFonts w:eastAsia="Arial" w:cs="Arial"/>
+          <w:sz w:val="24"/>
+          <w:szCs w:val="24"/>
+        </w:rPr>
+      </w:pPr>
+    </w:p>
+    <w:p>
+      <w:pPr>
+        <w:spacing w:after="0" w:line="360" w:lineRule="auto"/>
+        <w:rPr>
+          <w:rFonts w:eastAsia="Arial" w:cs="Arial"/>
+          <w:sz w:val="24"/>
+          <w:szCs w:val="24"/>
+        </w:rPr>
+      </w:pPr>
+      <w:r>
+        <w:rPr>
+          <w:rFonts w:eastAsia="Arial" w:cs="Arial"/>
+          <w:i/>
+          <w:iCs/>
+          <w:sz w:val="24"/>
+          <w:szCs w:val="24"/>
+        </w:rPr>
+        <w:t>Esimerkkejä muista ilmoitusvelvollisuuksista:</w:t>
+      </w:r>
+      <w:r>
+        <w:rPr>
+          <w:rFonts w:eastAsia="Arial" w:cs="Arial"/>
+          <w:sz w:val="24"/>
+          <w:szCs w:val="24"/>
+        </w:rPr>
+        <w:t xml:space="preserve"> https://valvira.fi/sosiaali-ja-terveydenhuolto/ammattihenkilon-ilmoitusvelvollisuudet-ja-oikeudet</w:t>
+      </w:r>
+    </w:p>
+    <w:p>
+      <w:pPr>
+        <w:spacing w:after="0" w:line="360" w:lineRule="auto"/>
+        <w:rPr>
+          <w:rFonts w:eastAsia="Arial" w:cs="Arial"/>
+          <w:sz w:val="24"/>
+          <w:szCs w:val="24"/>
+        </w:rPr>
+      </w:pPr>
+      <w:r>
+        <w:rPr>
+          <w:rFonts w:eastAsia="Arial" w:cs="Arial"/>
+          <w:sz w:val="24"/>
+          <w:szCs w:val="24"/>
+        </w:rPr>
+        <w:t>Sosiaalihuollon omavalvonta koskee asiakasturvallisuuden osalta sosiaalihuollon lainsäädännöstä tulevia velvoitteita. Palo- ja pelastusturvallisuudesta sekä asumisterveyden turvallisuudesta vastaavat eri viranomaiset kunkin alan oman lainsäädännön perusteella. Asiakasturvallisuuden edistäminen edellyttää kuitenkin yhteistyötä muiden turvallisuudesta vastaavien viranomaisten ja toimijoiden kanssa. Palo- ja pelastusviranomaiset asettavat omat velvoitteensa edellyttämällä mm. poistumisturvallisuussuunnitelman ja ilmoitusvelvollisuuden palo- ja muista onnettomuusriskeistä pelastusviranomaisille. Asiakasturvallisuutta varmistaa omalta osaltaan myös holhoustoimilain mukainen ilmoitusvelvollisuus Digi- ja väestötietovirastolle (ent. maistraatti) edunvalvonnan tarpeessa olevasta henkilöstä.</w:t>
       </w:r>
     </w:p>
     <w:p>
@@ -16011,7 +16447,7 @@
       <w:bookmarkStart w:id="74" w:name="_Toc175741906"/>
       <w:bookmarkStart w:id="75" w:name="_Toc177734579"/>
       <w:bookmarkStart w:id="76" w:name="_Toc175741970"/>
-      <w:bookmarkStart w:id="77" w:name="_Toc233886580"/>
+      <w:bookmarkStart w:id="77" w:name="_Toc238743022"/>
       <w:r>
         <w:t xml:space="preserve">4.2 Vakavien </w:t>
       </w:r>
@@ -16053,19 +16489,28 @@
           <w:sz w:val="24"/>
           <w:szCs w:val="24"/>
         </w:rPr>
-        <w:t>Henkilökunnan kanssa on käyty läpi henkilökuntapalaverissa tunnistettavat vaaratapahtumat ja ne on toiminnassa huomioitu. Jos vakava vaaratapahtuma ilmenee, se tutkitaan yhdessä koko henkilökunnan kanssa. Henkilökunnalle annetaan kaikki mahdollinen tuki tilanteen selvittämiseksi ja varaudutaan kaikin mahdollisin keinoin, ettei vaaratilanne enää toistu ja tehdään ennaltaehkäisevät toimenpiteet.</w:t>
-      </w:r>
-    </w:p>
-    <w:p>
-      <w:pPr>
-        <w:spacing w:after="0" w:line="360" w:lineRule="auto"/>
-        <w:rPr>
-          <w:rFonts w:eastAsia="Arial" w:cs="Arial"/>
-          <w:sz w:val="24"/>
-          <w:szCs w:val="24"/>
-        </w:rPr>
-      </w:pPr>
-      <w:hyperlink r:id="rId20">
+        <w:t xml:space="preserve">Henkilökunnan kanssa on käyty läpi henkilökuntapalaverissa tunnistettavat vaaratapahtumat ja ne on toiminnassa huomioitu. Jos vakava vaaratapahtuma ilmenee, se tutkitaan yhdessä </w:t>
+      </w:r>
+      <w:r>
+        <w:rPr>
+          <w:rFonts w:eastAsia="Arial" w:cs="Arial"/>
+          <w:sz w:val="24"/>
+          <w:szCs w:val="24"/>
+        </w:rPr>
+        <w:lastRenderedPageBreak/>
+        <w:t>koko henkilökunnan kanssa. Henkilökunnalle annetaan kaikki mahdollinen tuki tilanteen selvittämiseksi ja varaudutaan kaikin mahdollisin keinoin, ettei vaaratilanne enää toistu ja tehdään ennaltaehkäisevät toimenpiteet.</w:t>
+      </w:r>
+    </w:p>
+    <w:p>
+      <w:pPr>
+        <w:spacing w:after="0" w:line="360" w:lineRule="auto"/>
+        <w:rPr>
+          <w:rFonts w:eastAsia="Arial" w:cs="Arial"/>
+          <w:sz w:val="24"/>
+          <w:szCs w:val="24"/>
+        </w:rPr>
+      </w:pPr>
+      <w:hyperlink r:id="rId16">
         <w:r>
           <w:rPr>
             <w:rStyle w:val="Hyperlink"/>
@@ -16116,7 +16561,7 @@
       <w:bookmarkStart w:id="80" w:name="_Toc175741971"/>
       <w:bookmarkStart w:id="81" w:name="_Toc175741907"/>
       <w:bookmarkStart w:id="82" w:name="_Toc198124398"/>
-      <w:bookmarkStart w:id="83" w:name="_Toc233886581"/>
+      <w:bookmarkStart w:id="83" w:name="_Toc238743023"/>
       <w:r>
         <w:t xml:space="preserve">4.3 Palautetiedon </w:t>
       </w:r>
@@ -16158,16 +16603,7 @@
           <w:sz w:val="24"/>
           <w:szCs w:val="24"/>
         </w:rPr>
-        <w:t xml:space="preserve">Omavalvonnan ja toiminnan kehittämiseksi hyödynnetään epäkohtailmoitusten ja haitta- ja vaaratapahtumailmoitusten käsittelyssä esiin tulleita epäkohtia tai puutteita, jotka käsitellään henkilökuntapalavereissa ja muutetaan esiin tulleiden asioiden pohjalta. Samoin toimitaan </w:t>
-      </w:r>
-      <w:r>
-        <w:rPr>
-          <w:rFonts w:eastAsia="Arial" w:cs="Arial"/>
-          <w:sz w:val="24"/>
-          <w:szCs w:val="24"/>
-        </w:rPr>
-        <w:lastRenderedPageBreak/>
-        <w:t>muistutusten, kanteluiden ja potilasvahinkoilmoitusten suhteen. Myös asiakaspalaute hyödynnetään toiminnan kehittämisessä. Säännölliset henkilökuntapalaverit takaavat sen, että henkilöstö on tietoinen käytössä olevista palautekanavista. Erityisesti huomioidaan henkilökuntapalavereissa valvontaviranomaisten ohjaus ja päätökset.</w:t>
+        <w:t>Omavalvonnan ja toiminnan kehittämiseksi hyödynnetään epäkohtailmoitusten ja haitta- ja vaaratapahtumailmoitusten käsittelyssä esiin tulleita epäkohtia tai puutteita, jotka käsitellään henkilökuntapalavereissa ja muutetaan esiin tulleiden asioiden pohjalta. Samoin toimitaan muistutusten, kanteluiden ja potilasvahinkoilmoitusten suhteen. Myös asiakaspalaute hyödynnetään toiminnan kehittämisessä. Säännölliset henkilökuntapalaverit takaavat sen, että henkilöstö on tietoinen käytössä olevista palautekanavista. Erityisesti huomioidaan henkilökuntapalavereissa valvontaviranomaisten ohjaus ja päätökset.</w:t>
       </w:r>
     </w:p>
     <w:p>
@@ -16184,7 +16620,7 @@
       <w:pPr>
         <w:pStyle w:val="Heading2"/>
       </w:pPr>
-      <w:bookmarkStart w:id="84" w:name="_Toc233886582"/>
+      <w:bookmarkStart w:id="84" w:name="_Toc238743024"/>
       <w:r>
         <w:t xml:space="preserve">4.4. Kehittämistoimenpiteiden </w:t>
       </w:r>
@@ -16323,7 +16759,7 @@
       <w:bookmarkStart w:id="86" w:name="_Toc175741973"/>
       <w:bookmarkStart w:id="87" w:name="_Toc175740446"/>
       <w:bookmarkStart w:id="88" w:name="_Toc175741909"/>
-      <w:bookmarkStart w:id="89" w:name="_Toc233886583"/>
+      <w:bookmarkStart w:id="89" w:name="_Toc238743025"/>
       <w:r>
         <w:rPr>
           <w:sz w:val="28"/>
@@ -16345,7 +16781,7 @@
       <w:bookmarkStart w:id="90" w:name="_Toc175741910"/>
       <w:bookmarkStart w:id="91" w:name="_Toc175740447"/>
       <w:bookmarkStart w:id="92" w:name="_Toc175741974"/>
-      <w:bookmarkStart w:id="93" w:name="_Toc233886584"/>
+      <w:bookmarkStart w:id="93" w:name="_Toc238743026"/>
       <w:r>
         <w:t xml:space="preserve">5.1 Laadun- ja </w:t>
       </w:r>
@@ -16385,6 +16821,7 @@
           <w:sz w:val="24"/>
           <w:szCs w:val="24"/>
         </w:rPr>
+        <w:lastRenderedPageBreak/>
         <w:t>Erillisessä riskienhallinta- ja organisointi- ohjeessa on kuvattu riskienhallinta prosessi, seuranta ja raportointi. Riskien hallinnan menetelmiä ja mittareita kehitetään jatkuvasti.</w:t>
       </w:r>
     </w:p>
@@ -16406,7 +16843,7 @@
       <w:bookmarkStart w:id="94" w:name="_Toc175741911"/>
       <w:bookmarkStart w:id="95" w:name="_Toc175741975"/>
       <w:bookmarkStart w:id="96" w:name="_Toc175740448"/>
-      <w:bookmarkStart w:id="97" w:name="_Toc233886585"/>
+      <w:bookmarkStart w:id="97" w:name="_Toc238743027"/>
       <w:r>
         <w:t xml:space="preserve">5.2 </w:t>
       </w:r>
@@ -16464,7 +16901,6 @@
           <w:sz w:val="24"/>
           <w:szCs w:val="24"/>
         </w:rPr>
-        <w:lastRenderedPageBreak/>
         <w:t>Säännöllisen kirjaamisen avulla voidaan seurata, että omavalvonta toteutuu käytännössä ja kirjaamisen käytäntöjä kehitetään jatkuvasti.</w:t>
       </w:r>
     </w:p>
@@ -16543,19 +16979,36 @@
           <w:szCs w:val="24"/>
         </w:rPr>
       </w:pPr>
-      <w:r>
-        <w:rPr>
-          <w:rFonts w:eastAsia="Arial" w:cs="Arial"/>
-          <w:sz w:val="24"/>
-          <w:szCs w:val="24"/>
-        </w:rPr>
-        <w:t>Omavalvontasuunnitelma päivitetään tarvittaessa tai vähintään kerran vuodessa,</w:t>
-      </w:r>
-    </w:p>
-    <w:p>
-      <w:pPr>
-        <w:pStyle w:val="Heading1"/>
-        <w:spacing w:line="360" w:lineRule="auto"/>
+    </w:p>
+    <w:p>
+      <w:pPr>
+        <w:spacing w:after="0" w:line="360" w:lineRule="auto"/>
+        <w:rPr>
+          <w:rFonts w:eastAsia="Arial" w:cs="Arial"/>
+          <w:sz w:val="24"/>
+          <w:szCs w:val="24"/>
+        </w:rPr>
+      </w:pPr>
+      <w:r>
+        <w:rPr>
+          <w:rFonts w:eastAsia="Arial" w:cs="Arial"/>
+          <w:sz w:val="24"/>
+          <w:szCs w:val="24"/>
+        </w:rPr>
+        <w:t xml:space="preserve">Omavalvontasuunnitelma päivitetään </w:t>
+      </w:r>
+      <w:r>
+        <w:rPr>
+          <w:rFonts w:eastAsia="Arial" w:cs="Arial"/>
+          <w:sz w:val="24"/>
+          <w:szCs w:val="24"/>
+        </w:rPr>
+        <w:t>aina 3 kk välein.</w:t>
+      </w:r>
+    </w:p>
+    <w:p>
+      <w:pPr>
+        <w:spacing w:after="0" w:line="360" w:lineRule="auto"/>
         <w:rPr>
           <w:rFonts w:eastAsia="Arial" w:cs="Arial"/>
           <w:sz w:val="24"/>
@@ -16576,7 +17029,7 @@
       <w:bookmarkStart w:id="98" w:name="_Toc175741912"/>
       <w:bookmarkStart w:id="99" w:name="_Toc175741976"/>
       <w:bookmarkStart w:id="100" w:name="_Toc175740449"/>
-      <w:bookmarkStart w:id="101" w:name="_Toc233886586"/>
+      <w:bookmarkStart w:id="101" w:name="_Toc238743028"/>
       <w:r>
         <w:rPr>
           <w:rFonts w:eastAsia="Arial" w:cs="Arial"/>
@@ -16641,6 +17094,7 @@
           <w:sz w:val="24"/>
           <w:szCs w:val="24"/>
         </w:rPr>
+        <w:lastRenderedPageBreak/>
         <w:t>Liite 3 Edunvalvonta prosessi</w:t>
       </w:r>
     </w:p>
@@ -16655,7 +17109,7 @@
       </w:pPr>
     </w:p>
     <w:sectPr>
-      <w:headerReference w:type="default" r:id="rId21"/>
+      <w:headerReference w:type="default" r:id="rId17"/>
       <w:pgSz w:w="12240" w:h="15840"/>
       <w:pgMar w:top="1440" w:right="758" w:bottom="993" w:left="1440" w:header="708" w:footer="450" w:gutter="0"/>
       <w:cols w:space="708"/>
@@ -16667,7 +17121,7 @@
 </file>
 
 <file path=word/endnotes.xml><?xml version="1.0" encoding="utf-8"?>
-<w:endnotes xmlns:wpc="http://schemas.microsoft.com/office/word/2010/wordprocessingCanvas" xmlns:cx="http://schemas.microsoft.com/office/drawing/2014/chartex" xmlns:cx1="http://schemas.microsoft.com/office/drawing/2015/9/8/chartex" xmlns:cx2="http://schemas.microsoft.com/office/drawing/2015/10/21/chartex" xmlns:cx3="http://schemas.microsoft.com/office/drawing/2016/5/9/chartex" xmlns:cx4="http://schemas.microsoft.com/office/drawing/2016/5/10/chartex" xmlns:cx5="http://schemas.microsoft.com/office/drawing/2016/5/11/chartex" xmlns:cx6="http://schemas.microsoft.com/office/drawing/2016/5/12/chartex" xmlns:cx7="http://schemas.microsoft.com/office/drawing/2016/5/13/chartex" xmlns:cx8="http://schemas.microsoft.com/office/drawing/2016/5/14/chartex" xmlns:mc="http://schemas.openxmlformats.org/markup-compatibility/2006" xmlns:aink="http://schemas.microsoft.com/office/drawing/2016/ink" xmlns:am3d="http://schemas.microsoft.com/office/drawing/2017/model3d" xmlns:o="urn:schemas-microsoft-com:office:office" xmlns:oel="http://schemas.microsoft.com/office/2019/extlst" xmlns:r="http://schemas.openxmlformats.org/officeDocument/2006/relationships" xmlns:m="http://schemas.openxmlformats.org/officeDocument/2006/math" xmlns:v="urn:schemas-microsoft-com:vml" xmlns:wp14="http://schemas.microsoft.com/office/word/2010/wordprocessingDrawing" xmlns:wp="http://schemas.openxmlformats.org/drawingml/2006/wordprocessingDrawing" xmlns:w10="urn:schemas-microsoft-com:office:word" xmlns:w="http://schemas.openxmlformats.org/wordprocessingml/2006/main" xmlns:w14="http://schemas.microsoft.com/office/word/2010/wordml" xmlns:w15="http://schemas.microsoft.com/office/word/2012/wordml" xmlns:w16cex="http://schemas.microsoft.com/office/word/2018/wordml/cex" xmlns:w16cid="http://schemas.microsoft.com/office/word/2016/wordml/cid" xmlns:w16="http://schemas.microsoft.com/office/word/2018/wordml" xmlns:w16du="http://schemas.microsoft.com/office/word/2023/wordml/word16du" xmlns:w16sdtdh="http://schemas.microsoft.com/office/word/2020/wordml/sdtdatahash" xmlns:w16sdtfl="http://schemas.microsoft.com/office/word/2024/wordml/sdtformatlock" xmlns:w16se="http://schemas.microsoft.com/office/word/2015/wordml/symex" xmlns:wpg="http://schemas.microsoft.com/office/word/2010/wordprocessingGroup" xmlns:wpi="http://schemas.microsoft.com/office/word/2010/wordprocessingInk" xmlns:wne="http://schemas.microsoft.com/office/word/2006/wordml" xmlns:wps="http://schemas.microsoft.com/office/word/2010/wordprocessingShape" mc:Ignorable="w14 w15 w16se w16cid w16 w16cex w16sdtdh w16sdtfl w16du wp14">
+<w:endnotes xmlns:wpc="http://schemas.microsoft.com/office/word/2010/wordprocessingCanvas" xmlns:cx="http://schemas.microsoft.com/office/drawing/2014/chartex" xmlns:cx1="http://schemas.microsoft.com/office/drawing/2015/9/8/chartex" xmlns:cx2="http://schemas.microsoft.com/office/drawing/2015/10/21/chartex" xmlns:cx3="http://schemas.microsoft.com/office/drawing/2016/5/9/chartex" xmlns:cx4="http://schemas.microsoft.com/office/drawing/2016/5/10/chartex" xmlns:cx5="http://schemas.microsoft.com/office/drawing/2016/5/11/chartex" xmlns:cx6="http://schemas.microsoft.com/office/drawing/2016/5/12/chartex" xmlns:cx7="http://schemas.microsoft.com/office/drawing/2016/5/13/chartex" xmlns:cx8="http://schemas.microsoft.com/office/drawing/2016/5/14/chartex" xmlns:mc="http://schemas.openxmlformats.org/markup-compatibility/2006" xmlns:m="http://schemas.openxmlformats.org/officeDocument/2006/math" xmlns:aink="http://schemas.microsoft.com/office/drawing/2016/ink" xmlns:am3d="http://schemas.microsoft.com/office/drawing/2017/model3d" xmlns:oel="http://schemas.microsoft.com/office/2019/extlst" xmlns:r="http://schemas.openxmlformats.org/officeDocument/2006/relationships" xmlns:wp14="http://schemas.microsoft.com/office/word/2010/wordprocessingDrawing" xmlns:wp="http://schemas.openxmlformats.org/drawingml/2006/wordprocessingDrawing" xmlns:wpg="http://schemas.microsoft.com/office/word/2010/wordprocessingGroup" xmlns:wpi="http://schemas.microsoft.com/office/word/2010/wordprocessingInk" xmlns:wps="http://schemas.microsoft.com/office/word/2010/wordprocessingShape" xmlns:o="urn:schemas-microsoft-com:office:office" xmlns:v="urn:schemas-microsoft-com:vml" xmlns:w10="urn:schemas-microsoft-com:office:word" xmlns:w="http://schemas.openxmlformats.org/wordprocessingml/2006/main" xmlns:w14="http://schemas.microsoft.com/office/word/2010/wordml" xmlns:w15="http://schemas.microsoft.com/office/word/2012/wordml" xmlns:w16cex="http://schemas.microsoft.com/office/word/2018/wordml/cex" xmlns:w16cid="http://schemas.microsoft.com/office/word/2016/wordml/cid" xmlns:w16="http://schemas.microsoft.com/office/word/2018/wordml" xmlns:w16sdtdh="http://schemas.microsoft.com/office/word/2020/wordml/sdtdatahash" xmlns:w16sdtfl="http://schemas.microsoft.com/office/word/2024/wordml/sdtformatlock" xmlns:w16se="http://schemas.microsoft.com/office/word/2015/wordml/symex" xmlns:w16du="http://schemas.microsoft.com/office/word/2023/wordml/word16du" xmlns:wne="http://schemas.microsoft.com/office/word/2006/wordml" mc:Ignorable="w14 w15 w16se w16cid w16 w16cex w16sdtdh w16sdtfl w16du wp14">
   <w:endnote w:type="separator" w:id="-1">
     <w:p>
       <w:pPr>
@@ -16692,7 +17146,7 @@
 </file>
 
 <file path=word/footnotes.xml><?xml version="1.0" encoding="utf-8"?>
-<w:footnotes xmlns:wpc="http://schemas.microsoft.com/office/word/2010/wordprocessingCanvas" xmlns:cx="http://schemas.microsoft.com/office/drawing/2014/chartex" xmlns:cx1="http://schemas.microsoft.com/office/drawing/2015/9/8/chartex" xmlns:cx2="http://schemas.microsoft.com/office/drawing/2015/10/21/chartex" xmlns:cx3="http://schemas.microsoft.com/office/drawing/2016/5/9/chartex" xmlns:cx4="http://schemas.microsoft.com/office/drawing/2016/5/10/chartex" xmlns:cx5="http://schemas.microsoft.com/office/drawing/2016/5/11/chartex" xmlns:cx6="http://schemas.microsoft.com/office/drawing/2016/5/12/chartex" xmlns:cx7="http://schemas.microsoft.com/office/drawing/2016/5/13/chartex" xmlns:cx8="http://schemas.microsoft.com/office/drawing/2016/5/14/chartex" xmlns:mc="http://schemas.openxmlformats.org/markup-compatibility/2006" xmlns:aink="http://schemas.microsoft.com/office/drawing/2016/ink" xmlns:am3d="http://schemas.microsoft.com/office/drawing/2017/model3d" xmlns:o="urn:schemas-microsoft-com:office:office" xmlns:oel="http://schemas.microsoft.com/office/2019/extlst" xmlns:r="http://schemas.openxmlformats.org/officeDocument/2006/relationships" xmlns:m="http://schemas.openxmlformats.org/officeDocument/2006/math" xmlns:v="urn:schemas-microsoft-com:vml" xmlns:wp14="http://schemas.microsoft.com/office/word/2010/wordprocessingDrawing" xmlns:wp="http://schemas.openxmlformats.org/drawingml/2006/wordprocessingDrawing" xmlns:w10="urn:schemas-microsoft-com:office:word" xmlns:w="http://schemas.openxmlformats.org/wordprocessingml/2006/main" xmlns:w14="http://schemas.microsoft.com/office/word/2010/wordml" xmlns:w15="http://schemas.microsoft.com/office/word/2012/wordml" xmlns:w16cex="http://schemas.microsoft.com/office/word/2018/wordml/cex" xmlns:w16cid="http://schemas.microsoft.com/office/word/2016/wordml/cid" xmlns:w16="http://schemas.microsoft.com/office/word/2018/wordml" xmlns:w16du="http://schemas.microsoft.com/office/word/2023/wordml/word16du" xmlns:w16sdtdh="http://schemas.microsoft.com/office/word/2020/wordml/sdtdatahash" xmlns:w16sdtfl="http://schemas.microsoft.com/office/word/2024/wordml/sdtformatlock" xmlns:w16se="http://schemas.microsoft.com/office/word/2015/wordml/symex" xmlns:wpg="http://schemas.microsoft.com/office/word/2010/wordprocessingGroup" xmlns:wpi="http://schemas.microsoft.com/office/word/2010/wordprocessingInk" xmlns:wne="http://schemas.microsoft.com/office/word/2006/wordml" xmlns:wps="http://schemas.microsoft.com/office/word/2010/wordprocessingShape" mc:Ignorable="w14 w15 w16se w16cid w16 w16cex w16sdtdh w16sdtfl w16du wp14">
+<w:footnotes xmlns:wpc="http://schemas.microsoft.com/office/word/2010/wordprocessingCanvas" xmlns:cx="http://schemas.microsoft.com/office/drawing/2014/chartex" xmlns:cx1="http://schemas.microsoft.com/office/drawing/2015/9/8/chartex" xmlns:cx2="http://schemas.microsoft.com/office/drawing/2015/10/21/chartex" xmlns:cx3="http://schemas.microsoft.com/office/drawing/2016/5/9/chartex" xmlns:cx4="http://schemas.microsoft.com/office/drawing/2016/5/10/chartex" xmlns:cx5="http://schemas.microsoft.com/office/drawing/2016/5/11/chartex" xmlns:cx6="http://schemas.microsoft.com/office/drawing/2016/5/12/chartex" xmlns:cx7="http://schemas.microsoft.com/office/drawing/2016/5/13/chartex" xmlns:cx8="http://schemas.microsoft.com/office/drawing/2016/5/14/chartex" xmlns:mc="http://schemas.openxmlformats.org/markup-compatibility/2006" xmlns:m="http://schemas.openxmlformats.org/officeDocument/2006/math" xmlns:aink="http://schemas.microsoft.com/office/drawing/2016/ink" xmlns:am3d="http://schemas.microsoft.com/office/drawing/2017/model3d" xmlns:oel="http://schemas.microsoft.com/office/2019/extlst" xmlns:r="http://schemas.openxmlformats.org/officeDocument/2006/relationships" xmlns:wp14="http://schemas.microsoft.com/office/word/2010/wordprocessingDrawing" xmlns:wp="http://schemas.openxmlformats.org/drawingml/2006/wordprocessingDrawing" xmlns:wpg="http://schemas.microsoft.com/office/word/2010/wordprocessingGroup" xmlns:wpi="http://schemas.microsoft.com/office/word/2010/wordprocessingInk" xmlns:wps="http://schemas.microsoft.com/office/word/2010/wordprocessingShape" xmlns:o="urn:schemas-microsoft-com:office:office" xmlns:v="urn:schemas-microsoft-com:vml" xmlns:w10="urn:schemas-microsoft-com:office:word" xmlns:w="http://schemas.openxmlformats.org/wordprocessingml/2006/main" xmlns:w14="http://schemas.microsoft.com/office/word/2010/wordml" xmlns:w15="http://schemas.microsoft.com/office/word/2012/wordml" xmlns:w16cex="http://schemas.microsoft.com/office/word/2018/wordml/cex" xmlns:w16cid="http://schemas.microsoft.com/office/word/2016/wordml/cid" xmlns:w16="http://schemas.microsoft.com/office/word/2018/wordml" xmlns:w16sdtdh="http://schemas.microsoft.com/office/word/2020/wordml/sdtdatahash" xmlns:w16sdtfl="http://schemas.microsoft.com/office/word/2024/wordml/sdtformatlock" xmlns:w16se="http://schemas.microsoft.com/office/word/2015/wordml/symex" xmlns:w16du="http://schemas.microsoft.com/office/word/2023/wordml/word16du" xmlns:wne="http://schemas.microsoft.com/office/word/2006/wordml" mc:Ignorable="w14 w15 w16se w16cid w16 w16cex w16sdtdh w16sdtfl w16du wp14">
   <w:footnote w:type="separator" w:id="-1">
     <w:p>
       <w:pPr>
@@ -16717,7 +17171,7 @@
 </file>
 
 <file path=word/header1.xml><?xml version="1.0" encoding="utf-8"?>
-<w:hdr xmlns:wpc="http://schemas.microsoft.com/office/word/2010/wordprocessingCanvas" xmlns:cx="http://schemas.microsoft.com/office/drawing/2014/chartex" xmlns:cx1="http://schemas.microsoft.com/office/drawing/2015/9/8/chartex" xmlns:cx2="http://schemas.microsoft.com/office/drawing/2015/10/21/chartex" xmlns:cx3="http://schemas.microsoft.com/office/drawing/2016/5/9/chartex" xmlns:cx4="http://schemas.microsoft.com/office/drawing/2016/5/10/chartex" xmlns:cx5="http://schemas.microsoft.com/office/drawing/2016/5/11/chartex" xmlns:cx6="http://schemas.microsoft.com/office/drawing/2016/5/12/chartex" xmlns:cx7="http://schemas.microsoft.com/office/drawing/2016/5/13/chartex" xmlns:cx8="http://schemas.microsoft.com/office/drawing/2016/5/14/chartex" xmlns:mc="http://schemas.openxmlformats.org/markup-compatibility/2006" xmlns:aink="http://schemas.microsoft.com/office/drawing/2016/ink" xmlns:am3d="http://schemas.microsoft.com/office/drawing/2017/model3d" xmlns:o="urn:schemas-microsoft-com:office:office" xmlns:oel="http://schemas.microsoft.com/office/2019/extlst" xmlns:r="http://schemas.openxmlformats.org/officeDocument/2006/relationships" xmlns:m="http://schemas.openxmlformats.org/officeDocument/2006/math" xmlns:v="urn:schemas-microsoft-com:vml" xmlns:wp14="http://schemas.microsoft.com/office/word/2010/wordprocessingDrawing" xmlns:wp="http://schemas.openxmlformats.org/drawingml/2006/wordprocessingDrawing" xmlns:w10="urn:schemas-microsoft-com:office:word" xmlns:w="http://schemas.openxmlformats.org/wordprocessingml/2006/main" xmlns:w14="http://schemas.microsoft.com/office/word/2010/wordml" xmlns:w15="http://schemas.microsoft.com/office/word/2012/wordml" xmlns:w16cex="http://schemas.microsoft.com/office/word/2018/wordml/cex" xmlns:w16cid="http://schemas.microsoft.com/office/word/2016/wordml/cid" xmlns:w16="http://schemas.microsoft.com/office/word/2018/wordml" xmlns:w16du="http://schemas.microsoft.com/office/word/2023/wordml/word16du" xmlns:w16sdtdh="http://schemas.microsoft.com/office/word/2020/wordml/sdtdatahash" xmlns:w16sdtfl="http://schemas.microsoft.com/office/word/2024/wordml/sdtformatlock" xmlns:w16se="http://schemas.microsoft.com/office/word/2015/wordml/symex" xmlns:wpg="http://schemas.microsoft.com/office/word/2010/wordprocessingGroup" xmlns:wpi="http://schemas.microsoft.com/office/word/2010/wordprocessingInk" xmlns:wne="http://schemas.microsoft.com/office/word/2006/wordml" xmlns:wps="http://schemas.microsoft.com/office/word/2010/wordprocessingShape" mc:Ignorable="w14 w15 w16se w16cid w16 w16cex w16sdtdh w16sdtfl w16du wp14">
+<w:hdr xmlns:wpc="http://schemas.microsoft.com/office/word/2010/wordprocessingCanvas" xmlns:cx="http://schemas.microsoft.com/office/drawing/2014/chartex" xmlns:cx1="http://schemas.microsoft.com/office/drawing/2015/9/8/chartex" xmlns:cx2="http://schemas.microsoft.com/office/drawing/2015/10/21/chartex" xmlns:cx3="http://schemas.microsoft.com/office/drawing/2016/5/9/chartex" xmlns:cx4="http://schemas.microsoft.com/office/drawing/2016/5/10/chartex" xmlns:cx5="http://schemas.microsoft.com/office/drawing/2016/5/11/chartex" xmlns:cx6="http://schemas.microsoft.com/office/drawing/2016/5/12/chartex" xmlns:cx7="http://schemas.microsoft.com/office/drawing/2016/5/13/chartex" xmlns:cx8="http://schemas.microsoft.com/office/drawing/2016/5/14/chartex" xmlns:mc="http://schemas.openxmlformats.org/markup-compatibility/2006" xmlns:m="http://schemas.openxmlformats.org/officeDocument/2006/math" xmlns:aink="http://schemas.microsoft.com/office/drawing/2016/ink" xmlns:am3d="http://schemas.microsoft.com/office/drawing/2017/model3d" xmlns:oel="http://schemas.microsoft.com/office/2019/extlst" xmlns:r="http://schemas.openxmlformats.org/officeDocument/2006/relationships" xmlns:wp14="http://schemas.microsoft.com/office/word/2010/wordprocessingDrawing" xmlns:wp="http://schemas.openxmlformats.org/drawingml/2006/wordprocessingDrawing" xmlns:wpg="http://schemas.microsoft.com/office/word/2010/wordprocessingGroup" xmlns:wpi="http://schemas.microsoft.com/office/word/2010/wordprocessingInk" xmlns:wps="http://schemas.microsoft.com/office/word/2010/wordprocessingShape" xmlns:o="urn:schemas-microsoft-com:office:office" xmlns:v="urn:schemas-microsoft-com:vml" xmlns:w10="urn:schemas-microsoft-com:office:word" xmlns:w="http://schemas.openxmlformats.org/wordprocessingml/2006/main" xmlns:w14="http://schemas.microsoft.com/office/word/2010/wordml" xmlns:w15="http://schemas.microsoft.com/office/word/2012/wordml" xmlns:w16cex="http://schemas.microsoft.com/office/word/2018/wordml/cex" xmlns:w16cid="http://schemas.microsoft.com/office/word/2016/wordml/cid" xmlns:w16="http://schemas.microsoft.com/office/word/2018/wordml" xmlns:w16sdtdh="http://schemas.microsoft.com/office/word/2020/wordml/sdtdatahash" xmlns:w16sdtfl="http://schemas.microsoft.com/office/word/2024/wordml/sdtformatlock" xmlns:w16se="http://schemas.microsoft.com/office/word/2015/wordml/symex" xmlns:w16du="http://schemas.microsoft.com/office/word/2023/wordml/word16du" xmlns:wne="http://schemas.microsoft.com/office/word/2006/wordml" mc:Ignorable="w14 w15 w16se w16cid w16 w16cex w16sdtdh w16sdtfl w16du wp14">
   <w:p>
     <w:pPr>
       <w:pStyle w:val="Header"/>
@@ -16727,7 +17181,6 @@
       <w:sdtPr>
         <w:id w:val="-1938667569"/>
       </w:sdtPr>
-      <w:sdtEndPr/>
       <w:sdtContent>
         <w:r>
           <w:fldChar w:fldCharType="begin"/>
@@ -16756,7 +17209,7 @@
 </file>
 
 <file path=word/numbering.xml><?xml version="1.0" encoding="utf-8"?>
-<w:numbering xmlns:wpc="http://schemas.microsoft.com/office/word/2010/wordprocessingCanvas" xmlns:cx="http://schemas.microsoft.com/office/drawing/2014/chartex" xmlns:cx1="http://schemas.microsoft.com/office/drawing/2015/9/8/chartex" xmlns:cx2="http://schemas.microsoft.com/office/drawing/2015/10/21/chartex" xmlns:cx3="http://schemas.microsoft.com/office/drawing/2016/5/9/chartex" xmlns:cx4="http://schemas.microsoft.com/office/drawing/2016/5/10/chartex" xmlns:cx5="http://schemas.microsoft.com/office/drawing/2016/5/11/chartex" xmlns:cx6="http://schemas.microsoft.com/office/drawing/2016/5/12/chartex" xmlns:cx7="http://schemas.microsoft.com/office/drawing/2016/5/13/chartex" xmlns:cx8="http://schemas.microsoft.com/office/drawing/2016/5/14/chartex" xmlns:mc="http://schemas.openxmlformats.org/markup-compatibility/2006" xmlns:aink="http://schemas.microsoft.com/office/drawing/2016/ink" xmlns:am3d="http://schemas.microsoft.com/office/drawing/2017/model3d" xmlns:o="urn:schemas-microsoft-com:office:office" xmlns:oel="http://schemas.microsoft.com/office/2019/extlst" xmlns:r="http://schemas.openxmlformats.org/officeDocument/2006/relationships" xmlns:m="http://schemas.openxmlformats.org/officeDocument/2006/math" xmlns:v="urn:schemas-microsoft-com:vml" xmlns:wp14="http://schemas.microsoft.com/office/word/2010/wordprocessingDrawing" xmlns:wp="http://schemas.openxmlformats.org/drawingml/2006/wordprocessingDrawing" xmlns:w10="urn:schemas-microsoft-com:office:word" xmlns:w="http://schemas.openxmlformats.org/wordprocessingml/2006/main" xmlns:w14="http://schemas.microsoft.com/office/word/2010/wordml" xmlns:w15="http://schemas.microsoft.com/office/word/2012/wordml" xmlns:w16cex="http://schemas.microsoft.com/office/word/2018/wordml/cex" xmlns:w16cid="http://schemas.microsoft.com/office/word/2016/wordml/cid" xmlns:w16="http://schemas.microsoft.com/office/word/2018/wordml" xmlns:w16du="http://schemas.microsoft.com/office/word/2023/wordml/word16du" xmlns:w16sdtdh="http://schemas.microsoft.com/office/word/2020/wordml/sdtdatahash" xmlns:w16sdtfl="http://schemas.microsoft.com/office/word/2024/wordml/sdtformatlock" xmlns:w16se="http://schemas.microsoft.com/office/word/2015/wordml/symex" xmlns:wpg="http://schemas.microsoft.com/office/word/2010/wordprocessingGroup" xmlns:wpi="http://schemas.microsoft.com/office/word/2010/wordprocessingInk" xmlns:wne="http://schemas.microsoft.com/office/word/2006/wordml" xmlns:wps="http://schemas.microsoft.com/office/word/2010/wordprocessingShape" mc:Ignorable="w14 w15 w16se w16cid w16 w16cex w16sdtdh w16sdtfl w16du wp14">
+<w:numbering xmlns:wpc="http://schemas.microsoft.com/office/word/2010/wordprocessingCanvas" xmlns:cx="http://schemas.microsoft.com/office/drawing/2014/chartex" xmlns:cx1="http://schemas.microsoft.com/office/drawing/2015/9/8/chartex" xmlns:cx2="http://schemas.microsoft.com/office/drawing/2015/10/21/chartex" xmlns:cx3="http://schemas.microsoft.com/office/drawing/2016/5/9/chartex" xmlns:cx4="http://schemas.microsoft.com/office/drawing/2016/5/10/chartex" xmlns:cx5="http://schemas.microsoft.com/office/drawing/2016/5/11/chartex" xmlns:cx6="http://schemas.microsoft.com/office/drawing/2016/5/12/chartex" xmlns:cx7="http://schemas.microsoft.com/office/drawing/2016/5/13/chartex" xmlns:cx8="http://schemas.microsoft.com/office/drawing/2016/5/14/chartex" xmlns:mc="http://schemas.openxmlformats.org/markup-compatibility/2006" xmlns:m="http://schemas.openxmlformats.org/officeDocument/2006/math" xmlns:aink="http://schemas.microsoft.com/office/drawing/2016/ink" xmlns:am3d="http://schemas.microsoft.com/office/drawing/2017/model3d" xmlns:oel="http://schemas.microsoft.com/office/2019/extlst" xmlns:r="http://schemas.openxmlformats.org/officeDocument/2006/relationships" xmlns:wp14="http://schemas.microsoft.com/office/word/2010/wordprocessingDrawing" xmlns:wp="http://schemas.openxmlformats.org/drawingml/2006/wordprocessingDrawing" xmlns:wpg="http://schemas.microsoft.com/office/word/2010/wordprocessingGroup" xmlns:wpi="http://schemas.microsoft.com/office/word/2010/wordprocessingInk" xmlns:wps="http://schemas.microsoft.com/office/word/2010/wordprocessingShape" xmlns:o="urn:schemas-microsoft-com:office:office" xmlns:v="urn:schemas-microsoft-com:vml" xmlns:w10="urn:schemas-microsoft-com:office:word" xmlns:w="http://schemas.openxmlformats.org/wordprocessingml/2006/main" xmlns:w14="http://schemas.microsoft.com/office/word/2010/wordml" xmlns:w15="http://schemas.microsoft.com/office/word/2012/wordml" xmlns:w16cex="http://schemas.microsoft.com/office/word/2018/wordml/cex" xmlns:w16cid="http://schemas.microsoft.com/office/word/2016/wordml/cid" xmlns:w16="http://schemas.microsoft.com/office/word/2018/wordml" xmlns:w16sdtdh="http://schemas.microsoft.com/office/word/2020/wordml/sdtdatahash" xmlns:w16sdtfl="http://schemas.microsoft.com/office/word/2024/wordml/sdtformatlock" xmlns:w16se="http://schemas.microsoft.com/office/word/2015/wordml/symex" xmlns:w16du="http://schemas.microsoft.com/office/word/2023/wordml/word16du" xmlns:wne="http://schemas.microsoft.com/office/word/2006/wordml" mc:Ignorable="w14 w15 w16se w16cid w16 w16cex w16sdtdh w16sdtfl w16du wp14">
   <w:abstractNum w:abstractNumId="0" w15:restartNumberingAfterBreak="0">
     <w:nsid w:val="03CB3B7F"/>
     <w:multiLevelType w:val="multilevel"/>
@@ -18366,6 +18819,123 @@
     </w:lvl>
   </w:abstractNum>
   <w:abstractNum w:abstractNumId="12" w15:restartNumberingAfterBreak="0">
+    <w:nsid w:val="6F2651EB"/>
+    <w:multiLevelType w:val="multilevel"/>
+    <w:tmpl w:val="E93AEB32"/>
+    <w:lvl w:ilvl="0">
+      <w:start w:val="1"/>
+      <w:numFmt w:val="decimal"/>
+      <w:lvlText w:val="%1."/>
+      <w:lvlJc w:val="left"/>
+      <w:pPr>
+        <w:tabs>
+          <w:tab w:val="num" w:pos="720"/>
+        </w:tabs>
+        <w:ind w:left="720" w:hanging="360"/>
+      </w:pPr>
+    </w:lvl>
+    <w:lvl w:ilvl="1">
+      <w:start w:val="1"/>
+      <w:numFmt w:val="bullet"/>
+      <w:lvlText w:val="o"/>
+      <w:lvlJc w:val="left"/>
+      <w:pPr>
+        <w:tabs>
+          <w:tab w:val="num" w:pos="1440"/>
+        </w:tabs>
+        <w:ind w:left="1440" w:hanging="360"/>
+      </w:pPr>
+      <w:rPr>
+        <w:rFonts w:ascii="Courier New" w:hAnsi="Courier New" w:hint="default"/>
+        <w:sz w:val="20"/>
+      </w:rPr>
+    </w:lvl>
+    <w:lvl w:ilvl="2" w:tentative="1">
+      <w:start w:val="1"/>
+      <w:numFmt w:val="decimal"/>
+      <w:lvlText w:val="%3."/>
+      <w:lvlJc w:val="left"/>
+      <w:pPr>
+        <w:tabs>
+          <w:tab w:val="num" w:pos="2160"/>
+        </w:tabs>
+        <w:ind w:left="2160" w:hanging="360"/>
+      </w:pPr>
+    </w:lvl>
+    <w:lvl w:ilvl="3" w:tentative="1">
+      <w:start w:val="1"/>
+      <w:numFmt w:val="decimal"/>
+      <w:lvlText w:val="%4."/>
+      <w:lvlJc w:val="left"/>
+      <w:pPr>
+        <w:tabs>
+          <w:tab w:val="num" w:pos="2880"/>
+        </w:tabs>
+        <w:ind w:left="2880" w:hanging="360"/>
+      </w:pPr>
+    </w:lvl>
+    <w:lvl w:ilvl="4" w:tentative="1">
+      <w:start w:val="1"/>
+      <w:numFmt w:val="decimal"/>
+      <w:lvlText w:val="%5."/>
+      <w:lvlJc w:val="left"/>
+      <w:pPr>
+        <w:tabs>
+          <w:tab w:val="num" w:pos="3600"/>
+        </w:tabs>
+        <w:ind w:left="3600" w:hanging="360"/>
+      </w:pPr>
+    </w:lvl>
+    <w:lvl w:ilvl="5" w:tentative="1">
+      <w:start w:val="1"/>
+      <w:numFmt w:val="decimal"/>
+      <w:lvlText w:val="%6."/>
+      <w:lvlJc w:val="left"/>
+      <w:pPr>
+        <w:tabs>
+          <w:tab w:val="num" w:pos="4320"/>
+        </w:tabs>
+        <w:ind w:left="4320" w:hanging="360"/>
+      </w:pPr>
+    </w:lvl>
+    <w:lvl w:ilvl="6" w:tentative="1">
+      <w:start w:val="1"/>
+      <w:numFmt w:val="decimal"/>
+      <w:lvlText w:val="%7."/>
+      <w:lvlJc w:val="left"/>
+      <w:pPr>
+        <w:tabs>
+          <w:tab w:val="num" w:pos="5040"/>
+        </w:tabs>
+        <w:ind w:left="5040" w:hanging="360"/>
+      </w:pPr>
+    </w:lvl>
+    <w:lvl w:ilvl="7" w:tentative="1">
+      <w:start w:val="1"/>
+      <w:numFmt w:val="decimal"/>
+      <w:lvlText w:val="%8."/>
+      <w:lvlJc w:val="left"/>
+      <w:pPr>
+        <w:tabs>
+          <w:tab w:val="num" w:pos="5760"/>
+        </w:tabs>
+        <w:ind w:left="5760" w:hanging="360"/>
+      </w:pPr>
+    </w:lvl>
+    <w:lvl w:ilvl="8" w:tentative="1">
+      <w:start w:val="1"/>
+      <w:numFmt w:val="decimal"/>
+      <w:lvlText w:val="%9."/>
+      <w:lvlJc w:val="left"/>
+      <w:pPr>
+        <w:tabs>
+          <w:tab w:val="num" w:pos="6480"/>
+        </w:tabs>
+        <w:ind w:left="6480" w:hanging="360"/>
+      </w:pPr>
+    </w:lvl>
+  </w:abstractNum>
+  <w:abstractNum w:abstractNumId="13" w15:restartNumberingAfterBreak="0">
     <w:nsid w:val="7969780E"/>
     <w:multiLevelType w:val="hybridMultilevel"/>
     <w:tmpl w:val="F88E19C6"/>
@@ -18478,7 +19048,7 @@
       </w:rPr>
     </w:lvl>
   </w:abstractNum>
-  <w:abstractNum w:abstractNumId="13" w15:restartNumberingAfterBreak="0">
+  <w:abstractNum w:abstractNumId="14" w15:restartNumberingAfterBreak="0">
     <w:nsid w:val="7F884D2F"/>
     <w:multiLevelType w:val="multilevel"/>
     <w:tmpl w:val="7F884D2F"/>
@@ -18643,7 +19213,7 @@
     <w:abstractNumId w:val="10"/>
   </w:num>
   <w:num w:numId="6" w16cid:durableId="1725593997">
-    <w:abstractNumId w:val="13"/>
+    <w:abstractNumId w:val="14"/>
   </w:num>
   <w:num w:numId="7" w16cid:durableId="1782215909">
     <w:abstractNumId w:val="11"/>
@@ -18667,13 +19237,16 @@
     <w:abstractNumId w:val="6"/>
   </w:num>
   <w:num w:numId="14" w16cid:durableId="954753006">
+    <w:abstractNumId w:val="13"/>
+  </w:num>
+  <w:num w:numId="15" w16cid:durableId="867597769">
     <w:abstractNumId w:val="12"/>
   </w:num>
 </w:numbering>
 </file>
 
 <file path=word/styles.xml><?xml version="1.0" encoding="utf-8"?>
-<w:styles xmlns:mc="http://schemas.openxmlformats.org/markup-compatibility/2006" xmlns:r="http://schemas.openxmlformats.org/officeDocument/2006/relationships" xmlns:w="http://schemas.openxmlformats.org/wordprocessingml/2006/main" xmlns:w14="http://schemas.microsoft.com/office/word/2010/wordml" xmlns:w15="http://schemas.microsoft.com/office/word/2012/wordml" xmlns:w16cex="http://schemas.microsoft.com/office/word/2018/wordml/cex" xmlns:w16cid="http://schemas.microsoft.com/office/word/2016/wordml/cid" xmlns:w16="http://schemas.microsoft.com/office/word/2018/wordml" xmlns:w16du="http://schemas.microsoft.com/office/word/2023/wordml/word16du" xmlns:w16sdtdh="http://schemas.microsoft.com/office/word/2020/wordml/sdtdatahash" xmlns:w16sdtfl="http://schemas.microsoft.com/office/word/2024/wordml/sdtformatlock" xmlns:w16se="http://schemas.microsoft.com/office/word/2015/wordml/symex" mc:Ignorable="w14 w15 w16se w16cid w16 w16cex w16sdtdh w16sdtfl w16du">
+<w:styles xmlns:mc="http://schemas.openxmlformats.org/markup-compatibility/2006" xmlns:r="http://schemas.openxmlformats.org/officeDocument/2006/relationships" xmlns:w="http://schemas.openxmlformats.org/wordprocessingml/2006/main" xmlns:w14="http://schemas.microsoft.com/office/word/2010/wordml" xmlns:w15="http://schemas.microsoft.com/office/word/2012/wordml" xmlns:w16cex="http://schemas.microsoft.com/office/word/2018/wordml/cex" xmlns:w16cid="http://schemas.microsoft.com/office/word/2016/wordml/cid" xmlns:w16="http://schemas.microsoft.com/office/word/2018/wordml" xmlns:w16sdtdh="http://schemas.microsoft.com/office/word/2020/wordml/sdtdatahash" xmlns:w16sdtfl="http://schemas.microsoft.com/office/word/2024/wordml/sdtformatlock" xmlns:w16se="http://schemas.microsoft.com/office/word/2015/wordml/symex" xmlns:w16du="http://schemas.microsoft.com/office/word/2023/wordml/word16du" mc:Ignorable="w14 w15 w16se w16cid w16 w16cex w16sdtdh w16sdtfl w16du">
   <w:docDefaults>
     <w:rPrDefault>
       <w:rPr>
@@ -20277,10 +20850,6 @@
 </file>
 
 <file path=customXml/item1.xml><?xml version="1.0" encoding="utf-8"?>
-<b:Sources xmlns:b="http://schemas.openxmlformats.org/officeDocument/2006/bibliography" xmlns="http://schemas.openxmlformats.org/officeDocument/2006/bibliography" SelectedStyle="\APASixthEditionOfficeOnline.xsl" StyleName="APA" Version="6"/>
-</file>
-
-<file path=customXml/item2.xml><?xml version="1.0" encoding="utf-8"?>
 <ct:contentTypeSchema xmlns:ct="http://schemas.microsoft.com/office/2006/metadata/contentType" xmlns:ma="http://schemas.microsoft.com/office/2006/metadata/properties/metaAttributes" ct:_="" ma:_="" ma:contentTypeName="Asiakirja" ma:contentTypeID="0x010100D363A8E01CD382479A58CDC95331376A" ma:contentTypeVersion="11" ma:contentTypeDescription="Luo uusi asiakirja." ma:contentTypeScope="" ma:versionID="4ff250c28d8f17e12594a081d3e9d7c0">
   <xsd:schema xmlns:xsd="http://www.w3.org/2001/XMLSchema" xmlns:xs="http://www.w3.org/2001/XMLSchema" xmlns:p="http://schemas.microsoft.com/office/2006/metadata/properties" xmlns:ns3="fcb7f260-834d-4391-819a-45489104e8f7" targetNamespace="http://schemas.microsoft.com/office/2006/metadata/properties" ma:root="true" ma:fieldsID="93610baf51b1fa880ecbdb46db5dd73a" ns3:_="">
     <xsd:import namespace="fcb7f260-834d-4391-819a-45489104e8f7"/>
@@ -20468,7 +21037,7 @@
 </ct:contentTypeSchema>
 </file>
 
-<file path=customXml/item3.xml><?xml version="1.0" encoding="utf-8"?>
+<file path=customXml/item2.xml><?xml version="1.0" encoding="utf-8"?>
 <s:customData xmlns="http://www.wps.cn/officeDocument/2013/wpsCustomData" xmlns:s="http://www.wps.cn/officeDocument/2013/wpsCustomData">
   <customSectProps/>
   <customShpExts>
@@ -20477,7 +21046,7 @@
 </s:customData>
 </file>
 
-<file path=customXml/item4.xml><?xml version="1.0" encoding="utf-8"?>
+<file path=customXml/item3.xml><?xml version="1.0" encoding="utf-8"?>
 <p:properties xmlns:p="http://schemas.microsoft.com/office/2006/metadata/properties" xmlns:xsi="http://www.w3.org/2001/XMLSchema-instance" xmlns:pc="http://schemas.microsoft.com/office/infopath/2007/PartnerControls">
   <documentManagement>
     <_activity xmlns="fcb7f260-834d-4391-819a-45489104e8f7" xsi:nil="true"/>
@@ -20485,7 +21054,7 @@
 </p:properties>
 </file>
 
-<file path=customXml/item5.xml><?xml version="1.0" encoding="utf-8"?>
+<file path=customXml/item4.xml><?xml version="1.0" encoding="utf-8"?>
 <?mso-contentType ?>
 <FormTemplates xmlns="http://schemas.microsoft.com/sharepoint/v3/contenttype/forms">
   <Display>DocumentLibraryForm</Display>
@@ -20494,15 +21063,11 @@
 </FormTemplates>
 </file>
 
-<file path=customXml/itemProps1.xml><?xml version="1.0" encoding="utf-8"?>
-<ds:datastoreItem xmlns:ds="http://schemas.openxmlformats.org/officeDocument/2006/customXml" ds:itemID="{9CA19FBB-6AF3-434C-9742-CCEF57E9512E}">
-  <ds:schemaRefs>
-    <ds:schemaRef ds:uri="http://schemas.openxmlformats.org/officeDocument/2006/bibliography"/>
-  </ds:schemaRefs>
-</ds:datastoreItem>
+<file path=customXml/item5.xml><?xml version="1.0" encoding="utf-8"?>
+<b:Sources xmlns:b="http://schemas.openxmlformats.org/officeDocument/2006/bibliography" xmlns="http://schemas.openxmlformats.org/officeDocument/2006/bibliography" SelectedStyle="\APASixthEditionOfficeOnline.xsl" StyleName="APA" Version="6"/>
 </file>
 
-<file path=customXml/itemProps2.xml><?xml version="1.0" encoding="utf-8"?>
+<file path=customXml/itemProps1.xml><?xml version="1.0" encoding="utf-8"?>
 <ds:datastoreItem xmlns:ds="http://schemas.openxmlformats.org/officeDocument/2006/customXml" ds:itemID="{E84CBF80-8CD9-47B5-9F4A-6CAA6F54F489}">
   <ds:schemaRefs>
     <ds:schemaRef ds:uri="http://schemas.microsoft.com/office/2006/metadata/contentType"/>
@@ -20520,7 +21085,7 @@
 </ds:datastoreItem>
 </file>
 
-<file path=customXml/itemProps3.xml><?xml version="1.0" encoding="utf-8"?>
+<file path=customXml/itemProps2.xml><?xml version="1.0" encoding="utf-8"?>
 <ds:datastoreItem xmlns:ds="http://schemas.openxmlformats.org/officeDocument/2006/customXml" ds:itemID="{B1977F7D-205B-4081-913C-38D41E755F92}">
   <ds:schemaRefs>
     <ds:schemaRef ds:uri="http://www.wps.cn/officeDocument/2013/wpsCustomData"/>
@@ -20528,7 +21093,7 @@
 </ds:datastoreItem>
 </file>
 
-<file path=customXml/itemProps4.xml><?xml version="1.0" encoding="utf-8"?>
+<file path=customXml/itemProps3.xml><?xml version="1.0" encoding="utf-8"?>
 <ds:datastoreItem xmlns:ds="http://schemas.openxmlformats.org/officeDocument/2006/customXml" ds:itemID="{26726D45-D6CB-43B2-A339-26F226EC2435}">
   <ds:schemaRefs>
     <ds:schemaRef ds:uri="http://schemas.microsoft.com/office/2006/metadata/properties"/>
@@ -20538,10 +21103,18 @@
 </ds:datastoreItem>
 </file>
 
-<file path=customXml/itemProps5.xml><?xml version="1.0" encoding="utf-8"?>
+<file path=customXml/itemProps4.xml><?xml version="1.0" encoding="utf-8"?>
 <ds:datastoreItem xmlns:ds="http://schemas.openxmlformats.org/officeDocument/2006/customXml" ds:itemID="{35ACF7FF-851E-49AE-82AC-E646A3FDC2E3}">
   <ds:schemaRefs>
     <ds:schemaRef ds:uri="http://schemas.microsoft.com/sharepoint/v3/contenttype/forms"/>
   </ds:schemaRefs>
 </ds:datastoreItem>
+</file>
+
+<file path=customXml/itemProps5.xml><?xml version="1.0" encoding="utf-8"?>
+<ds:datastoreItem xmlns:ds="http://schemas.openxmlformats.org/officeDocument/2006/customXml" ds:itemID="{9CA19FBB-6AF3-434C-9742-CCEF57E9512E}">
+  <ds:schemaRefs>
+    <ds:schemaRef ds:uri="http://schemas.openxmlformats.org/officeDocument/2006/bibliography"/>
+  </ds:schemaRefs>
+</ds:datastoreItem>
 </file>
</xml_diff>